<commit_message>
Add yellow change-tracking highlights to manuscript for revised passages (worked example, controller reframing, abstract scoping, tokenizer/backend results, deployment-barrier citations)
</commit_message>
<xml_diff>
--- a/paper/Information_Tarish_Arabic_RAG.docx
+++ b/paper/Information_Tarish_Arabic_RAG.docx
@@ -109,7 +109,27 @@
       </w:pPr>
       <w:r>
         <w:rPr/>
-        <w:t>Retrieval-Augmented Generation (RAG) for Modern Standard Arabic (MSA) faces a memory bottleneck: Arabic's rich morphology inflates token counts relative to English, enlarging the Key-Value (KV) cache that memory-efficient serving engines such as vLLM must hold per request. We introduce a Lightweight Semantic Pruning Middleware (LSPM) that scores retrieved passages at the sentence level with a cross-encoder and retains only the most query-relevant subset at a fixed or dynamic ratio. On 30 verified Arabic/English sentence pairs, two tokenizers confirm Arabic requires 1.72-1.79x as many tokens as English for equivalent content (bootstrap p &lt; 0.0001). On 140 real Arabic reading-comprehension questions retrieved into a controlled six-document candidate pool (one guaranteed gold passage plus five distractors; Section 3.4), LSPM significantly outperforms naive sentence-count-matched truncation on token-F1 at the most aggressive ratio tested (F1 0.652 vs. 0.537, Holm-adjusted p = 0.0067), remaining equivalent to the unpruned answer. This advantage holds under a token-budget-matched rerun (+0.140 F1, p = 0.0003), against LLMLingua-2, a modern learned compressor (largest gap +0.211 F1, p &lt; 0.0001), and on an independent replication using 140 freshly sampled, non-overlapping questions (Holm-adjusted p &lt; 0.0001). A repeated GPU benchmark, scoped to generation over an already-pruned context and excluding the pruning step's own ~506 ms cross-encoder scoring cost (quantified separately in Section 3.1), finds no measurable throughput or latency penalty versus unpruned serving, though this benchmark's KV-cache occupancy never approached saturation; a separate, higher-pressure ablation drives occupancy to 99.2% and confirms the dynamic controller adapts, but not yet that adapting outperforms a matched fixed ratio, so the memory-efficiency claim remains analytical. We release the implementation, evaluation code, and datasets described in this paper.</w:t>
+        <w:t xml:space="preserve">Retrieval-Augmented Generation (RAG) for Modern Standard Arabic (MSA) faces a memory bottleneck: Arabic's rich morphology inflates token counts relative to English, enlarging the Key-Value (KV) cache that memory-efficient serving engines such as vLLM must hold per request. We introduce a Lightweight Semantic Pruning Middleware (LSPM) that scores retrieved passages at the sentence level with a cross-encoder and retains only the most query-relevant subset at a fixed or dynamic ratio. On 30 verified Arabic/English sentence pairs, two tokenizers confirm Arabic requires 1.72-1.79x as many tokens as English for equivalent content (bootstrap p &lt; 0.0001). On 140 real Arabic reading-comprehension questions </w:t>
+      </w:r>
+      <w:r>
+        <w:rPr>
+          <w:highlight w:val="yellow"/>
+        </w:rPr>
+        <w:t xml:space="preserve">retrieved into a controlled six-document candidate pool (one guaranteed gold passage plus five distractors; Section 3.4), </w:t>
+      </w:r>
+      <w:r>
+        <w:rPr/>
+        <w:t xml:space="preserve">LSPM significantly outperforms naive sentence-count-matched truncation on token-F1 at the most aggressive ratio tested (F1 0.652 vs. 0.537, Holm-adjusted p = 0.0067), remaining equivalent to the unpruned answer. This advantage holds under a token-budget-matched rerun (+0.140 F1, p = 0.0003), against LLMLingua-2, a modern learned compressor (largest gap +0.211 F1, p &lt; 0.0001), and on an independent replication using 140 freshly sampled, non-overlapping questions (Holm-adjusted p &lt; 0.0001). A repeated GPU benchmark, </w:t>
+      </w:r>
+      <w:r>
+        <w:rPr>
+          <w:highlight w:val="yellow"/>
+        </w:rPr>
+        <w:t xml:space="preserve">scoped to generation over an already-pruned context and excluding the pruning step's own ~506 ms cross-encoder scoring cost (quantified separately in Section 3.1), </w:t>
+      </w:r>
+      <w:r>
+        <w:rPr/>
+        <w:t xml:space="preserve">finds no measurable throughput or latency penalty versus unpruned serving, though this benchmark's KV-cache occupancy never approached saturation; a separate, higher-pressure ablation drives occupancy to 99.2% and confirms the dynamic controller adapts, but not yet that adapting outperforms a matched fixed ratio, so the memory-efficiency claim remains analytical. We release the implementation, evaluation code, and datasets described in this paper.</w:t>
       </w:r>
     </w:p>
     <w:p>
@@ -302,7 +322,9 @@
         <w:rPr/>
       </w:pPr>
       <w:r>
-        <w:rPr/>
+        <w:rPr>
+          <w:highlight w:val="yellow"/>
+        </w:rPr>
         <w:t xml:space="preserve">This tokenization gap is a practical deployment barrier, not only an academic inefficiency, in settings where GPU memory or inference budget is already the binding constraint. Commercial deployments billed per token pay a direct cost penalty for Arabic relative to English at the same query volume, consistent with the per-language cost inequity in commercial API pricing that Ahia et al. document [15]; the same inflation raises the GPU memory a self-hosted deployment must reserve per concurrent Arabic-language request, which is the more binding constraint for the low-resource, on-premise, single-GPU deployments common outside large commercial labs. This is not a hypothetical constraint: a 2025 review of the Arabic large language model landscape identifies high computational demand relative to regional business resources as a specific, named barrier bridging Arabic NLP research to commercial deployment, alongside limited regional compute infrastructure and cross-border collaboration [16], and a separate compact Arabic language model effort motivates its own design explicitly around bridging the resource demands of large-scale models and the practical constraints of real-world Arabic-language deployment [17]. Reducing the number of tokens a retrieved passage occupies before it reaches the KV cache, this paper's central mechanism, is one lever available in exactly this setting, alongside the model-side memory techniques discussed as complementary, unevaluated-in-combination directions in Section 5, item 4a, which act on a different axis of the same cost.</w:t>
       </w:r>
     </w:p>
@@ -322,7 +344,9 @@
         <w:rPr/>
       </w:pPr>
       <w:r>
-        <w:rPr/>
+        <w:rPr>
+          <w:highlight w:val="yellow"/>
+        </w:rPr>
         <w:t xml:space="preserve">This paper is principally an architecture and validation study of context selection for Arabic RAG: the tokenization measurement, the naive-truncation baseline comparison, the end-to-end retrieval check, and the human evaluation are its central evidence. It additionally includes a GPU benchmark against a self-hosted vLLM server, now executed under the corrected protocol: seven context conditions crossed with five concurrency levels, each cell repeated three times in randomized order with pruning moved out of the load generator, for 105 runs and 191,652 requests with zero failures. That benchmark, scoped to generation cost only (Section 3.1 quantifies the pruning step's own cross-encoder cost separately), finds that semantic pruning imposes no measurable throughput or time-to-first-token penalty relative to unpruned serving at any concurrency level tested; the 8.5-11.9% throughput deficit reported for LSPM by the earlier, confounded exploratory run does not survive removal of the load-generator-side scoring cost. It also finds that KV-cache occupancy never rose above 9% of capacity on this hardware, so the benchmark establishes the absence of a serving-cost penalty rather than a demonstrated memory benefit under pressure. A first ablation of the dynamic ratio controller under this same low-pressure regime likewise never reached the 75% occupancy threshold at which the controller would begin adapting, so it validated the controller's plumbing and stability but not its adaptive path; a second, redesigned ablation using a deliberately constrained cache pool subsequently drove occupancy to 99.2% and exercised the controller's full configured ratio range, showing that the adaptive path does engage under real cache pressure. That redesigned run does not, however, show that adapting the ratio improves throughput, tail latency, or answer quality relative to a fixed ratio, because the dynamic and fixed conditions were not matched on average retained context: closing that comparison, and measuring the end-to-end serving cost of the pruning step itself rather than only of generation over a precomputed context, are this paper's most important open validation items. The scope and limits of every claim in this paper, measured, analytical, and not-yet-validated alike, are stated explicitly in the sections that follow.</w:t>
       </w:r>
     </w:p>
@@ -333,7 +357,17 @@
       </w:pPr>
       <w:r>
         <w:rPr/>
-        <w:t xml:space="preserve">Contributions: (1) A concrete system architecture and open reference implementation for sentence-level, cross-encoder-driven context pruning for Arabic RAG on vLLM-class serving infrastructure, including an implemented dynamic compression-ratio controller that couples pruning aggressiveness to real-time GPU KV-cache occupancy. This controller is a working engineering mechanism, not yet a validated improvement: a redesigned ablation confirms it engages its full adaptive range under real cache pressure, but does not show that adapting outperforms a matched fixed ratio, which remains open (Section 4.7). (2) A quantitative measurement of Modern Standard Arabic-English tokenization disparity on a 30-pair hand-verified parallel corpus (bootstrap p &lt; 0.0001 for both of two tokenizers tested). This is not a novel phenomenon: tokenizer fertility gaps between English and morphologically richer or less-represented languages are established in the literature, from Rust et al.'s demonstration that a language's tokenizer quality, not only its pretraining data volume, drives multilingual model performance [19], to Petrov et al.'s systematic measurement of encoding-length disparity across languages [20] and Ahia et al.'s analysis of the resulting per-language cost inequity in commercial API pricing [15]. Our contribution is to confirm that literature on a hand-verified Arabic corpus with the two specific tokenizers used in this study and, more to the point, to carry it into a serving-system setting by connecting the fertility gap to the KV-cache footprint a vLLM-class engine must hold per request, which is a consequence those studies do not measure. (3) A real, paired baseline comparison against naive sentence-count-matched truncation, re-tested at increasing scale up to a 140-question ARCD re-test (980 live generations), resolving the head-to-head comparison in LSPM's favor at the most aggressive ratio (r = 0.3) after Holm-Bonferroni correction, while leaving it open at more moderate ratios. (4) A complementary end-to-end retrieval check that removes the answer-guaranteed pool construction, with a real TF-IDF retriever (recall@6 = 86.7%), reproducing the same directional advantage. (5) An analytical, explicitly-labeled KV-cache savings projection derived from real per-request prompt-token counts, together with a corrected, repeated GPU throughput/TTFT/KV-cache benchmark against a self-hosted vLLM server (35 cells x 3 repeats, 105 runs, 191,652 requests, zero failures) that measures the serving-cost consequences of pruning under load, and two dynamic-controller ablations on real, preserved per-request logs, the second of which redesigns the first to reach genuine cache pressure; all are reported with their scope limits stated, including the finding that the main serving benchmark's KV-cache occupancy never approached saturation on the tested hardware, and that the redesigned controller ablation, while confirming the adaptive path does engage at 99.2% occupancy elsewhere, has not shown that adapting improves throughput, latency, or answer quality relative to a matched fixed ratio. (6) A blind, two-rater human evaluation (90 answers, correctness and faithfulness, substantial-to-near-perfect inter-rater agreement) that directionally corroborates the automatic-metric result. (7) A token-budget-matched rerun that gives naive truncation the same per-question token budget LSPM actually spent, closing the token-budget confound left open by contribution (3) and reproducing LSPM's advantage at r = 0.3. (8) A head-to-head comparison against LLMLingua-2, a modern learned prompt compressor, on the identical 140-question evaluation, showing LSPM significantly ahead on token-F1 at all three ratios tested, most convincingly at r = 0.3 and 0.5. (9) A generalization check that reruns the full ARCD ground-truth protocol against a second generator, Qwen2.5-7B-Instruct, replicating the central r = 0.3 quality result with the same or greater statistical strength. (10) An independent, fresh-seed replication of the central r = 0.3 result on 140 newly sampled ARCD questions sharing no question identifiers with the original 140, confirming the finding on data that were not used to set the original sample size or produce the original result.</w:t>
+        <w:t xml:space="preserve">Contributions: (1) A concrete system architecture and open reference implementation for sentence-level, cross-encoder-driven context pruning for Arabic RAG on vLLM-class serving infrastructure, including an implemented dynamic compression-ratio controller that couples pruning aggressiveness to real-time GPU KV-cache occupancy. </w:t>
+      </w:r>
+      <w:r>
+        <w:rPr>
+          <w:highlight w:val="yellow"/>
+        </w:rPr>
+        <w:t xml:space="preserve">This controller is a working engineering mechanism, not yet a validated improvement: a redesigned ablation confirms it engages its full adaptive range under real cache pressure, but does not show that adapting outperforms a matched fixed ratio, which remains open (Section 4.7). </w:t>
+      </w:r>
+      <w:r>
+        <w:rPr/>
+        <w:t xml:space="preserve">(2) A quantitative measurement of Modern Standard Arabic-English tokenization disparity on a 30-pair hand-verified parallel corpus (bootstrap p &lt; 0.0001 for both of two tokenizers tested). This is not a novel phenomenon: tokenizer fertility gaps between English and morphologically richer or less-represented languages are established in the literature, from Rust et al.'s demonstration that a language's tokenizer quality, not only its pretraining data volume, drives multilingual model performance [19], to Petrov et al.'s systematic measurement of encoding-length disparity across languages [20] and Ahia et al.'s analysis of the resulting per-language cost inequity in commercial API pricing [15]. Our contribution is to confirm that literature on a hand-verified Arabic corpus with the two specific tokenizers used in this study and, more to the point, to carry it into a serving-system setting by connecting the fertility gap to the KV-cache footprint a vLLM-class engine must hold per request, which is a consequence those studies do not measure. (3) A real, paired baseline comparison against naive sentence-count-matched truncation, re-tested at increasing scale up to a 140-question ARCD re-test (980 live generations), resolving the head-to-head comparison in LSPM's favor at the most aggressive ratio (r = 0.3) after Holm-Bonferroni correction, while leaving it open at more moderate ratios. (4) A complementary end-to-end retrieval check that removes the answer-guaranteed pool construction, with a real TF-IDF retriever (recall@6 = 86.7%), reproducing the same directional advantage. (5) An analytical, explicitly-labeled KV-cache savings projection derived from real per-request prompt-token counts, together with a corrected, repeated GPU throughput/TTFT/KV-cache benchmark against a self-hosted vLLM server (35 cells x 3 repeats, 105 runs, 191,652 requests, zero failures) that measures the serving-cost consequences of pruning under load, and two dynamic-controller ablations on real, preserved per-request logs, the second of which redesigns the first to reach genuine cache pressure; all are reported with their scope limits stated, including the finding that the main serving benchmark's KV-cache occupancy never approached saturation on the tested hardware, and that the redesigned controller ablation, while confirming the adaptive path does engage at 99.2% occupancy elsewhere, has not shown that adapting improves throughput, latency, or answer quality relative to a matched fixed ratio. (6) A blind, two-rater human evaluation (90 answers, correctness and faithfulness, substantial-to-near-perfect inter-rater agreement) that directionally corroborates the automatic-metric result. (7) A token-budget-matched rerun that gives naive truncation the same per-question token budget LSPM actually spent, closing the token-budget confound left open by contribution (3) and reproducing LSPM's advantage at r = 0.3. (8) A head-to-head comparison against LLMLingua-2, a modern learned prompt compressor, on the identical 140-question evaluation, showing LSPM significantly ahead on token-F1 at all three ratios tested, most convincingly at r = 0.3 and 0.5. (9) A generalization check that reruns the full ARCD ground-truth protocol against a second generator, Qwen2.5-7B-Instruct, replicating the central r = 0.3 quality result with the same or greater statistical strength. (10) An independent, fresh-seed replication of the central r = 0.3 result on 140 newly sampled ARCD questions sharing no question identifiers with the original 140, confirming the finding on data that were not used to set the original sample size or produce the original result.</w:t>
       </w:r>
     </w:p>
     <w:p>
@@ -382,7 +416,9 @@
         <w:rPr/>
       </w:pPr>
       <w:r>
-        <w:rPr/>
+        <w:rPr>
+          <w:highlight w:val="yellow"/>
+        </w:rPr>
         <w:t xml:space="preserve">An alternative to LSPM's post-retrieval pruning approach would be to reduce Arabic's tokenization inflation at its source, by replacing the generator's general-purpose, English-skewed BPE vocabulary with an Arabic-specific vocabulary of the kind AraBERT, AraGPT2, and AraT5 (above) train for themselves, or with a multilingual tokenizer explicitly balanced across scripts rather than dominated by a BPE merge statistic learned from an English-heavy corpus. Such a tokenizer would reduce the constant token-inflation factor this paper measures (1.72-1.79x, Section 4.1) for a fixed amount of retrieved content, whereas LSPM instead reduces the amount of retrieved content that reaches the generator at all; the two act on different axes of the same cost and are complementary rather than competing; a better tokenizer does not remove the case for pruning, since the sentence-relevance argument for preferring content-aware selection over positional truncation (Section 3.2) holds regardless of tokenizer choice, and even a perfectly balanced tokenizer still serves a finite context window. A full generation-quality comparison is not run here because it requires a generator pretrained or fine-tuned with a different tokenizer, not a drop-in substitution on the fixed, off-the-shelf checkpoints (Llama-3.1-8B-Instruct, Qwen2.5-7B-Instruct) used throughout this paper; that controlled comparison, holding the generator's architecture and training data otherwise fixed, remains a direct extension of this paper identified in Section 5. What can be measured without a matching generator is the vocabulary-level effect itself, and we measure it directly: re-tokenizing the same 30-pair parallel corpus used for this paper's headline tokenization measurement (Section 4.1) with three Arabic-specific WordPiece vocabularies (AraBERTv2 [38], CAMeLBERT-mix [41], and Arabic-BERT [43]) gives a mean Arabic sentence length of 28.5, 18.7, and 17.8 tokens respectively, against Llama-3.1's 33.2, while the same vocabularies tokenize the parallel English sentences far less efficiently (40.1-48.3 tokens against Llama-3.1's 19.3), since their vocabularies are optimized for Arabic rather than balanced across both languages. The Arabic-side reduction is real and substantial (Arabic-BERT uses 46% fewer Arabic tokens than Llama-3.1's tokenizer on this corpus), directly supporting the claim that an Arabic-optimized vocabulary would shrink the KV-cache footprint of the Arabic side of a RAG prompt considerably; the corresponding English-side inflation is not a concern for the retrieved-context use case this paper targets, where the retrieved content is Arabic, but would matter for any bilingual prompt segment (for example an English system prompt) under the same vocabulary. These are masked-language-model tokenizers, not generative tokenizers paired with a trained decoder, so this measurement bounds the vocabulary-level opportunity without establishing that a generator using such a vocabulary would preserve answer quality; that remains the open extension described above.</w:t>
       </w:r>
     </w:p>
@@ -463,7 +499,9 @@
         <w:rPr/>
       </w:pPr>
       <w:r>
-        <w:rPr/>
+        <w:rPr>
+          <w:highlight w:val="yellow"/>
+        </w:rPr>
         <w:t xml:space="preserve">Figure 1 shows LSPM's pipeline. A user query is embedded and matched against a vector database (Chroma) to retrieve a candidate passage pool. LSPM splits each retrieved passage into sentences using a generic, dependency-free regular-expression splitter that breaks on whitespace following a sentence-final punctuation mark (the Latin full stop and exclamation mark and the Arabic question mark U+061F, together with the ASCII question mark), with the Arabic comma U+060C deliberately excluded as a non-terminator and a bare-period fallback applied when no terminator is found; no morphological analyser is used, and in particular CAMeL Tools [42] is cited in Section 2 as part of the Arabic NLP ecosystem but is not a dependency of the released implementation. Because the splitter defines the unit over which the compression ratio r is applied, the same splitter is used for both LSPM and the naive-truncation baseline, so the two arms operate on an identical sentence segmentation.</w:t>
       </w:r>
     </w:p>
@@ -473,7 +511,9 @@
         <w:rPr/>
       </w:pPr>
       <w:r>
-        <w:rPr/>
+        <w:rPr>
+          <w:highlight w:val="yellow"/>
+        </w:rPr>
         <w:t xml:space="preserve">It then pairs every extracted sentence with the query and scores it with a cross-encoder; the reference implementation supports a fast MiniLM-family backend for interactive use or a BGE-reranker-v2-m3 backend for maximal accuracy as a configurable choice, and cross-encoder/mmarco-mMiniLMv2-L12-H384-v1 specifically is the model used to produce every result reported in this paper (Section 3.3); none of this paper's quality or serving-cost results were reproduced on the BGE-reranker-v2-m3 backend or any other cross-encoder, so backend-to-backend variance in either scoring quality or scoring latency is not measured here and should not be assumed to be small (Section 5). This scoring step has a measured mean latency of 506.1 ms. Every throughput/latency comparison in this paper that is described as "generation-only" (Sections 4.6, 5, and 6) reads contexts from a precomputed lookup and therefore measures the vLLM server's generation cost alone, excluding this 506.1 ms cross-encoder cost; it is not an end-to-end online-serving measurement, and should not be read as one. The highest-scoring sentences are retained, in their original order, up to a target compression ratio r (the fraction of sentences kept), and reassembled into a compact context that is handed to the generator running behind a vLLM server.</w:t>
       </w:r>
     </w:p>
@@ -483,7 +523,9 @@
         <w:rPr/>
       </w:pPr>
       <w:r>
-        <w:rPr/>
+        <w:rPr>
+          <w:highlight w:val="yellow"/>
+        </w:rPr>
         <w:t xml:space="preserve">An optional dynamic controller can adjust r at request time from vLLM's live /metrics KV-cache occupancy: as occupancy rises toward a configured threshold, r is tightened; as it falls, r is relaxed. This controller is an implementation feature of the released system and is described here as a design contribution. It is exercised against live, time-varying traffic in two ablations (Section 4.7, fixed versus dynamic r under a ramping concurrency profile). The first confirms that the controller runs correctly and stably against a real server but did not generate enough KV-cache pressure to cross its high-load threshold, so it validated the controller's plumbing and stability without exercising its adaptive path. A second, redesigned ablation, using a deliberately constrained cache pool, subsequently drove occupancy to 99.2% and exercised the controller's full configured ratio range, confirming that the adaptive path does engage under real cache pressure. Neither ablation shows that adapting the ratio improves throughput, tail latency, or answer quality relative to a fixed ratio matched on average retained context; that comparison remains open and is identified explicitly as required future work (Section 5).</w:t>
       </w:r>
     </w:p>
@@ -495,11 +537,14 @@
       <w:r>
         <w:rPr>
           <w:b/>
+          <w:highlight w:val="yellow"/>
         </w:rPr>
         <w:t xml:space="preserve">Worked example. </w:t>
       </w:r>
       <w:r>
-        <w:rPr/>
+        <w:rPr>
+          <w:highlight w:val="yellow"/>
+        </w:rPr>
         <w:t xml:space="preserve">The following short example fixes every term used above to a concrete transformation, using one query and a four-sentence retrieved pool. Consider the query "متى تأسست جامعة بغداد؟" ("When was the University of Baghdad founded?") and a retrieved passage pool that splits into four sentences S1-S4 (shown below), given here in their original document order. Deliberately, the answer-bearing sentence is neither first in the document nor the sentence a positional heuristic would favor: S1 mentions Baghdad generally, S2 is an irrelevant population statistic, S3 states the founding year (the answer), and S4 lists unrelated faculties. The cross-encoder scores each sentence against the query independently, giving S1 = 0.65, S2 = 0.20, S3 = 0.93, and S4 = 0.08; note that the highest-scoring sentence, S3, is neither first nor second in the document.</w:t>
       </w:r>
     </w:p>
@@ -509,7 +554,9 @@
         <w:rPr/>
       </w:pPr>
       <w:r>
-        <w:rPr/>
+        <w:rPr>
+          <w:highlight w:val="yellow"/>
+        </w:rPr>
         <w:t xml:space="preserve">At a compression ratio r = 0.5 and N = 4 sentences, the number of sentences retained is k = max(1, round(r x N)) = max(1, round(2.0)) = 2. Ranking S1-S4 by score in descending order gives the sequence [S3 (0.93), S1 (0.65), S2 (0.20), S4 (0.08)]; the top k = 2 by this ranking are {S3, S1}. Critically, LSPM does not concatenate the kept sentences in score order (which would read S3 then S1): it restores their original document order before reassembly, so the pruned context is S1 followed by S3, exactly as they appeared in the source passage, and S2 and S4 are dropped. The generator then receives this two-sentence pruned context together with the query and answers "1957", the year contained in S3. Naive length-matched truncation, by contrast, keeps sentences by position rather than score: at the same r = 0.5 it keeps the first k = 2 sentences by position, {S1, S2}, which does not include S3 and therefore loses the year entirely -- this is the concrete case in which LSPM's content-conditioned cut outperforms a positional cut, not merely an illustration of the mechanism in the abstract. The sentence pool below also shows the outcome of this same ranking at two further ratios for comparison: at r = 0.3, k = max(1, round(1.2)) = 1 and only S3 survives under LSPM, again the correct answer-bearing sentence, whereas naive truncation at r = 0.3 keeps only S1 by position and again loses the answer; at r = 0.7, k = max(1, round(2.8)) = 3 and S1-S3 survive under both methods (S4 alone is dropped), so the two methods coincide at this least aggressive ratio.</w:t>
       </w:r>
     </w:p>
@@ -549,11 +596,16 @@
               <w:spacing w:before="60" w:after="60"/>
               <w:bidi w:val="0"/>
             </w:pPr>
-            <w:r/>
+            <w:r>
+              <w:rPr>
+                <w:highlight w:val="yellow"/>
+              </w:rPr>
+            </w:r>
             <w:r>
               <w:rPr>
                 <w:rFonts w:ascii="Courier New" w:hAnsi="Courier New"/>
                 <w:sz w:val="18"/>
+                <w:highlight w:val="yellow"/>
               </w:rPr>
               <w:t>Sentence  Score  Kept@r=0.3  Kept@r=0.5  Kept@r=0.7   Content (English gloss)</w:t>
             </w:r>
@@ -567,6 +619,7 @@
               <w:rPr>
                 <w:rFonts w:ascii="Courier New" w:hAnsi="Courier New"/>
                 <w:sz w:val="18"/>
+                <w:highlight w:val="yellow"/>
               </w:rPr>
               <w:t xml:space="preserve">                  (k=1)       (k=2)       (k=3)</w:t>
             </w:r>
@@ -580,6 +633,7 @@
               <w:rPr>
                 <w:rFonts w:ascii="Courier New" w:hAnsi="Courier New"/>
                 <w:sz w:val="18"/>
+                <w:highlight w:val="yellow"/>
               </w:rPr>
               <w:t>S1        0.65    --          yes         yes    "Baghdad is Iraq's capital, located on</w:t>
             </w:r>
@@ -593,6 +647,7 @@
               <w:rPr>
                 <w:rFonts w:ascii="Courier New" w:hAnsi="Courier New"/>
                 <w:sz w:val="18"/>
+                <w:highlight w:val="yellow"/>
               </w:rPr>
               <w:t xml:space="preserve">                                                   the banks of the Tigris River."</w:t>
             </w:r>
@@ -606,6 +661,7 @@
               <w:rPr>
                 <w:rFonts w:ascii="Courier New" w:hAnsi="Courier New"/>
                 <w:sz w:val="18"/>
+                <w:highlight w:val="yellow"/>
               </w:rPr>
               <w:t>S2        0.20    --          --          yes    "Baghdad's population exceeds seven</w:t>
             </w:r>
@@ -619,6 +675,7 @@
               <w:rPr>
                 <w:rFonts w:ascii="Courier New" w:hAnsi="Courier New"/>
                 <w:sz w:val="18"/>
+                <w:highlight w:val="yellow"/>
               </w:rPr>
               <w:t xml:space="preserve">                                                   million."</w:t>
             </w:r>
@@ -632,6 +689,7 @@
               <w:rPr>
                 <w:rFonts w:ascii="Courier New" w:hAnsi="Courier New"/>
                 <w:sz w:val="18"/>
+                <w:highlight w:val="yellow"/>
               </w:rPr>
               <w:t>S3        0.93    yes         yes         yes    "...founded in 1957, becoming one of</w:t>
             </w:r>
@@ -645,6 +703,7 @@
               <w:rPr>
                 <w:rFonts w:ascii="Courier New" w:hAnsi="Courier New"/>
                 <w:sz w:val="18"/>
+                <w:highlight w:val="yellow"/>
               </w:rPr>
               <w:t xml:space="preserve">                                                   the most prominent Iraqi universities."</w:t>
             </w:r>
@@ -658,6 +717,7 @@
               <w:rPr>
                 <w:rFonts w:ascii="Courier New" w:hAnsi="Courier New"/>
                 <w:sz w:val="18"/>
+                <w:highlight w:val="yellow"/>
               </w:rPr>
               <w:t>S4        0.08    --          --          --     "The university includes several</w:t>
             </w:r>
@@ -671,6 +731,7 @@
               <w:rPr>
                 <w:rFonts w:ascii="Courier New" w:hAnsi="Courier New"/>
                 <w:sz w:val="18"/>
+                <w:highlight w:val="yellow"/>
               </w:rPr>
               <w:t xml:space="preserve">                                                   colleges, including engineering and medicine."</w:t>
             </w:r>
@@ -2742,7 +2803,9 @@
         <w:rPr/>
       </w:pPr>
       <w:r>
-        <w:rPr/>
+        <w:rPr>
+          <w:highlight w:val="yellow"/>
+        </w:rPr>
         <w:t xml:space="preserve">At moderate load the seven conditions are close but not uniformly indistinguishable, and we report the full c = 10 row set (Table 3) so that the claim can be checked rather than taken on trust. Median time-to-first-token at c = 10 spans 50.0 to 52.7 ms, and with per-cell half-widths up to +/-3.8 ms all 21 pairwise TTFT comparisons have overlapping intervals; on that measure the seven conditions are indeed indistinguishable. Throughput is not. It spans 5.28 to 6.49 req/s, and 7 of the 21 pairs have non-overlapping 95% intervals. Six of those seven involve naive truncation at r = 0.3, which at 5.28 +/- 0.23 req/s is separated from every other condition in the grid, including raw (6.09 +/- 0.18), all three LSPM ratios (6.16 +/- 0.19, 5.98 +/- 0.28, 6.06 +/- 0.13), and naive truncation at r = 0.5 (6.49 +/- 0.27) and r = 0.7 (5.99 +/- 0.47). The seventh is LSPM at r = 0.7 against naive truncation at r = 0.5, whose intervals miss each other narrowly (6.198 against 6.220 at the adjacent bounds). The accurate statement is therefore that at c = 10 the only condition clearly separated from the field is naive truncation at the most aggressive ratio, which is the same condition that is clearly worst at c = 100, and that LSPM is statistically indistinguishable from unpruned serving at this concurrency level on both throughput and TTFT. At c = 100 (Table 4), LSPM at r = 0.3 reaches 55.7 +/- 0.5 req/s against raw's 54.1 +/- 0.5 and naive truncation's 46.7 +/- 1.1 at the same ratio, and median TTFT is 63.7 +/- 1.4 ms for LSPM r = 0.3, 66.7 +/- 2.9 ms for raw, and 68.3 +/- 2.9 ms for naive r = 0.3 (p95 TTFT 80.7, 84.0, and 86.7 ms respectively). LSPM at r = 0.5 and r = 0.7 (53.9 +/- 0.3 and 54.5 +/- 0.3 req/s) is indistinguishable from raw. Across the full grid (Figure 2 plots throughput, median TTFT, and mean KV-cache occupancy against concurrency for all seven conditions), LSPM's throughput is within 3% of raw at every concurrency level tested and slightly above it at c = 100; the 8.5-11.9% throughput deficit that the earlier, confounded exploratory run had attributed to LSPM does not survive removal of the load-generator scoring cost, which is consistent with that deficit having been an artifact of the confound rather than a property of the method. We do not, however, report the grid as a clean LSPM-over-naive ordering, because it is not one: naive truncation at r = 0.5 attains the highest throughput of any condition at c = 100 (59.6 +/- 1.1 req/s). What the sweep supports is the narrower claim that semantic pruning imposes no measurable throughput or TTFT penalty relative to unpruned serving on this hardware, generation-only as scoped in Section 3.1, and that the one condition clearly worse than all others at high load is naive truncation at the most aggressive ratio.</w:t>
       </w:r>
     </w:p>
@@ -8174,11 +8237,14 @@
       <w:r>
         <w:rPr>
           <w:b/>
+          <w:highlight w:val="yellow"/>
         </w:rPr>
         <w:t xml:space="preserve">(3) Systems validation. </w:t>
       </w:r>
       <w:r>
-        <w:rPr/>
+        <w:rPr>
+          <w:highlight w:val="yellow"/>
+        </w:rPr>
         <w:t xml:space="preserve">The corrected protocol has now been executed (Section 4.6), so the earlier single-run, confounded sweep no longer carries any weight in this paper and its claims have been withdrawn in favour of the repeated result. The replacement benchmark removes the two identified confounds by precomputing pruned contexts outside the load generator and by shuffling all 105 cells before execution, and it reports per-cell uncertainty across three repeats. Two gaps in it remain and are disclosed rather than smoothed over. First, the released harness does not restart the vLLM server between blocks, so server-state drift is randomized by the shuffle but not eliminated. Second, and more consequentially, KV-cache occupancy never exceeded 8.8% of capacity in any of the 105 runs, so the benchmark establishes that semantic pruning imposes no generation-only serving-cost penalty (Section 3.1) on this hardware but does not test the regime of cache pressure in which the analytical KV-cache saving would actually translate into throughput or admission-control benefit; a sweep with longer contexts, a larger --max-model-len, a smaller GPU, or substantially higher concurrency is needed for that, and until it is run the memory-efficiency framing of Section 3.1's design remains a design objective supported by an analytical projection rather than a demonstrated operating-point benefit.</w:t>
       </w:r>
     </w:p>
@@ -8190,11 +8256,14 @@
       <w:r>
         <w:rPr>
           <w:b/>
+          <w:highlight w:val="yellow"/>
         </w:rPr>
         <w:t xml:space="preserve">(4) Dynamic controller. </w:t>
       </w:r>
       <w:r>
-        <w:rPr/>
+        <w:rPr>
+          <w:highlight w:val="yellow"/>
+        </w:rPr>
         <w:t xml:space="preserve">The controller ablation has been rerun (Section 4.7) under a redesigned protocol using real ARCD contexts and a deliberately constrained cache pool, specifically to reach the load regime the original ablation could not. Under that redesign, the controller's ratio ranged across its full configured span (0.20 to 0.80) and KV-cache occupancy reached 99.2%, so the adaptive mechanism is now shown to engage under real cache pressure rather than only in plumbing and stability, as the earlier, non-adaptive run had shown. What remains open has changed in kind rather than disappeared: the dynamic condition retained more context than the fixed r = 0.5 baseline throughout most of the redesigned run (per-step mean ratio 0.58-0.80, Table 5) and was, if anything, slower on TTFT and total latency overall, so this ablation does not establish that adapting the ratio improves throughput, tail latency, or answer quality relative to a fixed ratio; the two conditions remain unmatched on average retained context, and a fixed-r = 0.8 comparison, matching the dynamic condition's typical operating point, is the natural next experiment. Occupancy also did not track the intended concurrency ramp cleanly in the redesigned run (Section 4.7), a data-quality caveat disclosed there and carried forward here rather than smoothed over. Adaptive, input-dependent compression rates remain an active research direction, as ACC-RAG's complexity-conditioned rate selection illustrates; evaluating LSPM's controller against that kind of adaptive baseline is a further extension beyond the fixed-ratio comparison above.</w:t>
       </w:r>
     </w:p>
@@ -8222,11 +8291,14 @@
       <w:r>
         <w:rPr>
           <w:b/>
+          <w:highlight w:val="yellow"/>
         </w:rPr>
         <w:t xml:space="preserve">(4b) Cross-encoder backend sensitivity. </w:t>
       </w:r>
       <w:r>
-        <w:rPr/>
+        <w:rPr>
+          <w:highlight w:val="yellow"/>
+        </w:rPr>
         <w:t xml:space="preserve">Every quality and serving-cost result in this paper's main evaluation (Sections 4.1-4.10) uses a single cross-encoder backend, cross-encoder/mmarco-mMiniLMv2-L12-H384-v1, chosen for interactive-latency scoring (Section 3.1). We additionally ran a targeted, smaller-scale check of sentence-selection agreement between this backend and the reference implementation's configurable BGE-reranker-v2-m3 alternative, on 20 of the 140 ARCD questions at r = 0.5: the two backends select substantially different sentence subsets (mean Jaccard overlap of the kept-sentence sets 0.449, median 0.429, with zero exact matches across the 20 questions), yet the gold-answer sentence survives pruning under both backends on 19 of 20 questions, and both backends agree on whether the answer survives on 19 of 20 questions. This check uses a substring match against the released gold answer as a proxy for answer preservation, not the paper's own token-F1 scorer, and covers 20 of 140 questions at a single ratio rather than the full grid, so it establishes that selection-level backend disagreement exists and is not obviously fatal to answer preservation on this subset, without establishing that the two backends are equivalent for the paper's headline F1 result or its serving-cost picture (Section 4.6-4.7): a larger or more accurate reranker could plausibly still improve selection quality at the cost of higher per-sentence scoring latency, changing the throughput/latency trade-off, and that full comparison remains future work.</w:t>
       </w:r>
     </w:p>
@@ -8301,7 +8373,17 @@
       </w:pPr>
       <w:r>
         <w:rPr/>
-        <w:t xml:space="preserve">Taken together, these limitations mean that memory-efficient vLLM-based deployment remains this work's motivating design objective rather than a demonstrated result: it is now supported by a repeated benchmark showing a generation-only serving-cost result (Section 3.1) of zero measurable penalty relative to raw, rather than by a demonstrated memory-efficiency win at a realistic operating point; the context-selection result in Section 4.3 remains the part of this paper's contribution that is best supported. The GPU benchmark (Section 4.6) is now a real, repeated, randomized measurement that we do rely on, but for a deliberately narrow purpose: it establishes the absence of a throughput or TTFT penalty, and it does not establish a memory benefit, because the workload never approached cache saturation. One qualification applies to the paper's strongest result and is stated here rather than buried in Methods. The n = 140 sample size was originally justified by a power calculation performed on the effect size observed in an earlier 40-question run, and those 40 questions are not a separate pilot but exactly the first 40 of the 140 (Section 3.4). That makes the justification circular, and observed power computed from one's own data is not a valid basis for asserting adequate power in the first place [70], so we no longer offer it: n = 140 is reported as a pragmatic sample size. The interpretive consequence is that the decision to extend the sample was taken after inspecting a subset of the same data, which is a data-dependent stopping rule and can inflate the Type I error rate of the resulting test to an extent this design does not let us quantify. We therefore do not present the original n = 140 result, taken alone, as an independently confirmed finding: it is a real, Holm-corrected, adequately intervalled result on 140 real questions with 980 real generations, and it is the best-supported claim in this paper, but on its own it remains a data-dependent continuation of the pilot that set its sample size. What removes that qualification is a separate, independent replication on a fresh, disjoint sample of 140 ARCD questions sharing no question identifiers with the original set or its pilot (Section 4.10): the same r = 0.3 advantage over naive truncation, and the same equivalence of LSPM to the unpruned answer, both reproduce there with equal or greater statistical strength, on data that could not have influenced the original sample-size decision. Taken together, the original result and this replication constitute independent confirmation of the central r = 0.3 finding, even though the original n = 140 test alone does not.</w:t>
+        <w:t xml:space="preserve">Taken together, these limitations mean that memory-efficient vLLM-based deployment remains this work's motivating design objective rather than a demonstrated result: it is now supported by a repeated benchmark showing </w:t>
+      </w:r>
+      <w:r>
+        <w:rPr>
+          <w:highlight w:val="yellow"/>
+        </w:rPr>
+        <w:t xml:space="preserve">a generation-only serving-cost result (Section 3.1) of zero measurable penalty relative to raw, </w:t>
+      </w:r>
+      <w:r>
+        <w:rPr/>
+        <w:t xml:space="preserve">rather than by a demonstrated memory-efficiency win at a realistic operating point; the context-selection result in Section 4.3 remains the part of this paper's contribution that is best supported. The GPU benchmark (Section 4.6) is now a real, repeated, randomized measurement that we do rely on, but for a deliberately narrow purpose: it establishes the absence of a throughput or TTFT penalty, and it does not establish a memory benefit, because the workload never approached cache saturation. One qualification applies to the paper's strongest result and is stated here rather than buried in Methods. The n = 140 sample size was originally justified by a power calculation performed on the effect size observed in an earlier 40-question run, and those 40 questions are not a separate pilot but exactly the first 40 of the 140 (Section 3.4). That makes the justification circular, and observed power computed from one's own data is not a valid basis for asserting adequate power in the first place [70], so we no longer offer it: n = 140 is reported as a pragmatic sample size. The interpretive consequence is that the decision to extend the sample was taken after inspecting a subset of the same data, which is a data-dependent stopping rule and can inflate the Type I error rate of the resulting test to an extent this design does not let us quantify. We therefore do not present the original n = 140 result, taken alone, as an independently confirmed finding: it is a real, Holm-corrected, adequately intervalled result on 140 real questions with 980 real generations, and it is the best-supported claim in this paper, but on its own it remains a data-dependent continuation of the pilot that set its sample size. What removes that qualification is a separate, independent replication on a fresh, disjoint sample of 140 ARCD questions sharing no question identifiers with the original set or its pilot (Section 4.10): the same r = 0.3 advantage over naive truncation, and the same equivalence of LSPM to the unpruned answer, both reproduce there with equal or greater statistical strength, on data that could not have influenced the original sample-size decision. Taken together, the original result and this replication constitute independent confirmation of the central r = 0.3 finding, even though the original n = 140 test alone does not.</w:t>
       </w:r>
     </w:p>
     <w:p>
@@ -8321,7 +8403,17 @@
       </w:pPr>
       <w:r>
         <w:rPr/>
-        <w:t xml:space="preserve">Arabic RAG systems deployed on memory-efficient serving engines such as vLLM face a KV-cache pressure problem rooted in tokenization, confirmed with statistical significance across two independent tokenizers (aggregate ratio 1.69x-1.76x, p &lt; 0.0001, n = 30 Modern Standard Arabic sentence pairs), in line with the cross-linguistic tokenizer-fertility literature. All results reported here are Modern Standard Arabic results; dialectal Arabic was not tested (Section 5). We introduced LSPM, a lightweight, sentence-level, cross-encoder-driven pruning middleware, and evaluated it with the same reporting standard applied regardless of outcome: a paired baseline comparison against naive sentence-count-matched truncation, re-tested on 140 real, ground-truth-scored ARCD questions, finds a statistically significant head-to-head advantage for LSPM at the most aggressive compression ratio tested (r = 0.3: mean token-F1 0.652 vs. 0.537, paired difference +0.114, bootstrap 95% CI +0.056 to +0.176, Holm-Bonferroni-adjusted p = 0.0067), where LSPM is additionally equivalent to the unpruned answer (F1 0.666; TOST, n = 140, p = 0.037) while naive truncation is significantly worse (adjusted p = 0.0007); at more moderate ratios the comparison remains open. A real TF-IDF end-to-end check (n = 60) and a blind two-rater human evaluation (90 answers, mean correctness 1.80 for LSPM vs. 1.72 for raw and 1.55 for truncation on a 0-2 scale) both directionally reinforce this result. Prompt-token counts recomputed offline for all 980 cells with the generator's own tokenizer show that LSPM achieves this while consuming roughly 10% fewer prompt tokens than the truncation baseline it beats, so the advantage is not a token-budget artifact; feeding those measured token reductions through Llama-3.1-8B-Instruct's published KV-cache geometry (32 layers x 8 key-value heads x head dimension 128 x 2 tensors x 2 bytes = 128 KiB per token) yields an analytical saving of 57.4 to 125.5 MiB of KV cache per request across the three ratios tested. A corrected GPU benchmark on a self-hosted vLLM server, designed so its output is the one to be trusted (35 method-by-concurrency cells x 3 repeats = 105 runs, 191,652 requests, zero failures, randomized cell order, pruning moved out of the load generator), finds a generation-only serving-cost result (Section 3.1) of zero measurable penalty relative to raw: LSPM's throughput is within 3% of unpruned serving at every concurrency level tested and slightly ahead at 100 concurrent clients (55.7 vs. 54.1 req/s, with lower median and p95 TTFT), which removes the apparent throughput deficit that the earlier confounded run had reported. We deliberately stop short of a memory-efficiency claim from that sweep alone: KV-cache occupancy never exceeded 8.8% of capacity in it, so the regime in which the analytical saving would matter was not entered there. A redesigned controller ablation, using real contexts and a deliberately constrained cache pool, subsequently did reach that regime, driving occupancy up to 99.2% and the controller's ratio across its full configured range (0.20-0.80); the adaptive mechanism is accordingly now shown to engage under genuine cache pressure, though the dynamic condition retained more context than a fixed r = 0.5 comparison throughout most of that run and was not faster on TTFT or latency, so whether adapting the ratio helps, rather than merely occurring, remains open. We also closed the two most important remaining gaps: a token-budget-matched rerun, in which naive truncation receives the same per-question token budget LSPM actually spent, reproduces the r = 0.3 advantage (+0.140 F1, Holm-adjusted p = 0.0003), and a head-to-head comparison against LLMLingua-2, a modern learned compressor, finds LSPM significantly ahead on token-F1 at all three ratios tested, most convincingly at r = 0.3 and 0.5 (largest gap +0.211 at r = 0.3). The central r = 0.3 result also generalizes to a second generator, Qwen2.5-7B-Instruct, with the same or greater statistical strength than on the original generator. We release the implementation, evaluation code, and the datasets and outputs described in this paper (Data Availability Statement) to support independent reproduction and extension, including the significant, null, inconclusive, and not-yet-validated results alike. Finally, because the original n = 140 sample size was derived from an internal pilot that is a subset of the same 140 questions, we additionally ran an independent replication on 140 freshly sampled ARCD questions sharing no question identifiers with the original set (Section 4.10): the r = 0.3 advantage over naive truncation and the equivalence of LSPM to the unpruned answer both reproduce there with equal or greater statistical strength, so the central finding is now independently confirmed rather than resting on the original sample alone.</w:t>
+        <w:t xml:space="preserve">Arabic RAG systems deployed on memory-efficient serving engines such as vLLM face a KV-cache pressure problem rooted in tokenization, confirmed with statistical significance across two independent tokenizers (aggregate ratio 1.69x-1.76x, p &lt; 0.0001, n = 30 Modern Standard Arabic sentence pairs), in line with the cross-linguistic tokenizer-fertility literature. All results reported here are Modern Standard Arabic results; dialectal Arabic was not tested (Section 5). We introduced LSPM, a lightweight, sentence-level, cross-encoder-driven pruning middleware, and evaluated it with the same reporting standard applied regardless of outcome: a paired baseline comparison against naive sentence-count-matched truncation, re-tested on 140 real, ground-truth-scored ARCD questions, finds a statistically significant head-to-head advantage for LSPM at the most aggressive compression ratio tested (r = 0.3: mean token-F1 0.652 vs. 0.537, paired difference +0.114, bootstrap 95% CI +0.056 to +0.176, Holm-Bonferroni-adjusted p = 0.0067), where LSPM is additionally equivalent to the unpruned answer (F1 0.666; TOST, n = 140, p = 0.037) while naive truncation is significantly worse (adjusted p = 0.0007); at more moderate ratios the comparison remains open. A real TF-IDF end-to-end check (n = 60) and a blind two-rater human evaluation (90 answers, mean correctness 1.80 for LSPM vs. 1.72 for raw and 1.55 for truncation on a 0-2 scale) both directionally reinforce this result. Prompt-token counts recomputed offline for all 980 cells with the generator's own tokenizer show that LSPM achieves this while consuming roughly 10% fewer prompt tokens than the truncation baseline it beats, so the advantage is not a token-budget artifact; feeding those measured token reductions through Llama-3.1-8B-Instruct's published KV-cache geometry (32 layers x 8 key-value heads x head dimension 128 x 2 tensors x 2 bytes = 128 KiB per token) yields an analytical saving of 57.4 to 125.5 MiB of KV cache per request across the three ratios tested. A corrected GPU benchmark on a self-hosted vLLM server, designed so its output is the one to be trusted (35 method-by-concurrency cells x 3 repeats = 105 runs, 191,652 requests, zero failures, randomized cell order, pruning moved out of the load generator), </w:t>
+      </w:r>
+      <w:r>
+        <w:rPr>
+          <w:highlight w:val="yellow"/>
+        </w:rPr>
+        <w:t xml:space="preserve">finds a generation-only serving-cost result (Section 3.1) of zero measurable penalty relative to raw: </w:t>
+      </w:r>
+      <w:r>
+        <w:rPr/>
+        <w:t xml:space="preserve">LSPM's throughput is within 3% of unpruned serving at every concurrency level tested and slightly ahead at 100 concurrent clients (55.7 vs. 54.1 req/s, with lower median and p95 TTFT), which removes the apparent throughput deficit that the earlier confounded run had reported. We deliberately stop short of a memory-efficiency claim from that sweep alone: KV-cache occupancy never exceeded 8.8% of capacity in it, so the regime in which the analytical saving would matter was not entered there. A redesigned controller ablation, using real contexts and a deliberately constrained cache pool, subsequently did reach that regime, driving occupancy up to 99.2% and the controller's ratio across its full configured range (0.20-0.80); the adaptive mechanism is accordingly now shown to engage under genuine cache pressure, though the dynamic condition retained more context than a fixed r = 0.5 comparison throughout most of that run and was not faster on TTFT or latency, so whether adapting the ratio helps, rather than merely occurring, remains open. We also closed the two most important remaining gaps: a token-budget-matched rerun, in which naive truncation receives the same per-question token budget LSPM actually spent, reproduces the r = 0.3 advantage (+0.140 F1, Holm-adjusted p = 0.0003), and a head-to-head comparison against LLMLingua-2, a modern learned compressor, finds LSPM significantly ahead on token-F1 at all three ratios tested, most convincingly at r = 0.3 and 0.5 (largest gap +0.211 at r = 0.3). The central r = 0.3 result also generalizes to a second generator, Qwen2.5-7B-Instruct, with the same or greater statistical strength than on the original generator. We release the implementation, evaluation code, and the datasets and outputs described in this paper (Data Availability Statement) to support independent reproduction and extension, including the significant, null, inconclusive, and not-yet-validated results alike. Finally, because the original n = 140 sample size was derived from an internal pilot that is a subset of the same 140 questions, we additionally ran an independent replication on 140 freshly sampled ARCD questions sharing no question identifiers with the original set (Section 4.10): the r = 0.3 advantage over naive truncation and the equivalence of LSPM to the unpruned answer both reproduce there with equal or greater statistical strength, so the central finding is now independently confirmed rather than resting on the original sample alone.</w:t>
       </w:r>
     </w:p>
     <w:p>

</xml_diff>

<commit_message>
Integrate real GPU results: true end-to-end online serving benchmark (Sec 4.11) and controller-vs-matched-fixed-ratio comparison (Sec 4.12)
- Add Sections 3.5.7/3.5.8 protocols and 4.11/4.12 results with real data
  from results/online_e2e_r03/05/07 and results/controller_vs_matched
- Disclose CPU-only scope of the existing 506.1ms cross-encoder latency
  figure (Sec 3.1) and reconcile against the new GPU-measured ~34ms figure
- Update Abstract, Contributions, Discussion, and Conclusions to report
  the true e2e concurrency-dependent throughput/completion penalty and the
  mixed controller-vs-fixed serving-latency result (no quality data, --skip-quality)
- Yellow-highlight all newly added/changed passages for change tracking
- Update Data Availability Statement and Funding for the two new experiments
</commit_message>
<xml_diff>
--- a/paper/Information_Tarish_Arabic_RAG.docx
+++ b/paper/Information_Tarish_Arabic_RAG.docx
@@ -129,7 +129,17 @@
       </w:r>
       <w:r>
         <w:rPr/>
-        <w:t xml:space="preserve">finds no measurable throughput or latency penalty versus unpruned serving, though this benchmark's KV-cache occupancy never approached saturation; a separate, higher-pressure ablation drives occupancy to 99.2% and confirms the dynamic controller adapts, but not yet that adapting outperforms a matched fixed ratio, so the memory-efficiency claim remains analytical. We release the implementation, evaluation code, and datasets described in this paper.</w:t>
+        <w:t xml:space="preserve">finds no measurable throughput or latency penalty versus unpruned serving, though this benchmark's KV-cache occupancy never approached saturation; a separate, higher-pressure ablation drives occupancy to 99.2% and confirms the dynamic controller adapts, but not yet that adapting outperforms a matched fixed ratio, so the memory-efficiency claim remains analytical. </w:t>
+      </w:r>
+      <w:r>
+        <w:rPr>
+          <w:highlight w:val="yellow"/>
+        </w:rPr>
+        <w:t xml:space="preserve">A true end-to-end online benchmark, scoring and pruning context inside the live request path instead of reading it from a precomputed context, finds a substantial, concurrency-dependent throughput and completion-rate penalty for LSPM relative to unpruned serving, and a matching controller-versus-matched-fixed-ratio comparison under memory pressure is a mixed result on serving latency with no answer-quality data collected. </w:t>
+      </w:r>
+      <w:r>
+        <w:rPr/>
+        <w:t xml:space="preserve">We release the implementation, evaluation code, and datasets described in this paper.</w:t>
       </w:r>
     </w:p>
     <w:p>
@@ -347,7 +357,7 @@
         <w:rPr>
           <w:highlight w:val="yellow"/>
         </w:rPr>
-        <w:t xml:space="preserve">This paper is principally an architecture and validation study of context selection for Arabic RAG: the tokenization measurement, the naive-truncation baseline comparison, the end-to-end retrieval check, and the human evaluation are its central evidence. It additionally includes a GPU benchmark against a self-hosted vLLM server, now executed under the corrected protocol: seven context conditions crossed with five concurrency levels, each cell repeated three times in randomized order with pruning moved out of the load generator, for 105 runs and 191,652 requests with zero failures. That benchmark, scoped to generation cost only (Section 3.1 quantifies the pruning step's own cross-encoder cost separately), finds that semantic pruning imposes no measurable throughput or time-to-first-token penalty relative to unpruned serving at any concurrency level tested; the 8.5-11.9% throughput deficit reported for LSPM by the earlier, confounded exploratory run does not survive removal of the load-generator-side scoring cost. It also finds that KV-cache occupancy never rose above 9% of capacity on this hardware, so the benchmark establishes the absence of a serving-cost penalty rather than a demonstrated memory benefit under pressure. A first ablation of the dynamic ratio controller under this same low-pressure regime likewise never reached the 75% occupancy threshold at which the controller would begin adapting, so it validated the controller's plumbing and stability but not its adaptive path; a second, redesigned ablation using a deliberately constrained cache pool subsequently drove occupancy to 99.2% and exercised the controller's full configured ratio range, showing that the adaptive path does engage under real cache pressure. That redesigned run does not, however, show that adapting the ratio improves throughput, tail latency, or answer quality relative to a fixed ratio, because the dynamic and fixed conditions were not matched on average retained context: closing that comparison, and measuring the end-to-end serving cost of the pruning step itself rather than only of generation over a precomputed context, are this paper's most important open validation items. The scope and limits of every claim in this paper, measured, analytical, and not-yet-validated alike, are stated explicitly in the sections that follow.</w:t>
+        <w:t xml:space="preserve">This paper is principally an architecture and validation study of context selection for Arabic RAG: the tokenization measurement, the naive-truncation baseline comparison, the end-to-end retrieval check, and the human evaluation are its central evidence. It additionally includes a GPU benchmark against a self-hosted vLLM server, now executed under the corrected protocol: seven context conditions crossed with five concurrency levels, each cell repeated three times in randomized order with pruning moved out of the load generator, for 105 runs and 191,652 requests with zero failures. That benchmark, scoped to generation cost only (Section 3.1 quantifies the pruning step's own cross-encoder cost separately), finds that semantic pruning imposes no measurable throughput or time-to-first-token penalty relative to unpruned serving at any concurrency level tested; the 8.5-11.9% throughput deficit reported for LSPM by the earlier, confounded exploratory run does not survive removal of the load-generator-side scoring cost. It also finds that KV-cache occupancy never rose above 9% of capacity on this hardware, so the benchmark establishes the absence of a serving-cost penalty rather than a demonstrated memory benefit under pressure. A first ablation of the dynamic ratio controller under this same low-pressure regime likewise never reached the 75% occupancy threshold at which the controller would begin adapting, so it validated the controller's plumbing and stability but not its adaptive path; a second, redesigned ablation using a deliberately constrained cache pool subsequently drove occupancy to 99.2% and exercised the controller's full configured ratio range, showing that the adaptive path does engage under real cache pressure. That redesigned run does not, however, show that adapting the ratio improves throughput, tail latency, or answer quality relative to a fixed ratio, because the dynamic and fixed conditions were not matched on average retained context. Both open items identified here have since been closed with new measurements, reported in Sections 4.11 and 4.12: a live, concurrent-load benchmark that scores and prunes context inside the online request path rather than reading it from a precomputed lookup, and a controller-versus-matched-fixed-ratio comparison run under the same constrained-cache-pool pressure as the redesigned ablation. Neither result is favorable enough to report as an unqualified improvement: the true end-to-end benchmark finds a substantial, concurrency-dependent throughput and completion-rate penalty relative to raw serving once the pruning step's own cost is included in the request path, and the controller comparison is a mixed result on serving latency with no answer-quality data collected. The scope and limits of every claim in this paper, measured, analytical, and not-yet-validated alike, are stated explicitly in the sections that follow.</w:t>
       </w:r>
     </w:p>
     <w:p>
@@ -363,11 +373,21 @@
         <w:rPr>
           <w:highlight w:val="yellow"/>
         </w:rPr>
-        <w:t xml:space="preserve">This controller is a working engineering mechanism, not yet a validated improvement: a redesigned ablation confirms it engages its full adaptive range under real cache pressure, but does not show that adapting outperforms a matched fixed ratio, which remains open (Section 4.7). </w:t>
-      </w:r>
-      <w:r>
-        <w:rPr/>
-        <w:t xml:space="preserve">(2) A quantitative measurement of Modern Standard Arabic-English tokenization disparity on a 30-pair hand-verified parallel corpus (bootstrap p &lt; 0.0001 for both of two tokenizers tested). This is not a novel phenomenon: tokenizer fertility gaps between English and morphologically richer or less-represented languages are established in the literature, from Rust et al.'s demonstration that a language's tokenizer quality, not only its pretraining data volume, drives multilingual model performance [19], to Petrov et al.'s systematic measurement of encoding-length disparity across languages [20] and Ahia et al.'s analysis of the resulting per-language cost inequity in commercial API pricing [15]. Our contribution is to confirm that literature on a hand-verified Arabic corpus with the two specific tokenizers used in this study and, more to the point, to carry it into a serving-system setting by connecting the fertility gap to the KV-cache footprint a vLLM-class engine must hold per request, which is a consequence those studies do not measure. (3) A real, paired baseline comparison against naive sentence-count-matched truncation, re-tested at increasing scale up to a 140-question ARCD re-test (980 live generations), resolving the head-to-head comparison in LSPM's favor at the most aggressive ratio (r = 0.3) after Holm-Bonferroni correction, while leaving it open at more moderate ratios. (4) A complementary end-to-end retrieval check that removes the answer-guaranteed pool construction, with a real TF-IDF retriever (recall@6 = 86.7%), reproducing the same directional advantage. (5) An analytical, explicitly-labeled KV-cache savings projection derived from real per-request prompt-token counts, together with a corrected, repeated GPU throughput/TTFT/KV-cache benchmark against a self-hosted vLLM server (35 cells x 3 repeats, 105 runs, 191,652 requests, zero failures) that measures the serving-cost consequences of pruning under load, and two dynamic-controller ablations on real, preserved per-request logs, the second of which redesigns the first to reach genuine cache pressure; all are reported with their scope limits stated, including the finding that the main serving benchmark's KV-cache occupancy never approached saturation on the tested hardware, and that the redesigned controller ablation, while confirming the adaptive path does engage at 99.2% occupancy elsewhere, has not shown that adapting improves throughput, latency, or answer quality relative to a matched fixed ratio. (6) A blind, two-rater human evaluation (90 answers, correctness and faithfulness, substantial-to-near-perfect inter-rater agreement) that directionally corroborates the automatic-metric result. (7) A token-budget-matched rerun that gives naive truncation the same per-question token budget LSPM actually spent, closing the token-budget confound left open by contribution (3) and reproducing LSPM's advantage at r = 0.3. (8) A head-to-head comparison against LLMLingua-2, a modern learned prompt compressor, on the identical 140-question evaluation, showing LSPM significantly ahead on token-F1 at all three ratios tested, most convincingly at r = 0.3 and 0.5. (9) A generalization check that reruns the full ARCD ground-truth protocol against a second generator, Qwen2.5-7B-Instruct, replicating the central r = 0.3 quality result with the same or greater statistical strength. (10) An independent, fresh-seed replication of the central r = 0.3 result on 140 newly sampled ARCD questions sharing no question identifiers with the original 140, confirming the finding on data that were not used to set the original sample size or produce the original result.</w:t>
+        <w:t xml:space="preserve">This controller is a working engineering mechanism, not yet a validated improvement: a redesigned ablation confirms it engages its full adaptive range under real cache pressure, and a further like-for-like comparison against a matched fixed ratio under the same pressure (Section 4.12) finds a mixed result on serving latency with no answer-quality data collected, so adapting the ratio is not shown to outperform a well-chosen fixed one. </w:t>
+      </w:r>
+      <w:r>
+        <w:rPr/>
+        <w:t xml:space="preserve">(2) A quantitative measurement of Modern Standard Arabic-English tokenization disparity on a 30-pair hand-verified parallel corpus (bootstrap p &lt; 0.0001 for both of two tokenizers tested). This is not a novel phenomenon: tokenizer fertility gaps between English and morphologically richer or less-represented languages are established in the literature, from Rust et al.'s demonstration that a language's tokenizer quality, not only its pretraining data volume, drives multilingual model performance [19], to Petrov et al.'s systematic measurement of encoding-length disparity across languages [20] and Ahia et al.'s analysis of the resulting per-language cost inequity in commercial API pricing [15]. Our contribution is to confirm that literature on a hand-verified Arabic corpus with the two specific tokenizers used in this study and, more to the point, to carry it into a serving-system setting by connecting the fertility gap to the KV-cache footprint a vLLM-class engine must hold per request, which is a consequence those studies do not measure. (3) A real, paired baseline comparison against naive sentence-count-matched truncation, re-tested at increasing scale up to a 140-question ARCD re-test (980 live generations), resolving the head-to-head comparison in LSPM's favor at the most aggressive ratio (r = 0.3) after Holm-Bonferroni correction, while leaving it open at more moderate ratios. (4) A complementary end-to-end retrieval check that removes the answer-guaranteed pool construction, with a real TF-IDF retriever (recall@6 = 86.7%), reproducing the same directional advantage. (5) An analytical, explicitly-labeled KV-cache savings projection derived from real per-request prompt-token counts, together with a corrected, repeated GPU throughput/TTFT/KV-cache benchmark against a self-hosted vLLM server (35 cells x 3 repeats, 105 runs, 191,652 requests, zero failures) that measures the serving-cost consequences of pruning under load, and two dynamic-controller ablations on real, preserved per-request logs, the second of which redesigns the first to reach genuine cache pressure; all are reported with their scope limits stated, including the finding that the main serving benchmark's KV-cache occupancy never approached saturation on the tested hardware, and that the redesigned controller ablation, while confirming the adaptive path does engage at 99.2% occupancy elsewhere, has not shown that adapting improves throughput, latency, or answer quality relative to a matched fixed ratio. </w:t>
+      </w:r>
+      <w:r>
+        <w:rPr>
+          <w:highlight w:val="yellow"/>
+        </w:rPr>
+        <w:t xml:space="preserve">A further true end-to-end online benchmark (Section 4.11), scoring and pruning context inside the live request path rather than from a precomputed lookup, closes this paper's most important remaining open item by measuring a substantial, concurrency-dependent throughput and completion-rate penalty for LSPM relative to raw serving, in contrast to the generation-only benchmark's zero-measurable-penalty finding. </w:t>
+      </w:r>
+      <w:r>
+        <w:rPr/>
+        <w:t xml:space="preserve">(6) A blind, two-rater human evaluation (90 answers, correctness and faithfulness, substantial-to-near-perfect inter-rater agreement) that directionally corroborates the automatic-metric result. (7) A token-budget-matched rerun that gives naive truncation the same per-question token budget LSPM actually spent, closing the token-budget confound left open by contribution (3) and reproducing LSPM's advantage at r = 0.3. (8) A head-to-head comparison against LLMLingua-2, a modern learned prompt compressor, on the identical 140-question evaluation, showing LSPM significantly ahead on token-F1 at all three ratios tested, most convincingly at r = 0.3 and 0.5. (9) A generalization check that reruns the full ARCD ground-truth protocol against a second generator, Qwen2.5-7B-Instruct, replicating the central r = 0.3 quality result with the same or greater statistical strength. (10) An independent, fresh-seed replication of the central r = 0.3 result on 140 newly sampled ARCD questions sharing no question identifiers with the original 140, confirming the finding on data that were not used to set the original sample size or produce the original result.</w:t>
       </w:r>
     </w:p>
     <w:p>
@@ -514,7 +534,7 @@
         <w:rPr>
           <w:highlight w:val="yellow"/>
         </w:rPr>
-        <w:t xml:space="preserve">It then pairs every extracted sentence with the query and scores it with a cross-encoder; the reference implementation supports a fast MiniLM-family backend for interactive use or a BGE-reranker-v2-m3 backend for maximal accuracy as a configurable choice, and cross-encoder/mmarco-mMiniLMv2-L12-H384-v1 specifically is the model used to produce every result reported in this paper (Section 3.3); none of this paper's quality or serving-cost results were reproduced on the BGE-reranker-v2-m3 backend or any other cross-encoder, so backend-to-backend variance in either scoring quality or scoring latency is not measured here and should not be assumed to be small (Section 5). This scoring step has a measured mean latency of 506.1 ms. Every throughput/latency comparison in this paper that is described as "generation-only" (Sections 4.6, 5, and 6) reads contexts from a precomputed lookup and therefore measures the vLLM server's generation cost alone, excluding this 506.1 ms cross-encoder cost; it is not an end-to-end online-serving measurement, and should not be read as one. The highest-scoring sentences are retained, in their original order, up to a target compression ratio r (the fraction of sentences kept), and reassembled into a compact context that is handed to the generator running behind a vLLM server.</w:t>
+        <w:t xml:space="preserve">It then pairs every extracted sentence with the query and scores it with a cross-encoder; the reference implementation supports a fast MiniLM-family backend for interactive use or a BGE-reranker-v2-m3 backend for maximal accuracy as a configurable choice, and cross-encoder/mmarco-mMiniLMv2-L12-H384-v1 specifically is the model used to produce every result reported in this paper (Section 3.3); none of this paper's quality or serving-cost results were reproduced on the BGE-reranker-v2-m3 backend or any other cross-encoder, so backend-to-backend variance in either scoring quality or scoring latency is not measured here and should not be assumed to be small (Section 5). This scoring step has a measured mean latency of 506.1 ms, single-request and CPU-only, over the same six-document candidate pool used in this paper's main baseline comparison (420 real measurements, Section 4.3); Section 4.11 reports the GPU-accelerated figure this same step produces when it runs on the same GPU as the vLLM server, inside a live concurrent-load benchmark. Every throughput/latency comparison in this paper that is described as "generation-only" (Sections 4.6, 5, and 6) reads contexts from a precomputed lookup and therefore measures the vLLM server's generation cost alone, excluding this 506.1 ms CPU cross-encoder cost; it is not an end-to-end online-serving measurement, and should not be read as one. The highest-scoring sentences are retained, in their original order, up to a target compression ratio r (the fraction of sentences kept), and reassembled into a compact context that is handed to the generator running behind a vLLM server.</w:t>
       </w:r>
     </w:p>
     <w:p>
@@ -1290,7 +1310,7 @@
       </w:pPr>
       <w:r>
         <w:rPr/>
-        <w:t xml:space="preserve">3.5. Protocols for the Extended Validation Studies (Sections 4.5-4.10)</w:t>
+        <w:t xml:space="preserve">3.5. Protocols for the Extended Validation Studies (Sections 4.5-4.12)</w:t>
       </w:r>
     </w:p>
     <w:p>
@@ -1397,6 +1417,44 @@
       <w:r>
         <w:rPr/>
         <w:t xml:space="preserve">Section 3.4 and Section 5 both note a specific limitation of the n = 140 ARCD re-test: its sample size was derived from an internal 40-question pilot that is a strict subset of the same 140 questions, so the decision to extend to n = 140 was taken after inspecting a subset of the same data, making the reported result a data-dependent continuation of that pilot rather than an independently confirmed finding. To close that gap directly rather than merely disclose it, we ran a separate, independent replication. A new script (build_arcd_eval_set_replication.py) sampled 140 ARCD validation questions with a different random seed (2026, versus the original SEED = 42) and excluded every question identifier already present in the original 140-question set before sampling; a programmatic check confirmed zero overlap between the two id sets. These 140 fresh questions were evaluated under the identical protocol used in Section 4.3, restricted to the three conditions the central result concerns: raw (unpruned), LSPM at r = 0.3, and naive truncation at r = 0.3, against the same generator (Llama-3.1-8B-Instruct, the same NVIDIA NIM endpoint and prompt template), the same cross-encoder, and the same Arabic-normalized scorer (score_arcd.py, Section 4.8), producing 420 new live generations (140 questions x 3 conditions). The generator, retrieval mechanism, pruner, and scorer were held fixed deliberately: substituting a different generator family here would constitute a further generalization check of the kind already reported in Section 4.9, not a confirmation of the original finding.</w:t>
+      </w:r>
+    </w:p>
+    <w:p>
+      <w:pPr>
+        <w:pStyle w:val="MDPI31text"/>
+        <w:rPr/>
+      </w:pPr>
+      <w:r>
+        <w:rPr>
+          <w:b/>
+          <w:highlight w:val="yellow"/>
+        </w:rPr>
+        <w:t xml:space="preserve">3.5.7. True end-to-end online serving benchmark protocol (results in Section 4.11). </w:t>
+      </w:r>
+      <w:r>
+        <w:rPr>
+          <w:highlight w:val="yellow"/>
+        </w:rPr>
+        <w:t xml:space="preserve">Section 4.6's GPU benchmark and every "generation-only" comparison in this paper (Sections 4.6, 5, and 6) read a precomputed, already-pruned context from a lookup table before generation, so none of them include the cross-encoder scoring cost quantified separately in Section 3.1. To close this gap, we ran a new script (benchmark/run_online_e2e_benchmark.py) against a live, self-hosted vLLM server (a single rented RTX 4090 with 48 GiB of VRAM; Section 4.11 reports the full hardware disclosure) that performs retrieval, cross-encoder scoring, and pruning inside the request path itself, immediately before each generation call, rather than reading an already-pruned context from a lookup. Three context conditions were tested: raw (unpruned), LSPM at a fixed ratio, and naive length-matched truncation at the same ratio, crossed with four concurrency levels (1, 5, 10, and 20 concurrent requests) and three compression ratios (r = 0.3, 0.5, 0.7), for 60 requests per (condition, concurrency, ratio) cell. For every cell we recorded the pruning step's own latency separately from time-to-first-token (TTFT), total request latency, and achieved throughput (requests/s and tokens/s), so the cost of scoring and pruning inside the live request path is visible rather than hidden inside a generation-only figure.</w:t>
+      </w:r>
+    </w:p>
+    <w:p>
+      <w:pPr>
+        <w:pStyle w:val="MDPI31text"/>
+        <w:rPr/>
+      </w:pPr>
+      <w:r>
+        <w:rPr>
+          <w:b/>
+          <w:highlight w:val="yellow"/>
+        </w:rPr>
+        <w:t xml:space="preserve">3.5.8. Controller-versus-matched-fixed-ratio comparison protocol (results in Section 4.12). </w:t>
+      </w:r>
+      <w:r>
+        <w:rPr>
+          <w:highlight w:val="yellow"/>
+        </w:rPr>
+        <w:t xml:space="preserve">Section 4.7's redesigned ablation established that the dynamic ratio controller's adaptive path engages under real cache pressure (occupancy reaching 99.2%) but, because the dynamic and fixed arms were not matched on average retained context, could not show whether adapting the ratio outperforms a fixed one. To close that comparison directly, we ran a new script (scripts/run_controller_vs_matched_fixed.py) under the same deliberately constrained --gpu-memory-utilization cache pool as the redesigned ablation of Section 4.7, running two conditions back to back on the same RTX 4090 48 GiB card: "dynamic", in which the controller adjusts its ratio in response to live KV-cache occupancy exactly as in Section 4.7, and "matched_fixed", in which the ratio is held constant at the dynamic condition's own realized mean ratio for the run, so the two arms retain the same average amount of context. For every request in both conditions we logged the ratio in effect, the KV-cache occupancy at request time, TTFT, and total latency; the run was executed with the script's --skip-quality flag, so this comparison covers serving latency only and does not include an answer-quality comparison between the two conditions.</w:t>
       </w:r>
     </w:p>
     <w:p>
@@ -8169,6 +8227,3008 @@
     </w:tbl>
     <w:p>
       <w:pPr>
+        <w:pStyle w:val="MDPI22heading2"/>
+        <w:spacing w:before="240" w:after="60"/>
+        <w:rPr/>
+      </w:pPr>
+      <w:r>
+        <w:rPr/>
+        <w:t xml:space="preserve">4.11. True End-to-End Online Serving Benchmark</w:t>
+      </w:r>
+    </w:p>
+    <w:p>
+      <w:pPr>
+        <w:pStyle w:val="MDPI31text"/>
+        <w:rPr/>
+      </w:pPr>
+      <w:r>
+        <w:rPr>
+          <w:highlight w:val="yellow"/>
+        </w:rPr>
+        <w:t xml:space="preserve">Under the protocol of Section 3.5.7, we reran the serving comparison with retrieval, cross-encoder scoring, and pruning executed live inside the request path against a self-hosted vLLM server on a single rented RTX 4090 with 48 GiB of VRAM, rather than reading an already-pruned context from a precomputed lookup as in Section 4.6. This is the concurrent-load, GPU-accelerated measurement that Section 3.1 identifies as still needed to complement its own CPU-only, single-request 506.1 ms figure, and it changes the picture: the pruning step's own latency running on GPU is far lower than on CPU (mean 34.3 ms at concurrency 1, averaged across r = 0.3/0.5/0.7, versus 506.1 ms on CPU), but once this cost is measured inside the live request path rather than excluded from it, LSPM's total-latency and throughput profile relative to raw, unpruned serving degrades sharply as concurrency rises, in contrast to Section 4.6's generation-only finding of no measurable penalty at any concurrency tested.</w:t>
+      </w:r>
+    </w:p>
+    <w:p>
+      <w:pPr>
+        <w:pStyle w:val="MDPI41tablecaption"/>
+        <w:rPr/>
+      </w:pPr>
+      <w:r>
+        <w:rPr>
+          <w:b/>
+        </w:rPr>
+        <w:t xml:space="preserve">Table 9. True end-to-end online serving benchmark at r = 0.5, four concurrency levels, 60 requests per (condition, concurrency) cell (protocol in Section 3.5.7). N is the count of requests that completed within the benchmark's timeout, out of 60 attempted. Latency and time-to-first-token (TTFT) figures are means in milliseconds; throughput is completed requests per second. Ratios r = 0.3 and r = 0.7 show the same qualitative pattern and are summarized narratively below rather than tabulated in full.</w:t>
+      </w:r>
+    </w:p>
+    <w:tbl>
+      <w:tblPr>
+        <w:tblW w:type="auto" w:w="0"/>
+        <w:tblLook w:firstColumn="1" w:firstRow="1" w:lastColumn="0" w:lastRow="0" w:noHBand="0" w:noVBand="1" w:val="04A0"/>
+        <w:bidiVisual w:val="0"/>
+      </w:tblPr>
+      <w:tblGrid>
+        <w:gridCol w:w="1495"/>
+        <w:gridCol w:w="1495"/>
+        <w:gridCol w:w="1495"/>
+        <w:gridCol w:w="1495"/>
+        <w:gridCol w:w="1495"/>
+        <w:gridCol w:w="1495"/>
+        <w:gridCol w:w="1495"/>
+      </w:tblGrid>
+      <w:tr>
+        <w:tc>
+          <w:tcPr>
+            <w:tcW w:type="dxa" w:w="1495"/>
+            <w:tcBorders>
+              <w:top w:val="single" w:sz="8" w:space="0" w:color="000000"/>
+              <w:bottom w:val="single" w:sz="4" w:space="0" w:color="000000"/>
+            </w:tcBorders>
+          </w:tcPr>
+          <w:p>
+            <w:pPr>
+              <w:pStyle w:val="MDPI42tablebody"/>
+              <w:bidi w:val="0"/>
+            </w:pPr>
+            <w:r>
+              <w:rPr>
+                <w:highlight w:val="yellow"/>
+              </w:rPr>
+            </w:r>
+            <w:r>
+              <w:rPr>
+                <w:b/>
+                <w:sz w:val="20"/>
+                <w:highlight w:val="yellow"/>
+              </w:rPr>
+              <w:t>Condition</w:t>
+            </w:r>
+          </w:p>
+        </w:tc>
+        <w:tc>
+          <w:tcPr>
+            <w:tcW w:type="dxa" w:w="1495"/>
+            <w:tcBorders>
+              <w:top w:val="single" w:sz="8" w:space="0" w:color="000000"/>
+              <w:bottom w:val="single" w:sz="4" w:space="0" w:color="000000"/>
+            </w:tcBorders>
+          </w:tcPr>
+          <w:p>
+            <w:pPr>
+              <w:pStyle w:val="MDPI42tablebody"/>
+              <w:bidi w:val="0"/>
+            </w:pPr>
+            <w:r>
+              <w:rPr>
+                <w:highlight w:val="yellow"/>
+              </w:rPr>
+            </w:r>
+            <w:r>
+              <w:rPr>
+                <w:b/>
+                <w:sz w:val="20"/>
+                <w:highlight w:val="yellow"/>
+              </w:rPr>
+              <w:t>Conc.</w:t>
+            </w:r>
+          </w:p>
+        </w:tc>
+        <w:tc>
+          <w:tcPr>
+            <w:tcW w:type="dxa" w:w="1495"/>
+            <w:tcBorders>
+              <w:top w:val="single" w:sz="8" w:space="0" w:color="000000"/>
+              <w:bottom w:val="single" w:sz="4" w:space="0" w:color="000000"/>
+            </w:tcBorders>
+          </w:tcPr>
+          <w:p>
+            <w:pPr>
+              <w:pStyle w:val="MDPI42tablebody"/>
+              <w:bidi w:val="0"/>
+            </w:pPr>
+            <w:r>
+              <w:rPr>
+                <w:highlight w:val="yellow"/>
+              </w:rPr>
+            </w:r>
+            <w:r>
+              <w:rPr>
+                <w:b/>
+                <w:sz w:val="20"/>
+                <w:highlight w:val="yellow"/>
+              </w:rPr>
+              <w:t>N/60</w:t>
+            </w:r>
+          </w:p>
+        </w:tc>
+        <w:tc>
+          <w:tcPr>
+            <w:tcW w:type="dxa" w:w="1495"/>
+            <w:tcBorders>
+              <w:top w:val="single" w:sz="8" w:space="0" w:color="000000"/>
+              <w:bottom w:val="single" w:sz="4" w:space="0" w:color="000000"/>
+            </w:tcBorders>
+          </w:tcPr>
+          <w:p>
+            <w:pPr>
+              <w:pStyle w:val="MDPI42tablebody"/>
+              <w:bidi w:val="0"/>
+            </w:pPr>
+            <w:r>
+              <w:rPr>
+                <w:highlight w:val="yellow"/>
+              </w:rPr>
+            </w:r>
+            <w:r>
+              <w:rPr>
+                <w:b/>
+                <w:sz w:val="20"/>
+                <w:highlight w:val="yellow"/>
+              </w:rPr>
+              <w:t>Pruning ms</w:t>
+            </w:r>
+          </w:p>
+        </w:tc>
+        <w:tc>
+          <w:tcPr>
+            <w:tcW w:type="dxa" w:w="1495"/>
+            <w:tcBorders>
+              <w:top w:val="single" w:sz="8" w:space="0" w:color="000000"/>
+              <w:bottom w:val="single" w:sz="4" w:space="0" w:color="000000"/>
+            </w:tcBorders>
+          </w:tcPr>
+          <w:p>
+            <w:pPr>
+              <w:pStyle w:val="MDPI42tablebody"/>
+              <w:bidi w:val="0"/>
+            </w:pPr>
+            <w:r>
+              <w:rPr>
+                <w:highlight w:val="yellow"/>
+              </w:rPr>
+            </w:r>
+            <w:r>
+              <w:rPr>
+                <w:b/>
+                <w:sz w:val="20"/>
+                <w:highlight w:val="yellow"/>
+              </w:rPr>
+              <w:t>TTFT ms</w:t>
+            </w:r>
+          </w:p>
+        </w:tc>
+        <w:tc>
+          <w:tcPr>
+            <w:tcW w:type="dxa" w:w="1495"/>
+            <w:tcBorders>
+              <w:top w:val="single" w:sz="8" w:space="0" w:color="000000"/>
+              <w:bottom w:val="single" w:sz="4" w:space="0" w:color="000000"/>
+            </w:tcBorders>
+          </w:tcPr>
+          <w:p>
+            <w:pPr>
+              <w:pStyle w:val="MDPI42tablebody"/>
+              <w:bidi w:val="0"/>
+            </w:pPr>
+            <w:r>
+              <w:rPr>
+                <w:highlight w:val="yellow"/>
+              </w:rPr>
+            </w:r>
+            <w:r>
+              <w:rPr>
+                <w:b/>
+                <w:sz w:val="20"/>
+                <w:highlight w:val="yellow"/>
+              </w:rPr>
+              <w:t>Total lat. ms</w:t>
+            </w:r>
+          </w:p>
+        </w:tc>
+        <w:tc>
+          <w:tcPr>
+            <w:tcW w:type="dxa" w:w="1495"/>
+            <w:tcBorders>
+              <w:top w:val="single" w:sz="8" w:space="0" w:color="000000"/>
+              <w:bottom w:val="single" w:sz="4" w:space="0" w:color="000000"/>
+            </w:tcBorders>
+          </w:tcPr>
+          <w:p>
+            <w:pPr>
+              <w:pStyle w:val="MDPI42tablebody"/>
+              <w:bidi w:val="0"/>
+            </w:pPr>
+            <w:r>
+              <w:rPr>
+                <w:highlight w:val="yellow"/>
+              </w:rPr>
+            </w:r>
+            <w:r>
+              <w:rPr>
+                <w:b/>
+                <w:sz w:val="20"/>
+                <w:highlight w:val="yellow"/>
+              </w:rPr>
+              <w:t>Throughput req/s</w:t>
+            </w:r>
+          </w:p>
+        </w:tc>
+      </w:tr>
+      <w:tr>
+        <w:tc>
+          <w:tcPr>
+            <w:tcW w:type="dxa" w:w="1495"/>
+          </w:tcPr>
+          <w:p>
+            <w:pPr>
+              <w:pStyle w:val="MDPI42tablebody"/>
+              <w:bidi w:val="0"/>
+            </w:pPr>
+            <w:r>
+              <w:rPr>
+                <w:highlight w:val="yellow"/>
+              </w:rPr>
+            </w:r>
+            <w:r>
+              <w:rPr>
+                <w:sz w:val="20"/>
+                <w:highlight w:val="yellow"/>
+              </w:rPr>
+              <w:t>raw</w:t>
+            </w:r>
+          </w:p>
+        </w:tc>
+        <w:tc>
+          <w:tcPr>
+            <w:tcW w:type="dxa" w:w="1495"/>
+          </w:tcPr>
+          <w:p>
+            <w:pPr>
+              <w:pStyle w:val="MDPI42tablebody"/>
+              <w:bidi w:val="0"/>
+            </w:pPr>
+            <w:r>
+              <w:rPr>
+                <w:highlight w:val="yellow"/>
+              </w:rPr>
+            </w:r>
+            <w:r>
+              <w:rPr>
+                <w:sz w:val="20"/>
+                <w:highlight w:val="yellow"/>
+              </w:rPr>
+              <w:t>1</w:t>
+            </w:r>
+          </w:p>
+        </w:tc>
+        <w:tc>
+          <w:tcPr>
+            <w:tcW w:type="dxa" w:w="1495"/>
+          </w:tcPr>
+          <w:p>
+            <w:pPr>
+              <w:pStyle w:val="MDPI42tablebody"/>
+              <w:bidi w:val="0"/>
+            </w:pPr>
+            <w:r>
+              <w:rPr>
+                <w:highlight w:val="yellow"/>
+              </w:rPr>
+            </w:r>
+            <w:r>
+              <w:rPr>
+                <w:sz w:val="20"/>
+                <w:highlight w:val="yellow"/>
+              </w:rPr>
+              <w:t>60</w:t>
+            </w:r>
+          </w:p>
+        </w:tc>
+        <w:tc>
+          <w:tcPr>
+            <w:tcW w:type="dxa" w:w="1495"/>
+          </w:tcPr>
+          <w:p>
+            <w:pPr>
+              <w:pStyle w:val="MDPI42tablebody"/>
+              <w:bidi w:val="0"/>
+            </w:pPr>
+            <w:r>
+              <w:rPr>
+                <w:highlight w:val="yellow"/>
+              </w:rPr>
+            </w:r>
+            <w:r>
+              <w:rPr>
+                <w:sz w:val="20"/>
+                <w:highlight w:val="yellow"/>
+              </w:rPr>
+              <w:t>0.0</w:t>
+            </w:r>
+          </w:p>
+        </w:tc>
+        <w:tc>
+          <w:tcPr>
+            <w:tcW w:type="dxa" w:w="1495"/>
+          </w:tcPr>
+          <w:p>
+            <w:pPr>
+              <w:pStyle w:val="MDPI42tablebody"/>
+              <w:bidi w:val="0"/>
+            </w:pPr>
+            <w:r>
+              <w:rPr>
+                <w:highlight w:val="yellow"/>
+              </w:rPr>
+            </w:r>
+            <w:r>
+              <w:rPr>
+                <w:sz w:val="20"/>
+                <w:highlight w:val="yellow"/>
+              </w:rPr>
+              <w:t>38.8</w:t>
+            </w:r>
+          </w:p>
+        </w:tc>
+        <w:tc>
+          <w:tcPr>
+            <w:tcW w:type="dxa" w:w="1495"/>
+          </w:tcPr>
+          <w:p>
+            <w:pPr>
+              <w:pStyle w:val="MDPI42tablebody"/>
+              <w:bidi w:val="0"/>
+            </w:pPr>
+            <w:r>
+              <w:rPr>
+                <w:highlight w:val="yellow"/>
+              </w:rPr>
+            </w:r>
+            <w:r>
+              <w:rPr>
+                <w:sz w:val="20"/>
+                <w:highlight w:val="yellow"/>
+              </w:rPr>
+              <w:t>381.8</w:t>
+            </w:r>
+          </w:p>
+        </w:tc>
+        <w:tc>
+          <w:tcPr>
+            <w:tcW w:type="dxa" w:w="1495"/>
+          </w:tcPr>
+          <w:p>
+            <w:pPr>
+              <w:pStyle w:val="MDPI42tablebody"/>
+              <w:bidi w:val="0"/>
+            </w:pPr>
+            <w:r>
+              <w:rPr>
+                <w:highlight w:val="yellow"/>
+              </w:rPr>
+            </w:r>
+            <w:r>
+              <w:rPr>
+                <w:sz w:val="20"/>
+                <w:highlight w:val="yellow"/>
+              </w:rPr>
+              <w:t>2.62</w:t>
+            </w:r>
+          </w:p>
+        </w:tc>
+      </w:tr>
+      <w:tr>
+        <w:tc>
+          <w:tcPr>
+            <w:tcW w:type="dxa" w:w="1495"/>
+          </w:tcPr>
+          <w:p>
+            <w:pPr>
+              <w:pStyle w:val="MDPI42tablebody"/>
+              <w:bidi w:val="0"/>
+            </w:pPr>
+            <w:r>
+              <w:rPr>
+                <w:highlight w:val="yellow"/>
+              </w:rPr>
+            </w:r>
+            <w:r>
+              <w:rPr>
+                <w:sz w:val="20"/>
+                <w:highlight w:val="yellow"/>
+              </w:rPr>
+              <w:t>raw</w:t>
+            </w:r>
+          </w:p>
+        </w:tc>
+        <w:tc>
+          <w:tcPr>
+            <w:tcW w:type="dxa" w:w="1495"/>
+          </w:tcPr>
+          <w:p>
+            <w:pPr>
+              <w:pStyle w:val="MDPI42tablebody"/>
+              <w:bidi w:val="0"/>
+            </w:pPr>
+            <w:r>
+              <w:rPr>
+                <w:highlight w:val="yellow"/>
+              </w:rPr>
+            </w:r>
+            <w:r>
+              <w:rPr>
+                <w:sz w:val="20"/>
+                <w:highlight w:val="yellow"/>
+              </w:rPr>
+              <w:t>5</w:t>
+            </w:r>
+          </w:p>
+        </w:tc>
+        <w:tc>
+          <w:tcPr>
+            <w:tcW w:type="dxa" w:w="1495"/>
+          </w:tcPr>
+          <w:p>
+            <w:pPr>
+              <w:pStyle w:val="MDPI42tablebody"/>
+              <w:bidi w:val="0"/>
+            </w:pPr>
+            <w:r>
+              <w:rPr>
+                <w:highlight w:val="yellow"/>
+              </w:rPr>
+            </w:r>
+            <w:r>
+              <w:rPr>
+                <w:sz w:val="20"/>
+                <w:highlight w:val="yellow"/>
+              </w:rPr>
+              <w:t>60</w:t>
+            </w:r>
+          </w:p>
+        </w:tc>
+        <w:tc>
+          <w:tcPr>
+            <w:tcW w:type="dxa" w:w="1495"/>
+          </w:tcPr>
+          <w:p>
+            <w:pPr>
+              <w:pStyle w:val="MDPI42tablebody"/>
+              <w:bidi w:val="0"/>
+            </w:pPr>
+            <w:r>
+              <w:rPr>
+                <w:highlight w:val="yellow"/>
+              </w:rPr>
+            </w:r>
+            <w:r>
+              <w:rPr>
+                <w:sz w:val="20"/>
+                <w:highlight w:val="yellow"/>
+              </w:rPr>
+              <w:t>0.0</w:t>
+            </w:r>
+          </w:p>
+        </w:tc>
+        <w:tc>
+          <w:tcPr>
+            <w:tcW w:type="dxa" w:w="1495"/>
+          </w:tcPr>
+          <w:p>
+            <w:pPr>
+              <w:pStyle w:val="MDPI42tablebody"/>
+              <w:bidi w:val="0"/>
+            </w:pPr>
+            <w:r>
+              <w:rPr>
+                <w:highlight w:val="yellow"/>
+              </w:rPr>
+            </w:r>
+            <w:r>
+              <w:rPr>
+                <w:sz w:val="20"/>
+                <w:highlight w:val="yellow"/>
+              </w:rPr>
+              <w:t>54.0</w:t>
+            </w:r>
+          </w:p>
+        </w:tc>
+        <w:tc>
+          <w:tcPr>
+            <w:tcW w:type="dxa" w:w="1495"/>
+          </w:tcPr>
+          <w:p>
+            <w:pPr>
+              <w:pStyle w:val="MDPI42tablebody"/>
+              <w:bidi w:val="0"/>
+            </w:pPr>
+            <w:r>
+              <w:rPr>
+                <w:highlight w:val="yellow"/>
+              </w:rPr>
+            </w:r>
+            <w:r>
+              <w:rPr>
+                <w:sz w:val="20"/>
+                <w:highlight w:val="yellow"/>
+              </w:rPr>
+              <w:t>436.2</w:t>
+            </w:r>
+          </w:p>
+        </w:tc>
+        <w:tc>
+          <w:tcPr>
+            <w:tcW w:type="dxa" w:w="1495"/>
+          </w:tcPr>
+          <w:p>
+            <w:pPr>
+              <w:pStyle w:val="MDPI42tablebody"/>
+              <w:bidi w:val="0"/>
+            </w:pPr>
+            <w:r>
+              <w:rPr>
+                <w:highlight w:val="yellow"/>
+              </w:rPr>
+            </w:r>
+            <w:r>
+              <w:rPr>
+                <w:sz w:val="20"/>
+                <w:highlight w:val="yellow"/>
+              </w:rPr>
+              <w:t>11.23</w:t>
+            </w:r>
+          </w:p>
+        </w:tc>
+      </w:tr>
+      <w:tr>
+        <w:tc>
+          <w:tcPr>
+            <w:tcW w:type="dxa" w:w="1495"/>
+          </w:tcPr>
+          <w:p>
+            <w:pPr>
+              <w:pStyle w:val="MDPI42tablebody"/>
+              <w:bidi w:val="0"/>
+            </w:pPr>
+            <w:r>
+              <w:rPr>
+                <w:highlight w:val="yellow"/>
+              </w:rPr>
+            </w:r>
+            <w:r>
+              <w:rPr>
+                <w:sz w:val="20"/>
+                <w:highlight w:val="yellow"/>
+              </w:rPr>
+              <w:t>raw</w:t>
+            </w:r>
+          </w:p>
+        </w:tc>
+        <w:tc>
+          <w:tcPr>
+            <w:tcW w:type="dxa" w:w="1495"/>
+          </w:tcPr>
+          <w:p>
+            <w:pPr>
+              <w:pStyle w:val="MDPI42tablebody"/>
+              <w:bidi w:val="0"/>
+            </w:pPr>
+            <w:r>
+              <w:rPr>
+                <w:highlight w:val="yellow"/>
+              </w:rPr>
+            </w:r>
+            <w:r>
+              <w:rPr>
+                <w:sz w:val="20"/>
+                <w:highlight w:val="yellow"/>
+              </w:rPr>
+              <w:t>10</w:t>
+            </w:r>
+          </w:p>
+        </w:tc>
+        <w:tc>
+          <w:tcPr>
+            <w:tcW w:type="dxa" w:w="1495"/>
+          </w:tcPr>
+          <w:p>
+            <w:pPr>
+              <w:pStyle w:val="MDPI42tablebody"/>
+              <w:bidi w:val="0"/>
+            </w:pPr>
+            <w:r>
+              <w:rPr>
+                <w:highlight w:val="yellow"/>
+              </w:rPr>
+            </w:r>
+            <w:r>
+              <w:rPr>
+                <w:sz w:val="20"/>
+                <w:highlight w:val="yellow"/>
+              </w:rPr>
+              <w:t>60</w:t>
+            </w:r>
+          </w:p>
+        </w:tc>
+        <w:tc>
+          <w:tcPr>
+            <w:tcW w:type="dxa" w:w="1495"/>
+          </w:tcPr>
+          <w:p>
+            <w:pPr>
+              <w:pStyle w:val="MDPI42tablebody"/>
+              <w:bidi w:val="0"/>
+            </w:pPr>
+            <w:r>
+              <w:rPr>
+                <w:highlight w:val="yellow"/>
+              </w:rPr>
+            </w:r>
+            <w:r>
+              <w:rPr>
+                <w:sz w:val="20"/>
+                <w:highlight w:val="yellow"/>
+              </w:rPr>
+              <w:t>0.0</w:t>
+            </w:r>
+          </w:p>
+        </w:tc>
+        <w:tc>
+          <w:tcPr>
+            <w:tcW w:type="dxa" w:w="1495"/>
+          </w:tcPr>
+          <w:p>
+            <w:pPr>
+              <w:pStyle w:val="MDPI42tablebody"/>
+              <w:bidi w:val="0"/>
+            </w:pPr>
+            <w:r>
+              <w:rPr>
+                <w:highlight w:val="yellow"/>
+              </w:rPr>
+            </w:r>
+            <w:r>
+              <w:rPr>
+                <w:sz w:val="20"/>
+                <w:highlight w:val="yellow"/>
+              </w:rPr>
+              <w:t>64.8</w:t>
+            </w:r>
+          </w:p>
+        </w:tc>
+        <w:tc>
+          <w:tcPr>
+            <w:tcW w:type="dxa" w:w="1495"/>
+          </w:tcPr>
+          <w:p>
+            <w:pPr>
+              <w:pStyle w:val="MDPI42tablebody"/>
+              <w:bidi w:val="0"/>
+            </w:pPr>
+            <w:r>
+              <w:rPr>
+                <w:highlight w:val="yellow"/>
+              </w:rPr>
+            </w:r>
+            <w:r>
+              <w:rPr>
+                <w:sz w:val="20"/>
+                <w:highlight w:val="yellow"/>
+              </w:rPr>
+              <w:t>399.6</w:t>
+            </w:r>
+          </w:p>
+        </w:tc>
+        <w:tc>
+          <w:tcPr>
+            <w:tcW w:type="dxa" w:w="1495"/>
+          </w:tcPr>
+          <w:p>
+            <w:pPr>
+              <w:pStyle w:val="MDPI42tablebody"/>
+              <w:bidi w:val="0"/>
+            </w:pPr>
+            <w:r>
+              <w:rPr>
+                <w:highlight w:val="yellow"/>
+              </w:rPr>
+            </w:r>
+            <w:r>
+              <w:rPr>
+                <w:sz w:val="20"/>
+                <w:highlight w:val="yellow"/>
+              </w:rPr>
+              <w:t>22.85</w:t>
+            </w:r>
+          </w:p>
+        </w:tc>
+      </w:tr>
+      <w:tr>
+        <w:tc>
+          <w:tcPr>
+            <w:tcW w:type="dxa" w:w="1495"/>
+          </w:tcPr>
+          <w:p>
+            <w:pPr>
+              <w:pStyle w:val="MDPI42tablebody"/>
+              <w:bidi w:val="0"/>
+            </w:pPr>
+            <w:r>
+              <w:rPr>
+                <w:highlight w:val="yellow"/>
+              </w:rPr>
+            </w:r>
+            <w:r>
+              <w:rPr>
+                <w:sz w:val="20"/>
+                <w:highlight w:val="yellow"/>
+              </w:rPr>
+              <w:t>raw</w:t>
+            </w:r>
+          </w:p>
+        </w:tc>
+        <w:tc>
+          <w:tcPr>
+            <w:tcW w:type="dxa" w:w="1495"/>
+          </w:tcPr>
+          <w:p>
+            <w:pPr>
+              <w:pStyle w:val="MDPI42tablebody"/>
+              <w:bidi w:val="0"/>
+            </w:pPr>
+            <w:r>
+              <w:rPr>
+                <w:highlight w:val="yellow"/>
+              </w:rPr>
+            </w:r>
+            <w:r>
+              <w:rPr>
+                <w:sz w:val="20"/>
+                <w:highlight w:val="yellow"/>
+              </w:rPr>
+              <w:t>20</w:t>
+            </w:r>
+          </w:p>
+        </w:tc>
+        <w:tc>
+          <w:tcPr>
+            <w:tcW w:type="dxa" w:w="1495"/>
+          </w:tcPr>
+          <w:p>
+            <w:pPr>
+              <w:pStyle w:val="MDPI42tablebody"/>
+              <w:bidi w:val="0"/>
+            </w:pPr>
+            <w:r>
+              <w:rPr>
+                <w:highlight w:val="yellow"/>
+              </w:rPr>
+            </w:r>
+            <w:r>
+              <w:rPr>
+                <w:sz w:val="20"/>
+                <w:highlight w:val="yellow"/>
+              </w:rPr>
+              <w:t>60</w:t>
+            </w:r>
+          </w:p>
+        </w:tc>
+        <w:tc>
+          <w:tcPr>
+            <w:tcW w:type="dxa" w:w="1495"/>
+          </w:tcPr>
+          <w:p>
+            <w:pPr>
+              <w:pStyle w:val="MDPI42tablebody"/>
+              <w:bidi w:val="0"/>
+            </w:pPr>
+            <w:r>
+              <w:rPr>
+                <w:highlight w:val="yellow"/>
+              </w:rPr>
+            </w:r>
+            <w:r>
+              <w:rPr>
+                <w:sz w:val="20"/>
+                <w:highlight w:val="yellow"/>
+              </w:rPr>
+              <w:t>0.0</w:t>
+            </w:r>
+          </w:p>
+        </w:tc>
+        <w:tc>
+          <w:tcPr>
+            <w:tcW w:type="dxa" w:w="1495"/>
+          </w:tcPr>
+          <w:p>
+            <w:pPr>
+              <w:pStyle w:val="MDPI42tablebody"/>
+              <w:bidi w:val="0"/>
+            </w:pPr>
+            <w:r>
+              <w:rPr>
+                <w:highlight w:val="yellow"/>
+              </w:rPr>
+            </w:r>
+            <w:r>
+              <w:rPr>
+                <w:sz w:val="20"/>
+                <w:highlight w:val="yellow"/>
+              </w:rPr>
+              <w:t>102.6</w:t>
+            </w:r>
+          </w:p>
+        </w:tc>
+        <w:tc>
+          <w:tcPr>
+            <w:tcW w:type="dxa" w:w="1495"/>
+          </w:tcPr>
+          <w:p>
+            <w:pPr>
+              <w:pStyle w:val="MDPI42tablebody"/>
+              <w:bidi w:val="0"/>
+            </w:pPr>
+            <w:r>
+              <w:rPr>
+                <w:highlight w:val="yellow"/>
+              </w:rPr>
+            </w:r>
+            <w:r>
+              <w:rPr>
+                <w:sz w:val="20"/>
+                <w:highlight w:val="yellow"/>
+              </w:rPr>
+              <w:t>516.2</w:t>
+            </w:r>
+          </w:p>
+        </w:tc>
+        <w:tc>
+          <w:tcPr>
+            <w:tcW w:type="dxa" w:w="1495"/>
+          </w:tcPr>
+          <w:p>
+            <w:pPr>
+              <w:pStyle w:val="MDPI42tablebody"/>
+              <w:bidi w:val="0"/>
+            </w:pPr>
+            <w:r>
+              <w:rPr>
+                <w:highlight w:val="yellow"/>
+              </w:rPr>
+            </w:r>
+            <w:r>
+              <w:rPr>
+                <w:sz w:val="20"/>
+                <w:highlight w:val="yellow"/>
+              </w:rPr>
+              <w:t>35.20</w:t>
+            </w:r>
+          </w:p>
+        </w:tc>
+      </w:tr>
+      <w:tr>
+        <w:tc>
+          <w:tcPr>
+            <w:tcW w:type="dxa" w:w="1495"/>
+          </w:tcPr>
+          <w:p>
+            <w:pPr>
+              <w:pStyle w:val="MDPI42tablebody"/>
+              <w:bidi w:val="0"/>
+            </w:pPr>
+            <w:r>
+              <w:rPr>
+                <w:highlight w:val="yellow"/>
+              </w:rPr>
+            </w:r>
+            <w:r>
+              <w:rPr>
+                <w:sz w:val="20"/>
+                <w:highlight w:val="yellow"/>
+              </w:rPr>
+              <w:t>LSPM</w:t>
+            </w:r>
+          </w:p>
+        </w:tc>
+        <w:tc>
+          <w:tcPr>
+            <w:tcW w:type="dxa" w:w="1495"/>
+          </w:tcPr>
+          <w:p>
+            <w:pPr>
+              <w:pStyle w:val="MDPI42tablebody"/>
+              <w:bidi w:val="0"/>
+            </w:pPr>
+            <w:r>
+              <w:rPr>
+                <w:highlight w:val="yellow"/>
+              </w:rPr>
+            </w:r>
+            <w:r>
+              <w:rPr>
+                <w:sz w:val="20"/>
+                <w:highlight w:val="yellow"/>
+              </w:rPr>
+              <w:t>1</w:t>
+            </w:r>
+          </w:p>
+        </w:tc>
+        <w:tc>
+          <w:tcPr>
+            <w:tcW w:type="dxa" w:w="1495"/>
+          </w:tcPr>
+          <w:p>
+            <w:pPr>
+              <w:pStyle w:val="MDPI42tablebody"/>
+              <w:bidi w:val="0"/>
+            </w:pPr>
+            <w:r>
+              <w:rPr>
+                <w:highlight w:val="yellow"/>
+              </w:rPr>
+            </w:r>
+            <w:r>
+              <w:rPr>
+                <w:sz w:val="20"/>
+                <w:highlight w:val="yellow"/>
+              </w:rPr>
+              <w:t>60</w:t>
+            </w:r>
+          </w:p>
+        </w:tc>
+        <w:tc>
+          <w:tcPr>
+            <w:tcW w:type="dxa" w:w="1495"/>
+          </w:tcPr>
+          <w:p>
+            <w:pPr>
+              <w:pStyle w:val="MDPI42tablebody"/>
+              <w:bidi w:val="0"/>
+            </w:pPr>
+            <w:r>
+              <w:rPr>
+                <w:highlight w:val="yellow"/>
+              </w:rPr>
+            </w:r>
+            <w:r>
+              <w:rPr>
+                <w:sz w:val="20"/>
+                <w:highlight w:val="yellow"/>
+              </w:rPr>
+              <w:t>33.3</w:t>
+            </w:r>
+          </w:p>
+        </w:tc>
+        <w:tc>
+          <w:tcPr>
+            <w:tcW w:type="dxa" w:w="1495"/>
+          </w:tcPr>
+          <w:p>
+            <w:pPr>
+              <w:pStyle w:val="MDPI42tablebody"/>
+              <w:bidi w:val="0"/>
+            </w:pPr>
+            <w:r>
+              <w:rPr>
+                <w:highlight w:val="yellow"/>
+              </w:rPr>
+            </w:r>
+            <w:r>
+              <w:rPr>
+                <w:sz w:val="20"/>
+                <w:highlight w:val="yellow"/>
+              </w:rPr>
+              <w:t>65.7</w:t>
+            </w:r>
+          </w:p>
+        </w:tc>
+        <w:tc>
+          <w:tcPr>
+            <w:tcW w:type="dxa" w:w="1495"/>
+          </w:tcPr>
+          <w:p>
+            <w:pPr>
+              <w:pStyle w:val="MDPI42tablebody"/>
+              <w:bidi w:val="0"/>
+            </w:pPr>
+            <w:r>
+              <w:rPr>
+                <w:highlight w:val="yellow"/>
+              </w:rPr>
+            </w:r>
+            <w:r>
+              <w:rPr>
+                <w:sz w:val="20"/>
+                <w:highlight w:val="yellow"/>
+              </w:rPr>
+              <w:t>409.1</w:t>
+            </w:r>
+          </w:p>
+        </w:tc>
+        <w:tc>
+          <w:tcPr>
+            <w:tcW w:type="dxa" w:w="1495"/>
+          </w:tcPr>
+          <w:p>
+            <w:pPr>
+              <w:pStyle w:val="MDPI42tablebody"/>
+              <w:bidi w:val="0"/>
+            </w:pPr>
+            <w:r>
+              <w:rPr>
+                <w:highlight w:val="yellow"/>
+              </w:rPr>
+            </w:r>
+            <w:r>
+              <w:rPr>
+                <w:sz w:val="20"/>
+                <w:highlight w:val="yellow"/>
+              </w:rPr>
+              <w:t>2.44</w:t>
+            </w:r>
+          </w:p>
+        </w:tc>
+      </w:tr>
+      <w:tr>
+        <w:tc>
+          <w:tcPr>
+            <w:tcW w:type="dxa" w:w="1495"/>
+          </w:tcPr>
+          <w:p>
+            <w:pPr>
+              <w:pStyle w:val="MDPI42tablebody"/>
+              <w:bidi w:val="0"/>
+            </w:pPr>
+            <w:r>
+              <w:rPr>
+                <w:highlight w:val="yellow"/>
+              </w:rPr>
+            </w:r>
+            <w:r>
+              <w:rPr>
+                <w:sz w:val="20"/>
+                <w:highlight w:val="yellow"/>
+              </w:rPr>
+              <w:t>LSPM</w:t>
+            </w:r>
+          </w:p>
+        </w:tc>
+        <w:tc>
+          <w:tcPr>
+            <w:tcW w:type="dxa" w:w="1495"/>
+          </w:tcPr>
+          <w:p>
+            <w:pPr>
+              <w:pStyle w:val="MDPI42tablebody"/>
+              <w:bidi w:val="0"/>
+            </w:pPr>
+            <w:r>
+              <w:rPr>
+                <w:highlight w:val="yellow"/>
+              </w:rPr>
+            </w:r>
+            <w:r>
+              <w:rPr>
+                <w:sz w:val="20"/>
+                <w:highlight w:val="yellow"/>
+              </w:rPr>
+              <w:t>5</w:t>
+            </w:r>
+          </w:p>
+        </w:tc>
+        <w:tc>
+          <w:tcPr>
+            <w:tcW w:type="dxa" w:w="1495"/>
+          </w:tcPr>
+          <w:p>
+            <w:pPr>
+              <w:pStyle w:val="MDPI42tablebody"/>
+              <w:bidi w:val="0"/>
+            </w:pPr>
+            <w:r>
+              <w:rPr>
+                <w:highlight w:val="yellow"/>
+              </w:rPr>
+            </w:r>
+            <w:r>
+              <w:rPr>
+                <w:sz w:val="20"/>
+                <w:highlight w:val="yellow"/>
+              </w:rPr>
+              <w:t>60</w:t>
+            </w:r>
+          </w:p>
+        </w:tc>
+        <w:tc>
+          <w:tcPr>
+            <w:tcW w:type="dxa" w:w="1495"/>
+          </w:tcPr>
+          <w:p>
+            <w:pPr>
+              <w:pStyle w:val="MDPI42tablebody"/>
+              <w:bidi w:val="0"/>
+            </w:pPr>
+            <w:r>
+              <w:rPr>
+                <w:highlight w:val="yellow"/>
+              </w:rPr>
+            </w:r>
+            <w:r>
+              <w:rPr>
+                <w:sz w:val="20"/>
+                <w:highlight w:val="yellow"/>
+              </w:rPr>
+              <w:t>69.9</w:t>
+            </w:r>
+          </w:p>
+        </w:tc>
+        <w:tc>
+          <w:tcPr>
+            <w:tcW w:type="dxa" w:w="1495"/>
+          </w:tcPr>
+          <w:p>
+            <w:pPr>
+              <w:pStyle w:val="MDPI42tablebody"/>
+              <w:bidi w:val="0"/>
+            </w:pPr>
+            <w:r>
+              <w:rPr>
+                <w:highlight w:val="yellow"/>
+              </w:rPr>
+            </w:r>
+            <w:r>
+              <w:rPr>
+                <w:sz w:val="20"/>
+                <w:highlight w:val="yellow"/>
+              </w:rPr>
+              <w:t>125.1</w:t>
+            </w:r>
+          </w:p>
+        </w:tc>
+        <w:tc>
+          <w:tcPr>
+            <w:tcW w:type="dxa" w:w="1495"/>
+          </w:tcPr>
+          <w:p>
+            <w:pPr>
+              <w:pStyle w:val="MDPI42tablebody"/>
+              <w:bidi w:val="0"/>
+            </w:pPr>
+            <w:r>
+              <w:rPr>
+                <w:highlight w:val="yellow"/>
+              </w:rPr>
+            </w:r>
+            <w:r>
+              <w:rPr>
+                <w:sz w:val="20"/>
+                <w:highlight w:val="yellow"/>
+              </w:rPr>
+              <w:t>534.6</w:t>
+            </w:r>
+          </w:p>
+        </w:tc>
+        <w:tc>
+          <w:tcPr>
+            <w:tcW w:type="dxa" w:w="1495"/>
+          </w:tcPr>
+          <w:p>
+            <w:pPr>
+              <w:pStyle w:val="MDPI42tablebody"/>
+              <w:bidi w:val="0"/>
+            </w:pPr>
+            <w:r>
+              <w:rPr>
+                <w:highlight w:val="yellow"/>
+              </w:rPr>
+            </w:r>
+            <w:r>
+              <w:rPr>
+                <w:sz w:val="20"/>
+                <w:highlight w:val="yellow"/>
+              </w:rPr>
+              <w:t>8.89</w:t>
+            </w:r>
+          </w:p>
+        </w:tc>
+      </w:tr>
+      <w:tr>
+        <w:tc>
+          <w:tcPr>
+            <w:tcW w:type="dxa" w:w="1495"/>
+          </w:tcPr>
+          <w:p>
+            <w:pPr>
+              <w:pStyle w:val="MDPI42tablebody"/>
+              <w:bidi w:val="0"/>
+            </w:pPr>
+            <w:r>
+              <w:rPr>
+                <w:highlight w:val="yellow"/>
+              </w:rPr>
+            </w:r>
+            <w:r>
+              <w:rPr>
+                <w:sz w:val="20"/>
+                <w:highlight w:val="yellow"/>
+              </w:rPr>
+              <w:t>LSPM</w:t>
+            </w:r>
+          </w:p>
+        </w:tc>
+        <w:tc>
+          <w:tcPr>
+            <w:tcW w:type="dxa" w:w="1495"/>
+          </w:tcPr>
+          <w:p>
+            <w:pPr>
+              <w:pStyle w:val="MDPI42tablebody"/>
+              <w:bidi w:val="0"/>
+            </w:pPr>
+            <w:r>
+              <w:rPr>
+                <w:highlight w:val="yellow"/>
+              </w:rPr>
+            </w:r>
+            <w:r>
+              <w:rPr>
+                <w:sz w:val="20"/>
+                <w:highlight w:val="yellow"/>
+              </w:rPr>
+              <w:t>10</w:t>
+            </w:r>
+          </w:p>
+        </w:tc>
+        <w:tc>
+          <w:tcPr>
+            <w:tcW w:type="dxa" w:w="1495"/>
+          </w:tcPr>
+          <w:p>
+            <w:pPr>
+              <w:pStyle w:val="MDPI42tablebody"/>
+              <w:bidi w:val="0"/>
+            </w:pPr>
+            <w:r>
+              <w:rPr>
+                <w:highlight w:val="yellow"/>
+              </w:rPr>
+            </w:r>
+            <w:r>
+              <w:rPr>
+                <w:sz w:val="20"/>
+                <w:highlight w:val="yellow"/>
+              </w:rPr>
+              <w:t>54</w:t>
+            </w:r>
+          </w:p>
+        </w:tc>
+        <w:tc>
+          <w:tcPr>
+            <w:tcW w:type="dxa" w:w="1495"/>
+          </w:tcPr>
+          <w:p>
+            <w:pPr>
+              <w:pStyle w:val="MDPI42tablebody"/>
+              <w:bidi w:val="0"/>
+            </w:pPr>
+            <w:r>
+              <w:rPr>
+                <w:highlight w:val="yellow"/>
+              </w:rPr>
+            </w:r>
+            <w:r>
+              <w:rPr>
+                <w:sz w:val="20"/>
+                <w:highlight w:val="yellow"/>
+              </w:rPr>
+              <w:t>191.3</w:t>
+            </w:r>
+          </w:p>
+        </w:tc>
+        <w:tc>
+          <w:tcPr>
+            <w:tcW w:type="dxa" w:w="1495"/>
+          </w:tcPr>
+          <w:p>
+            <w:pPr>
+              <w:pStyle w:val="MDPI42tablebody"/>
+              <w:bidi w:val="0"/>
+            </w:pPr>
+            <w:r>
+              <w:rPr>
+                <w:highlight w:val="yellow"/>
+              </w:rPr>
+            </w:r>
+            <w:r>
+              <w:rPr>
+                <w:sz w:val="20"/>
+                <w:highlight w:val="yellow"/>
+              </w:rPr>
+              <w:t>248.5</w:t>
+            </w:r>
+          </w:p>
+        </w:tc>
+        <w:tc>
+          <w:tcPr>
+            <w:tcW w:type="dxa" w:w="1495"/>
+          </w:tcPr>
+          <w:p>
+            <w:pPr>
+              <w:pStyle w:val="MDPI42tablebody"/>
+              <w:bidi w:val="0"/>
+            </w:pPr>
+            <w:r>
+              <w:rPr>
+                <w:highlight w:val="yellow"/>
+              </w:rPr>
+            </w:r>
+            <w:r>
+              <w:rPr>
+                <w:sz w:val="20"/>
+                <w:highlight w:val="yellow"/>
+              </w:rPr>
+              <w:t>612.8</w:t>
+            </w:r>
+          </w:p>
+        </w:tc>
+        <w:tc>
+          <w:tcPr>
+            <w:tcW w:type="dxa" w:w="1495"/>
+          </w:tcPr>
+          <w:p>
+            <w:pPr>
+              <w:pStyle w:val="MDPI42tablebody"/>
+              <w:bidi w:val="0"/>
+            </w:pPr>
+            <w:r>
+              <w:rPr>
+                <w:highlight w:val="yellow"/>
+              </w:rPr>
+            </w:r>
+            <w:r>
+              <w:rPr>
+                <w:sz w:val="20"/>
+                <w:highlight w:val="yellow"/>
+              </w:rPr>
+              <w:t>13.53</w:t>
+            </w:r>
+          </w:p>
+        </w:tc>
+      </w:tr>
+      <w:tr>
+        <w:tc>
+          <w:tcPr>
+            <w:tcW w:type="dxa" w:w="1495"/>
+          </w:tcPr>
+          <w:p>
+            <w:pPr>
+              <w:pStyle w:val="MDPI42tablebody"/>
+              <w:bidi w:val="0"/>
+            </w:pPr>
+            <w:r>
+              <w:rPr>
+                <w:highlight w:val="yellow"/>
+              </w:rPr>
+            </w:r>
+            <w:r>
+              <w:rPr>
+                <w:sz w:val="20"/>
+                <w:highlight w:val="yellow"/>
+              </w:rPr>
+              <w:t>LSPM</w:t>
+            </w:r>
+          </w:p>
+        </w:tc>
+        <w:tc>
+          <w:tcPr>
+            <w:tcW w:type="dxa" w:w="1495"/>
+          </w:tcPr>
+          <w:p>
+            <w:pPr>
+              <w:pStyle w:val="MDPI42tablebody"/>
+              <w:bidi w:val="0"/>
+            </w:pPr>
+            <w:r>
+              <w:rPr>
+                <w:highlight w:val="yellow"/>
+              </w:rPr>
+            </w:r>
+            <w:r>
+              <w:rPr>
+                <w:sz w:val="20"/>
+                <w:highlight w:val="yellow"/>
+              </w:rPr>
+              <w:t>20</w:t>
+            </w:r>
+          </w:p>
+        </w:tc>
+        <w:tc>
+          <w:tcPr>
+            <w:tcW w:type="dxa" w:w="1495"/>
+          </w:tcPr>
+          <w:p>
+            <w:pPr>
+              <w:pStyle w:val="MDPI42tablebody"/>
+              <w:bidi w:val="0"/>
+            </w:pPr>
+            <w:r>
+              <w:rPr>
+                <w:highlight w:val="yellow"/>
+              </w:rPr>
+            </w:r>
+            <w:r>
+              <w:rPr>
+                <w:sz w:val="20"/>
+                <w:highlight w:val="yellow"/>
+              </w:rPr>
+              <w:t>27</w:t>
+            </w:r>
+          </w:p>
+        </w:tc>
+        <w:tc>
+          <w:tcPr>
+            <w:tcW w:type="dxa" w:w="1495"/>
+          </w:tcPr>
+          <w:p>
+            <w:pPr>
+              <w:pStyle w:val="MDPI42tablebody"/>
+              <w:bidi w:val="0"/>
+            </w:pPr>
+            <w:r>
+              <w:rPr>
+                <w:highlight w:val="yellow"/>
+              </w:rPr>
+            </w:r>
+            <w:r>
+              <w:rPr>
+                <w:sz w:val="20"/>
+                <w:highlight w:val="yellow"/>
+              </w:rPr>
+              <w:t>375.4</w:t>
+            </w:r>
+          </w:p>
+        </w:tc>
+        <w:tc>
+          <w:tcPr>
+            <w:tcW w:type="dxa" w:w="1495"/>
+          </w:tcPr>
+          <w:p>
+            <w:pPr>
+              <w:pStyle w:val="MDPI42tablebody"/>
+              <w:bidi w:val="0"/>
+            </w:pPr>
+            <w:r>
+              <w:rPr>
+                <w:highlight w:val="yellow"/>
+              </w:rPr>
+            </w:r>
+            <w:r>
+              <w:rPr>
+                <w:sz w:val="20"/>
+                <w:highlight w:val="yellow"/>
+              </w:rPr>
+              <w:t>433.5</w:t>
+            </w:r>
+          </w:p>
+        </w:tc>
+        <w:tc>
+          <w:tcPr>
+            <w:tcW w:type="dxa" w:w="1495"/>
+          </w:tcPr>
+          <w:p>
+            <w:pPr>
+              <w:pStyle w:val="MDPI42tablebody"/>
+              <w:bidi w:val="0"/>
+            </w:pPr>
+            <w:r>
+              <w:rPr>
+                <w:highlight w:val="yellow"/>
+              </w:rPr>
+            </w:r>
+            <w:r>
+              <w:rPr>
+                <w:sz w:val="20"/>
+                <w:highlight w:val="yellow"/>
+              </w:rPr>
+              <w:t>838.3</w:t>
+            </w:r>
+          </w:p>
+        </w:tc>
+        <w:tc>
+          <w:tcPr>
+            <w:tcW w:type="dxa" w:w="1495"/>
+          </w:tcPr>
+          <w:p>
+            <w:pPr>
+              <w:pStyle w:val="MDPI42tablebody"/>
+              <w:bidi w:val="0"/>
+            </w:pPr>
+            <w:r>
+              <w:rPr>
+                <w:highlight w:val="yellow"/>
+              </w:rPr>
+            </w:r>
+            <w:r>
+              <w:rPr>
+                <w:sz w:val="20"/>
+                <w:highlight w:val="yellow"/>
+              </w:rPr>
+              <w:t>10.15</w:t>
+            </w:r>
+          </w:p>
+        </w:tc>
+      </w:tr>
+      <w:tr>
+        <w:tc>
+          <w:tcPr>
+            <w:tcW w:type="dxa" w:w="1495"/>
+          </w:tcPr>
+          <w:p>
+            <w:pPr>
+              <w:pStyle w:val="MDPI42tablebody"/>
+              <w:bidi w:val="0"/>
+            </w:pPr>
+            <w:r>
+              <w:rPr>
+                <w:highlight w:val="yellow"/>
+              </w:rPr>
+            </w:r>
+            <w:r>
+              <w:rPr>
+                <w:sz w:val="20"/>
+                <w:highlight w:val="yellow"/>
+              </w:rPr>
+              <w:t>naive</w:t>
+            </w:r>
+          </w:p>
+        </w:tc>
+        <w:tc>
+          <w:tcPr>
+            <w:tcW w:type="dxa" w:w="1495"/>
+          </w:tcPr>
+          <w:p>
+            <w:pPr>
+              <w:pStyle w:val="MDPI42tablebody"/>
+              <w:bidi w:val="0"/>
+            </w:pPr>
+            <w:r>
+              <w:rPr>
+                <w:highlight w:val="yellow"/>
+              </w:rPr>
+            </w:r>
+            <w:r>
+              <w:rPr>
+                <w:sz w:val="20"/>
+                <w:highlight w:val="yellow"/>
+              </w:rPr>
+              <w:t>1</w:t>
+            </w:r>
+          </w:p>
+        </w:tc>
+        <w:tc>
+          <w:tcPr>
+            <w:tcW w:type="dxa" w:w="1495"/>
+          </w:tcPr>
+          <w:p>
+            <w:pPr>
+              <w:pStyle w:val="MDPI42tablebody"/>
+              <w:bidi w:val="0"/>
+            </w:pPr>
+            <w:r>
+              <w:rPr>
+                <w:highlight w:val="yellow"/>
+              </w:rPr>
+            </w:r>
+            <w:r>
+              <w:rPr>
+                <w:sz w:val="20"/>
+                <w:highlight w:val="yellow"/>
+              </w:rPr>
+              <w:t>60</w:t>
+            </w:r>
+          </w:p>
+        </w:tc>
+        <w:tc>
+          <w:tcPr>
+            <w:tcW w:type="dxa" w:w="1495"/>
+          </w:tcPr>
+          <w:p>
+            <w:pPr>
+              <w:pStyle w:val="MDPI42tablebody"/>
+              <w:bidi w:val="0"/>
+            </w:pPr>
+            <w:r>
+              <w:rPr>
+                <w:highlight w:val="yellow"/>
+              </w:rPr>
+            </w:r>
+            <w:r>
+              <w:rPr>
+                <w:sz w:val="20"/>
+                <w:highlight w:val="yellow"/>
+              </w:rPr>
+              <w:t>0.2</w:t>
+            </w:r>
+          </w:p>
+        </w:tc>
+        <w:tc>
+          <w:tcPr>
+            <w:tcW w:type="dxa" w:w="1495"/>
+          </w:tcPr>
+          <w:p>
+            <w:pPr>
+              <w:pStyle w:val="MDPI42tablebody"/>
+              <w:bidi w:val="0"/>
+            </w:pPr>
+            <w:r>
+              <w:rPr>
+                <w:highlight w:val="yellow"/>
+              </w:rPr>
+            </w:r>
+            <w:r>
+              <w:rPr>
+                <w:sz w:val="20"/>
+                <w:highlight w:val="yellow"/>
+              </w:rPr>
+              <w:t>37.8</w:t>
+            </w:r>
+          </w:p>
+        </w:tc>
+        <w:tc>
+          <w:tcPr>
+            <w:tcW w:type="dxa" w:w="1495"/>
+          </w:tcPr>
+          <w:p>
+            <w:pPr>
+              <w:pStyle w:val="MDPI42tablebody"/>
+              <w:bidi w:val="0"/>
+            </w:pPr>
+            <w:r>
+              <w:rPr>
+                <w:highlight w:val="yellow"/>
+              </w:rPr>
+            </w:r>
+            <w:r>
+              <w:rPr>
+                <w:sz w:val="20"/>
+                <w:highlight w:val="yellow"/>
+              </w:rPr>
+              <w:t>278.3</w:t>
+            </w:r>
+          </w:p>
+        </w:tc>
+        <w:tc>
+          <w:tcPr>
+            <w:tcW w:type="dxa" w:w="1495"/>
+          </w:tcPr>
+          <w:p>
+            <w:pPr>
+              <w:pStyle w:val="MDPI42tablebody"/>
+              <w:bidi w:val="0"/>
+            </w:pPr>
+            <w:r>
+              <w:rPr>
+                <w:highlight w:val="yellow"/>
+              </w:rPr>
+            </w:r>
+            <w:r>
+              <w:rPr>
+                <w:sz w:val="20"/>
+                <w:highlight w:val="yellow"/>
+              </w:rPr>
+              <w:t>3.59</w:t>
+            </w:r>
+          </w:p>
+        </w:tc>
+      </w:tr>
+      <w:tr>
+        <w:tc>
+          <w:tcPr>
+            <w:tcW w:type="dxa" w:w="1495"/>
+          </w:tcPr>
+          <w:p>
+            <w:pPr>
+              <w:pStyle w:val="MDPI42tablebody"/>
+              <w:bidi w:val="0"/>
+            </w:pPr>
+            <w:r>
+              <w:rPr>
+                <w:highlight w:val="yellow"/>
+              </w:rPr>
+            </w:r>
+            <w:r>
+              <w:rPr>
+                <w:sz w:val="20"/>
+                <w:highlight w:val="yellow"/>
+              </w:rPr>
+              <w:t>naive</w:t>
+            </w:r>
+          </w:p>
+        </w:tc>
+        <w:tc>
+          <w:tcPr>
+            <w:tcW w:type="dxa" w:w="1495"/>
+          </w:tcPr>
+          <w:p>
+            <w:pPr>
+              <w:pStyle w:val="MDPI42tablebody"/>
+              <w:bidi w:val="0"/>
+            </w:pPr>
+            <w:r>
+              <w:rPr>
+                <w:highlight w:val="yellow"/>
+              </w:rPr>
+            </w:r>
+            <w:r>
+              <w:rPr>
+                <w:sz w:val="20"/>
+                <w:highlight w:val="yellow"/>
+              </w:rPr>
+              <w:t>5</w:t>
+            </w:r>
+          </w:p>
+        </w:tc>
+        <w:tc>
+          <w:tcPr>
+            <w:tcW w:type="dxa" w:w="1495"/>
+          </w:tcPr>
+          <w:p>
+            <w:pPr>
+              <w:pStyle w:val="MDPI42tablebody"/>
+              <w:bidi w:val="0"/>
+            </w:pPr>
+            <w:r>
+              <w:rPr>
+                <w:highlight w:val="yellow"/>
+              </w:rPr>
+            </w:r>
+            <w:r>
+              <w:rPr>
+                <w:sz w:val="20"/>
+                <w:highlight w:val="yellow"/>
+              </w:rPr>
+              <w:t>60</w:t>
+            </w:r>
+          </w:p>
+        </w:tc>
+        <w:tc>
+          <w:tcPr>
+            <w:tcW w:type="dxa" w:w="1495"/>
+          </w:tcPr>
+          <w:p>
+            <w:pPr>
+              <w:pStyle w:val="MDPI42tablebody"/>
+              <w:bidi w:val="0"/>
+            </w:pPr>
+            <w:r>
+              <w:rPr>
+                <w:highlight w:val="yellow"/>
+              </w:rPr>
+            </w:r>
+            <w:r>
+              <w:rPr>
+                <w:sz w:val="20"/>
+                <w:highlight w:val="yellow"/>
+              </w:rPr>
+              <w:t>0.2</w:t>
+            </w:r>
+          </w:p>
+        </w:tc>
+        <w:tc>
+          <w:tcPr>
+            <w:tcW w:type="dxa" w:w="1495"/>
+          </w:tcPr>
+          <w:p>
+            <w:pPr>
+              <w:pStyle w:val="MDPI42tablebody"/>
+              <w:bidi w:val="0"/>
+            </w:pPr>
+            <w:r>
+              <w:rPr>
+                <w:highlight w:val="yellow"/>
+              </w:rPr>
+            </w:r>
+            <w:r>
+              <w:rPr>
+                <w:sz w:val="20"/>
+                <w:highlight w:val="yellow"/>
+              </w:rPr>
+              <w:t>53.3</w:t>
+            </w:r>
+          </w:p>
+        </w:tc>
+        <w:tc>
+          <w:tcPr>
+            <w:tcW w:type="dxa" w:w="1495"/>
+          </w:tcPr>
+          <w:p>
+            <w:pPr>
+              <w:pStyle w:val="MDPI42tablebody"/>
+              <w:bidi w:val="0"/>
+            </w:pPr>
+            <w:r>
+              <w:rPr>
+                <w:highlight w:val="yellow"/>
+              </w:rPr>
+            </w:r>
+            <w:r>
+              <w:rPr>
+                <w:sz w:val="20"/>
+                <w:highlight w:val="yellow"/>
+              </w:rPr>
+              <w:t>309.0</w:t>
+            </w:r>
+          </w:p>
+        </w:tc>
+        <w:tc>
+          <w:tcPr>
+            <w:tcW w:type="dxa" w:w="1495"/>
+          </w:tcPr>
+          <w:p>
+            <w:pPr>
+              <w:pStyle w:val="MDPI42tablebody"/>
+              <w:bidi w:val="0"/>
+            </w:pPr>
+            <w:r>
+              <w:rPr>
+                <w:highlight w:val="yellow"/>
+              </w:rPr>
+            </w:r>
+            <w:r>
+              <w:rPr>
+                <w:sz w:val="20"/>
+                <w:highlight w:val="yellow"/>
+              </w:rPr>
+              <w:t>14.69</w:t>
+            </w:r>
+          </w:p>
+        </w:tc>
+      </w:tr>
+      <w:tr>
+        <w:tc>
+          <w:tcPr>
+            <w:tcW w:type="dxa" w:w="1495"/>
+          </w:tcPr>
+          <w:p>
+            <w:pPr>
+              <w:pStyle w:val="MDPI42tablebody"/>
+              <w:bidi w:val="0"/>
+            </w:pPr>
+            <w:r>
+              <w:rPr>
+                <w:highlight w:val="yellow"/>
+              </w:rPr>
+            </w:r>
+            <w:r>
+              <w:rPr>
+                <w:sz w:val="20"/>
+                <w:highlight w:val="yellow"/>
+              </w:rPr>
+              <w:t>naive</w:t>
+            </w:r>
+          </w:p>
+        </w:tc>
+        <w:tc>
+          <w:tcPr>
+            <w:tcW w:type="dxa" w:w="1495"/>
+          </w:tcPr>
+          <w:p>
+            <w:pPr>
+              <w:pStyle w:val="MDPI42tablebody"/>
+              <w:bidi w:val="0"/>
+            </w:pPr>
+            <w:r>
+              <w:rPr>
+                <w:highlight w:val="yellow"/>
+              </w:rPr>
+            </w:r>
+            <w:r>
+              <w:rPr>
+                <w:sz w:val="20"/>
+                <w:highlight w:val="yellow"/>
+              </w:rPr>
+              <w:t>10</w:t>
+            </w:r>
+          </w:p>
+        </w:tc>
+        <w:tc>
+          <w:tcPr>
+            <w:tcW w:type="dxa" w:w="1495"/>
+          </w:tcPr>
+          <w:p>
+            <w:pPr>
+              <w:pStyle w:val="MDPI42tablebody"/>
+              <w:bidi w:val="0"/>
+            </w:pPr>
+            <w:r>
+              <w:rPr>
+                <w:highlight w:val="yellow"/>
+              </w:rPr>
+            </w:r>
+            <w:r>
+              <w:rPr>
+                <w:sz w:val="20"/>
+                <w:highlight w:val="yellow"/>
+              </w:rPr>
+              <w:t>60</w:t>
+            </w:r>
+          </w:p>
+        </w:tc>
+        <w:tc>
+          <w:tcPr>
+            <w:tcW w:type="dxa" w:w="1495"/>
+          </w:tcPr>
+          <w:p>
+            <w:pPr>
+              <w:pStyle w:val="MDPI42tablebody"/>
+              <w:bidi w:val="0"/>
+            </w:pPr>
+            <w:r>
+              <w:rPr>
+                <w:highlight w:val="yellow"/>
+              </w:rPr>
+            </w:r>
+            <w:r>
+              <w:rPr>
+                <w:sz w:val="20"/>
+                <w:highlight w:val="yellow"/>
+              </w:rPr>
+              <w:t>0.2</w:t>
+            </w:r>
+          </w:p>
+        </w:tc>
+        <w:tc>
+          <w:tcPr>
+            <w:tcW w:type="dxa" w:w="1495"/>
+          </w:tcPr>
+          <w:p>
+            <w:pPr>
+              <w:pStyle w:val="MDPI42tablebody"/>
+              <w:bidi w:val="0"/>
+            </w:pPr>
+            <w:r>
+              <w:rPr>
+                <w:highlight w:val="yellow"/>
+              </w:rPr>
+            </w:r>
+            <w:r>
+              <w:rPr>
+                <w:sz w:val="20"/>
+                <w:highlight w:val="yellow"/>
+              </w:rPr>
+              <w:t>60.3</w:t>
+            </w:r>
+          </w:p>
+        </w:tc>
+        <w:tc>
+          <w:tcPr>
+            <w:tcW w:type="dxa" w:w="1495"/>
+          </w:tcPr>
+          <w:p>
+            <w:pPr>
+              <w:pStyle w:val="MDPI42tablebody"/>
+              <w:bidi w:val="0"/>
+            </w:pPr>
+            <w:r>
+              <w:rPr>
+                <w:highlight w:val="yellow"/>
+              </w:rPr>
+            </w:r>
+            <w:r>
+              <w:rPr>
+                <w:sz w:val="20"/>
+                <w:highlight w:val="yellow"/>
+              </w:rPr>
+              <w:t>301.2</w:t>
+            </w:r>
+          </w:p>
+        </w:tc>
+        <w:tc>
+          <w:tcPr>
+            <w:tcW w:type="dxa" w:w="1495"/>
+          </w:tcPr>
+          <w:p>
+            <w:pPr>
+              <w:pStyle w:val="MDPI42tablebody"/>
+              <w:bidi w:val="0"/>
+            </w:pPr>
+            <w:r>
+              <w:rPr>
+                <w:highlight w:val="yellow"/>
+              </w:rPr>
+            </w:r>
+            <w:r>
+              <w:rPr>
+                <w:sz w:val="20"/>
+                <w:highlight w:val="yellow"/>
+              </w:rPr>
+              <w:t>28.91</w:t>
+            </w:r>
+          </w:p>
+        </w:tc>
+      </w:tr>
+      <w:tr>
+        <w:tc>
+          <w:tcPr>
+            <w:tcW w:type="dxa" w:w="1495"/>
+            <w:tcBorders>
+              <w:bottom w:val="single" w:sz="8" w:space="0" w:color="000000"/>
+            </w:tcBorders>
+          </w:tcPr>
+          <w:p>
+            <w:pPr>
+              <w:pStyle w:val="MDPI42tablebody"/>
+              <w:bidi w:val="0"/>
+            </w:pPr>
+            <w:r>
+              <w:rPr>
+                <w:highlight w:val="yellow"/>
+              </w:rPr>
+            </w:r>
+            <w:r>
+              <w:rPr>
+                <w:sz w:val="20"/>
+                <w:highlight w:val="yellow"/>
+              </w:rPr>
+              <w:t>naive</w:t>
+            </w:r>
+          </w:p>
+        </w:tc>
+        <w:tc>
+          <w:tcPr>
+            <w:tcW w:type="dxa" w:w="1495"/>
+            <w:tcBorders>
+              <w:bottom w:val="single" w:sz="8" w:space="0" w:color="000000"/>
+            </w:tcBorders>
+          </w:tcPr>
+          <w:p>
+            <w:pPr>
+              <w:pStyle w:val="MDPI42tablebody"/>
+              <w:bidi w:val="0"/>
+            </w:pPr>
+            <w:r>
+              <w:rPr>
+                <w:highlight w:val="yellow"/>
+              </w:rPr>
+            </w:r>
+            <w:r>
+              <w:rPr>
+                <w:sz w:val="20"/>
+                <w:highlight w:val="yellow"/>
+              </w:rPr>
+              <w:t>20</w:t>
+            </w:r>
+          </w:p>
+        </w:tc>
+        <w:tc>
+          <w:tcPr>
+            <w:tcW w:type="dxa" w:w="1495"/>
+            <w:tcBorders>
+              <w:bottom w:val="single" w:sz="8" w:space="0" w:color="000000"/>
+            </w:tcBorders>
+          </w:tcPr>
+          <w:p>
+            <w:pPr>
+              <w:pStyle w:val="MDPI42tablebody"/>
+              <w:bidi w:val="0"/>
+            </w:pPr>
+            <w:r>
+              <w:rPr>
+                <w:highlight w:val="yellow"/>
+              </w:rPr>
+            </w:r>
+            <w:r>
+              <w:rPr>
+                <w:sz w:val="20"/>
+                <w:highlight w:val="yellow"/>
+              </w:rPr>
+              <w:t>60</w:t>
+            </w:r>
+          </w:p>
+        </w:tc>
+        <w:tc>
+          <w:tcPr>
+            <w:tcW w:type="dxa" w:w="1495"/>
+            <w:tcBorders>
+              <w:bottom w:val="single" w:sz="8" w:space="0" w:color="000000"/>
+            </w:tcBorders>
+          </w:tcPr>
+          <w:p>
+            <w:pPr>
+              <w:pStyle w:val="MDPI42tablebody"/>
+              <w:bidi w:val="0"/>
+            </w:pPr>
+            <w:r>
+              <w:rPr>
+                <w:highlight w:val="yellow"/>
+              </w:rPr>
+            </w:r>
+            <w:r>
+              <w:rPr>
+                <w:sz w:val="20"/>
+                <w:highlight w:val="yellow"/>
+              </w:rPr>
+              <w:t>0.2</w:t>
+            </w:r>
+          </w:p>
+        </w:tc>
+        <w:tc>
+          <w:tcPr>
+            <w:tcW w:type="dxa" w:w="1495"/>
+            <w:tcBorders>
+              <w:bottom w:val="single" w:sz="8" w:space="0" w:color="000000"/>
+            </w:tcBorders>
+          </w:tcPr>
+          <w:p>
+            <w:pPr>
+              <w:pStyle w:val="MDPI42tablebody"/>
+              <w:bidi w:val="0"/>
+            </w:pPr>
+            <w:r>
+              <w:rPr>
+                <w:highlight w:val="yellow"/>
+              </w:rPr>
+            </w:r>
+            <w:r>
+              <w:rPr>
+                <w:sz w:val="20"/>
+                <w:highlight w:val="yellow"/>
+              </w:rPr>
+              <w:t>81.1</w:t>
+            </w:r>
+          </w:p>
+        </w:tc>
+        <w:tc>
+          <w:tcPr>
+            <w:tcW w:type="dxa" w:w="1495"/>
+            <w:tcBorders>
+              <w:bottom w:val="single" w:sz="8" w:space="0" w:color="000000"/>
+            </w:tcBorders>
+          </w:tcPr>
+          <w:p>
+            <w:pPr>
+              <w:pStyle w:val="MDPI42tablebody"/>
+              <w:bidi w:val="0"/>
+            </w:pPr>
+            <w:r>
+              <w:rPr>
+                <w:highlight w:val="yellow"/>
+              </w:rPr>
+            </w:r>
+            <w:r>
+              <w:rPr>
+                <w:sz w:val="20"/>
+                <w:highlight w:val="yellow"/>
+              </w:rPr>
+              <w:t>347.4</w:t>
+            </w:r>
+          </w:p>
+        </w:tc>
+        <w:tc>
+          <w:tcPr>
+            <w:tcW w:type="dxa" w:w="1495"/>
+            <w:tcBorders>
+              <w:bottom w:val="single" w:sz="8" w:space="0" w:color="000000"/>
+            </w:tcBorders>
+          </w:tcPr>
+          <w:p>
+            <w:pPr>
+              <w:pStyle w:val="MDPI42tablebody"/>
+              <w:bidi w:val="0"/>
+            </w:pPr>
+            <w:r>
+              <w:rPr>
+                <w:highlight w:val="yellow"/>
+              </w:rPr>
+            </w:r>
+            <w:r>
+              <w:rPr>
+                <w:sz w:val="20"/>
+                <w:highlight w:val="yellow"/>
+              </w:rPr>
+              <w:t>48.48</w:t>
+            </w:r>
+          </w:p>
+        </w:tc>
+      </w:tr>
+    </w:tbl>
+    <w:p>
+      <w:pPr>
+        <w:pStyle w:val="MDPI31text"/>
+        <w:rPr/>
+      </w:pPr>
+      <w:r>
+        <w:rPr>
+          <w:highlight w:val="yellow"/>
+        </w:rPr>
+        <w:t xml:space="preserve">Averaged across the three ratios tested (r = 0.3, 0.5, 0.7), LSPM's throughput relative to raw serving falls from 93.0% at concurrency 1 to 85.1% at concurrency 5, then to 59.0% at concurrency 10 (where only 83.3% of LSPM requests complete within the timeout, versus 100% for raw) and 29.4% at concurrency 20 (only 43.3% of LSPM requests complete). Naive truncation does not show this degradation at r = 0.5 or r = 0.7, where its throughput is comparable to or higher than raw; at r = 0.3 naive truncation is itself markedly slower than raw (throughput ratio 0.36-0.52), an asymmetry we report here without further interpretation, as untangling its cause is outside this benchmark's scope. Taken together, this is the paper's most important open validation item, now closed with a measured, unfavorable-at-scale result rather than left as a stated gap: LSPM's zero-measurable-penalty finding in Section 4.6 holds specifically for the generation-only measurement it was designed to isolate, and does not extend to true end-to-end online serving under concurrent load, where the live cross-encoder scoring cost becomes a first-order bottleneck as concurrency increases.</w:t>
+      </w:r>
+    </w:p>
+    <w:p>
+      <w:pPr>
+        <w:pStyle w:val="MDPI22heading2"/>
+        <w:spacing w:before="240" w:after="60"/>
+        <w:rPr/>
+      </w:pPr>
+      <w:r>
+        <w:rPr/>
+        <w:t xml:space="preserve">4.12. Controller versus Matched-Fixed-Ratio Comparison Under Memory Pressure</w:t>
+      </w:r>
+    </w:p>
+    <w:p>
+      <w:pPr>
+        <w:pStyle w:val="MDPI31text"/>
+        <w:rPr/>
+      </w:pPr>
+      <w:r>
+        <w:rPr>
+          <w:highlight w:val="yellow"/>
+        </w:rPr>
+        <w:t xml:space="preserve">Under the protocol of Section 3.5.8, we reran the dynamic controller and a fixed-ratio condition matched to the controller's own realized mean ratio back to back under the same constrained cache pool as Section 4.7's redesigned ablation, on the same RTX 4090 48 GiB card, logging every request's ratio, KV-cache occupancy, TTFT, and total latency. The run used the script's --skip-quality flag, so this comparison covers serving latency only.</w:t>
+      </w:r>
+    </w:p>
+    <w:p>
+      <w:pPr>
+        <w:pStyle w:val="MDPI41tablecaption"/>
+        <w:rPr/>
+      </w:pPr>
+      <w:r>
+        <w:rPr>
+          <w:b/>
+        </w:rPr>
+        <w:t xml:space="preserve">Table 10. Controller (dynamic) versus matched-fixed-ratio serving comparison under constrained cache pressure (protocol in Section 3.5.8). N is the count of completed requests logged for each condition over the run; the two conditions ran for the same wall-clock duration rather than the same request count. Latency and TTFT figures are means and 95th-percentile (p95) values in milliseconds.</w:t>
+      </w:r>
+    </w:p>
+    <w:tbl>
+      <w:tblPr>
+        <w:tblW w:type="auto" w:w="0"/>
+        <w:tblLook w:firstColumn="1" w:firstRow="1" w:lastColumn="0" w:lastRow="0" w:noHBand="0" w:noVBand="1" w:val="04A0"/>
+        <w:bidiVisual w:val="0"/>
+      </w:tblPr>
+      <w:tblGrid>
+        <w:gridCol w:w="1163"/>
+        <w:gridCol w:w="1163"/>
+        <w:gridCol w:w="1163"/>
+        <w:gridCol w:w="1163"/>
+        <w:gridCol w:w="1163"/>
+        <w:gridCol w:w="1163"/>
+        <w:gridCol w:w="1163"/>
+        <w:gridCol w:w="1163"/>
+        <w:gridCol w:w="1163"/>
+      </w:tblGrid>
+      <w:tr>
+        <w:tc>
+          <w:tcPr>
+            <w:tcW w:type="dxa" w:w="1163"/>
+            <w:tcBorders>
+              <w:top w:val="single" w:sz="8" w:space="0" w:color="000000"/>
+              <w:bottom w:val="single" w:sz="4" w:space="0" w:color="000000"/>
+            </w:tcBorders>
+          </w:tcPr>
+          <w:p>
+            <w:pPr>
+              <w:pStyle w:val="MDPI42tablebody"/>
+              <w:bidi w:val="0"/>
+            </w:pPr>
+            <w:r>
+              <w:rPr>
+                <w:highlight w:val="yellow"/>
+              </w:rPr>
+            </w:r>
+            <w:r>
+              <w:rPr>
+                <w:b/>
+                <w:sz w:val="20"/>
+                <w:highlight w:val="yellow"/>
+              </w:rPr>
+              <w:t>Condition</w:t>
+            </w:r>
+          </w:p>
+        </w:tc>
+        <w:tc>
+          <w:tcPr>
+            <w:tcW w:type="dxa" w:w="1163"/>
+            <w:tcBorders>
+              <w:top w:val="single" w:sz="8" w:space="0" w:color="000000"/>
+              <w:bottom w:val="single" w:sz="4" w:space="0" w:color="000000"/>
+            </w:tcBorders>
+          </w:tcPr>
+          <w:p>
+            <w:pPr>
+              <w:pStyle w:val="MDPI42tablebody"/>
+              <w:bidi w:val="0"/>
+            </w:pPr>
+            <w:r>
+              <w:rPr>
+                <w:highlight w:val="yellow"/>
+              </w:rPr>
+            </w:r>
+            <w:r>
+              <w:rPr>
+                <w:b/>
+                <w:sz w:val="20"/>
+                <w:highlight w:val="yellow"/>
+              </w:rPr>
+              <w:t>N</w:t>
+            </w:r>
+          </w:p>
+        </w:tc>
+        <w:tc>
+          <w:tcPr>
+            <w:tcW w:type="dxa" w:w="1163"/>
+            <w:tcBorders>
+              <w:top w:val="single" w:sz="8" w:space="0" w:color="000000"/>
+              <w:bottom w:val="single" w:sz="4" w:space="0" w:color="000000"/>
+            </w:tcBorders>
+          </w:tcPr>
+          <w:p>
+            <w:pPr>
+              <w:pStyle w:val="MDPI42tablebody"/>
+              <w:bidi w:val="0"/>
+            </w:pPr>
+            <w:r>
+              <w:rPr>
+                <w:highlight w:val="yellow"/>
+              </w:rPr>
+            </w:r>
+            <w:r>
+              <w:rPr>
+                <w:b/>
+                <w:sz w:val="20"/>
+                <w:highlight w:val="yellow"/>
+              </w:rPr>
+              <w:t>Mean ratio</w:t>
+            </w:r>
+          </w:p>
+        </w:tc>
+        <w:tc>
+          <w:tcPr>
+            <w:tcW w:type="dxa" w:w="1163"/>
+            <w:tcBorders>
+              <w:top w:val="single" w:sz="8" w:space="0" w:color="000000"/>
+              <w:bottom w:val="single" w:sz="4" w:space="0" w:color="000000"/>
+            </w:tcBorders>
+          </w:tcPr>
+          <w:p>
+            <w:pPr>
+              <w:pStyle w:val="MDPI42tablebody"/>
+              <w:bidi w:val="0"/>
+            </w:pPr>
+            <w:r>
+              <w:rPr>
+                <w:highlight w:val="yellow"/>
+              </w:rPr>
+            </w:r>
+            <w:r>
+              <w:rPr>
+                <w:b/>
+                <w:sz w:val="20"/>
+                <w:highlight w:val="yellow"/>
+              </w:rPr>
+              <w:t>Mean occ.</w:t>
+            </w:r>
+          </w:p>
+        </w:tc>
+        <w:tc>
+          <w:tcPr>
+            <w:tcW w:type="dxa" w:w="1163"/>
+            <w:tcBorders>
+              <w:top w:val="single" w:sz="8" w:space="0" w:color="000000"/>
+              <w:bottom w:val="single" w:sz="4" w:space="0" w:color="000000"/>
+            </w:tcBorders>
+          </w:tcPr>
+          <w:p>
+            <w:pPr>
+              <w:pStyle w:val="MDPI42tablebody"/>
+              <w:bidi w:val="0"/>
+            </w:pPr>
+            <w:r>
+              <w:rPr>
+                <w:highlight w:val="yellow"/>
+              </w:rPr>
+            </w:r>
+            <w:r>
+              <w:rPr>
+                <w:b/>
+                <w:sz w:val="20"/>
+                <w:highlight w:val="yellow"/>
+              </w:rPr>
+              <w:t>Max occ.</w:t>
+            </w:r>
+          </w:p>
+        </w:tc>
+        <w:tc>
+          <w:tcPr>
+            <w:tcW w:type="dxa" w:w="1163"/>
+            <w:tcBorders>
+              <w:top w:val="single" w:sz="8" w:space="0" w:color="000000"/>
+              <w:bottom w:val="single" w:sz="4" w:space="0" w:color="000000"/>
+            </w:tcBorders>
+          </w:tcPr>
+          <w:p>
+            <w:pPr>
+              <w:pStyle w:val="MDPI42tablebody"/>
+              <w:bidi w:val="0"/>
+            </w:pPr>
+            <w:r>
+              <w:rPr>
+                <w:highlight w:val="yellow"/>
+              </w:rPr>
+            </w:r>
+            <w:r>
+              <w:rPr>
+                <w:b/>
+                <w:sz w:val="20"/>
+                <w:highlight w:val="yellow"/>
+              </w:rPr>
+              <w:t>TTFT mean</w:t>
+            </w:r>
+          </w:p>
+        </w:tc>
+        <w:tc>
+          <w:tcPr>
+            <w:tcW w:type="dxa" w:w="1163"/>
+            <w:tcBorders>
+              <w:top w:val="single" w:sz="8" w:space="0" w:color="000000"/>
+              <w:bottom w:val="single" w:sz="4" w:space="0" w:color="000000"/>
+            </w:tcBorders>
+          </w:tcPr>
+          <w:p>
+            <w:pPr>
+              <w:pStyle w:val="MDPI42tablebody"/>
+              <w:bidi w:val="0"/>
+            </w:pPr>
+            <w:r>
+              <w:rPr>
+                <w:highlight w:val="yellow"/>
+              </w:rPr>
+            </w:r>
+            <w:r>
+              <w:rPr>
+                <w:b/>
+                <w:sz w:val="20"/>
+                <w:highlight w:val="yellow"/>
+              </w:rPr>
+              <w:t>TTFT p95</w:t>
+            </w:r>
+          </w:p>
+        </w:tc>
+        <w:tc>
+          <w:tcPr>
+            <w:tcW w:type="dxa" w:w="1163"/>
+            <w:tcBorders>
+              <w:top w:val="single" w:sz="8" w:space="0" w:color="000000"/>
+              <w:bottom w:val="single" w:sz="4" w:space="0" w:color="000000"/>
+            </w:tcBorders>
+          </w:tcPr>
+          <w:p>
+            <w:pPr>
+              <w:pStyle w:val="MDPI42tablebody"/>
+              <w:bidi w:val="0"/>
+            </w:pPr>
+            <w:r>
+              <w:rPr>
+                <w:highlight w:val="yellow"/>
+              </w:rPr>
+            </w:r>
+            <w:r>
+              <w:rPr>
+                <w:b/>
+                <w:sz w:val="20"/>
+                <w:highlight w:val="yellow"/>
+              </w:rPr>
+              <w:t>Lat. mean</w:t>
+            </w:r>
+          </w:p>
+        </w:tc>
+        <w:tc>
+          <w:tcPr>
+            <w:tcW w:type="dxa" w:w="1163"/>
+            <w:tcBorders>
+              <w:top w:val="single" w:sz="8" w:space="0" w:color="000000"/>
+              <w:bottom w:val="single" w:sz="4" w:space="0" w:color="000000"/>
+            </w:tcBorders>
+          </w:tcPr>
+          <w:p>
+            <w:pPr>
+              <w:pStyle w:val="MDPI42tablebody"/>
+              <w:bidi w:val="0"/>
+            </w:pPr>
+            <w:r>
+              <w:rPr>
+                <w:highlight w:val="yellow"/>
+              </w:rPr>
+            </w:r>
+            <w:r>
+              <w:rPr>
+                <w:b/>
+                <w:sz w:val="20"/>
+                <w:highlight w:val="yellow"/>
+              </w:rPr>
+              <w:t>Lat. p95</w:t>
+            </w:r>
+          </w:p>
+        </w:tc>
+      </w:tr>
+      <w:tr>
+        <w:tc>
+          <w:tcPr>
+            <w:tcW w:type="dxa" w:w="1163"/>
+          </w:tcPr>
+          <w:p>
+            <w:pPr>
+              <w:pStyle w:val="MDPI42tablebody"/>
+              <w:bidi w:val="0"/>
+            </w:pPr>
+            <w:r>
+              <w:rPr>
+                <w:highlight w:val="yellow"/>
+              </w:rPr>
+            </w:r>
+            <w:r>
+              <w:rPr>
+                <w:sz w:val="20"/>
+                <w:highlight w:val="yellow"/>
+              </w:rPr>
+              <w:t>dynamic</w:t>
+            </w:r>
+          </w:p>
+        </w:tc>
+        <w:tc>
+          <w:tcPr>
+            <w:tcW w:type="dxa" w:w="1163"/>
+          </w:tcPr>
+          <w:p>
+            <w:pPr>
+              <w:pStyle w:val="MDPI42tablebody"/>
+              <w:bidi w:val="0"/>
+            </w:pPr>
+            <w:r>
+              <w:rPr>
+                <w:highlight w:val="yellow"/>
+              </w:rPr>
+            </w:r>
+            <w:r>
+              <w:rPr>
+                <w:sz w:val="20"/>
+                <w:highlight w:val="yellow"/>
+              </w:rPr>
+              <w:t>5,637</w:t>
+            </w:r>
+          </w:p>
+        </w:tc>
+        <w:tc>
+          <w:tcPr>
+            <w:tcW w:type="dxa" w:w="1163"/>
+          </w:tcPr>
+          <w:p>
+            <w:pPr>
+              <w:pStyle w:val="MDPI42tablebody"/>
+              <w:bidi w:val="0"/>
+            </w:pPr>
+            <w:r>
+              <w:rPr>
+                <w:highlight w:val="yellow"/>
+              </w:rPr>
+            </w:r>
+            <w:r>
+              <w:rPr>
+                <w:sz w:val="20"/>
+                <w:highlight w:val="yellow"/>
+              </w:rPr>
+              <w:t>0.565 (0.2-0.8)</w:t>
+            </w:r>
+          </w:p>
+        </w:tc>
+        <w:tc>
+          <w:tcPr>
+            <w:tcW w:type="dxa" w:w="1163"/>
+          </w:tcPr>
+          <w:p>
+            <w:pPr>
+              <w:pStyle w:val="MDPI42tablebody"/>
+              <w:bidi w:val="0"/>
+            </w:pPr>
+            <w:r>
+              <w:rPr>
+                <w:highlight w:val="yellow"/>
+              </w:rPr>
+            </w:r>
+            <w:r>
+              <w:rPr>
+                <w:sz w:val="20"/>
+                <w:highlight w:val="yellow"/>
+              </w:rPr>
+              <w:t>0.414</w:t>
+            </w:r>
+          </w:p>
+        </w:tc>
+        <w:tc>
+          <w:tcPr>
+            <w:tcW w:type="dxa" w:w="1163"/>
+          </w:tcPr>
+          <w:p>
+            <w:pPr>
+              <w:pStyle w:val="MDPI42tablebody"/>
+              <w:bidi w:val="0"/>
+            </w:pPr>
+            <w:r>
+              <w:rPr>
+                <w:highlight w:val="yellow"/>
+              </w:rPr>
+            </w:r>
+            <w:r>
+              <w:rPr>
+                <w:sz w:val="20"/>
+                <w:highlight w:val="yellow"/>
+              </w:rPr>
+              <w:t>0.994</w:t>
+            </w:r>
+          </w:p>
+        </w:tc>
+        <w:tc>
+          <w:tcPr>
+            <w:tcW w:type="dxa" w:w="1163"/>
+          </w:tcPr>
+          <w:p>
+            <w:pPr>
+              <w:pStyle w:val="MDPI42tablebody"/>
+              <w:bidi w:val="0"/>
+            </w:pPr>
+            <w:r>
+              <w:rPr>
+                <w:highlight w:val="yellow"/>
+              </w:rPr>
+            </w:r>
+            <w:r>
+              <w:rPr>
+                <w:sz w:val="20"/>
+                <w:highlight w:val="yellow"/>
+              </w:rPr>
+              <w:t>1,507.6</w:t>
+            </w:r>
+          </w:p>
+        </w:tc>
+        <w:tc>
+          <w:tcPr>
+            <w:tcW w:type="dxa" w:w="1163"/>
+          </w:tcPr>
+          <w:p>
+            <w:pPr>
+              <w:pStyle w:val="MDPI42tablebody"/>
+              <w:bidi w:val="0"/>
+            </w:pPr>
+            <w:r>
+              <w:rPr>
+                <w:highlight w:val="yellow"/>
+              </w:rPr>
+            </w:r>
+            <w:r>
+              <w:rPr>
+                <w:sz w:val="20"/>
+                <w:highlight w:val="yellow"/>
+              </w:rPr>
+              <w:t>4,958.2</w:t>
+            </w:r>
+          </w:p>
+        </w:tc>
+        <w:tc>
+          <w:tcPr>
+            <w:tcW w:type="dxa" w:w="1163"/>
+          </w:tcPr>
+          <w:p>
+            <w:pPr>
+              <w:pStyle w:val="MDPI42tablebody"/>
+              <w:bidi w:val="0"/>
+            </w:pPr>
+            <w:r>
+              <w:rPr>
+                <w:highlight w:val="yellow"/>
+              </w:rPr>
+            </w:r>
+            <w:r>
+              <w:rPr>
+                <w:sz w:val="20"/>
+                <w:highlight w:val="yellow"/>
+              </w:rPr>
+              <w:t>2,654.0</w:t>
+            </w:r>
+          </w:p>
+        </w:tc>
+        <w:tc>
+          <w:tcPr>
+            <w:tcW w:type="dxa" w:w="1163"/>
+          </w:tcPr>
+          <w:p>
+            <w:pPr>
+              <w:pStyle w:val="MDPI42tablebody"/>
+              <w:bidi w:val="0"/>
+            </w:pPr>
+            <w:r>
+              <w:rPr>
+                <w:highlight w:val="yellow"/>
+              </w:rPr>
+            </w:r>
+            <w:r>
+              <w:rPr>
+                <w:sz w:val="20"/>
+                <w:highlight w:val="yellow"/>
+              </w:rPr>
+              <w:t>6,870.6</w:t>
+            </w:r>
+          </w:p>
+        </w:tc>
+      </w:tr>
+      <w:tr>
+        <w:tc>
+          <w:tcPr>
+            <w:tcW w:type="dxa" w:w="1163"/>
+            <w:tcBorders>
+              <w:bottom w:val="single" w:sz="8" w:space="0" w:color="000000"/>
+            </w:tcBorders>
+          </w:tcPr>
+          <w:p>
+            <w:pPr>
+              <w:pStyle w:val="MDPI42tablebody"/>
+              <w:bidi w:val="0"/>
+            </w:pPr>
+            <w:r>
+              <w:rPr>
+                <w:highlight w:val="yellow"/>
+              </w:rPr>
+            </w:r>
+            <w:r>
+              <w:rPr>
+                <w:sz w:val="20"/>
+                <w:highlight w:val="yellow"/>
+              </w:rPr>
+              <w:t>matched_fixed</w:t>
+            </w:r>
+          </w:p>
+        </w:tc>
+        <w:tc>
+          <w:tcPr>
+            <w:tcW w:type="dxa" w:w="1163"/>
+            <w:tcBorders>
+              <w:bottom w:val="single" w:sz="8" w:space="0" w:color="000000"/>
+            </w:tcBorders>
+          </w:tcPr>
+          <w:p>
+            <w:pPr>
+              <w:pStyle w:val="MDPI42tablebody"/>
+              <w:bidi w:val="0"/>
+            </w:pPr>
+            <w:r>
+              <w:rPr>
+                <w:highlight w:val="yellow"/>
+              </w:rPr>
+            </w:r>
+            <w:r>
+              <w:rPr>
+                <w:sz w:val="20"/>
+                <w:highlight w:val="yellow"/>
+              </w:rPr>
+              <w:t>6,299</w:t>
+            </w:r>
+          </w:p>
+        </w:tc>
+        <w:tc>
+          <w:tcPr>
+            <w:tcW w:type="dxa" w:w="1163"/>
+            <w:tcBorders>
+              <w:bottom w:val="single" w:sz="8" w:space="0" w:color="000000"/>
+            </w:tcBorders>
+          </w:tcPr>
+          <w:p>
+            <w:pPr>
+              <w:pStyle w:val="MDPI42tablebody"/>
+              <w:bidi w:val="0"/>
+            </w:pPr>
+            <w:r>
+              <w:rPr>
+                <w:highlight w:val="yellow"/>
+              </w:rPr>
+            </w:r>
+            <w:r>
+              <w:rPr>
+                <w:sz w:val="20"/>
+                <w:highlight w:val="yellow"/>
+              </w:rPr>
+              <w:t>0.565 (fixed)</w:t>
+            </w:r>
+          </w:p>
+        </w:tc>
+        <w:tc>
+          <w:tcPr>
+            <w:tcW w:type="dxa" w:w="1163"/>
+            <w:tcBorders>
+              <w:bottom w:val="single" w:sz="8" w:space="0" w:color="000000"/>
+            </w:tcBorders>
+          </w:tcPr>
+          <w:p>
+            <w:pPr>
+              <w:pStyle w:val="MDPI42tablebody"/>
+              <w:bidi w:val="0"/>
+            </w:pPr>
+            <w:r>
+              <w:rPr>
+                <w:highlight w:val="yellow"/>
+              </w:rPr>
+            </w:r>
+            <w:r>
+              <w:rPr>
+                <w:sz w:val="20"/>
+                <w:highlight w:val="yellow"/>
+              </w:rPr>
+              <w:t>0.516</w:t>
+            </w:r>
+          </w:p>
+        </w:tc>
+        <w:tc>
+          <w:tcPr>
+            <w:tcW w:type="dxa" w:w="1163"/>
+            <w:tcBorders>
+              <w:bottom w:val="single" w:sz="8" w:space="0" w:color="000000"/>
+            </w:tcBorders>
+          </w:tcPr>
+          <w:p>
+            <w:pPr>
+              <w:pStyle w:val="MDPI42tablebody"/>
+              <w:bidi w:val="0"/>
+            </w:pPr>
+            <w:r>
+              <w:rPr>
+                <w:highlight w:val="yellow"/>
+              </w:rPr>
+            </w:r>
+            <w:r>
+              <w:rPr>
+                <w:sz w:val="20"/>
+                <w:highlight w:val="yellow"/>
+              </w:rPr>
+              <w:t>0.995</w:t>
+            </w:r>
+          </w:p>
+        </w:tc>
+        <w:tc>
+          <w:tcPr>
+            <w:tcW w:type="dxa" w:w="1163"/>
+            <w:tcBorders>
+              <w:bottom w:val="single" w:sz="8" w:space="0" w:color="000000"/>
+            </w:tcBorders>
+          </w:tcPr>
+          <w:p>
+            <w:pPr>
+              <w:pStyle w:val="MDPI42tablebody"/>
+              <w:bidi w:val="0"/>
+            </w:pPr>
+            <w:r>
+              <w:rPr>
+                <w:highlight w:val="yellow"/>
+              </w:rPr>
+            </w:r>
+            <w:r>
+              <w:rPr>
+                <w:sz w:val="20"/>
+                <w:highlight w:val="yellow"/>
+              </w:rPr>
+              <w:t>1,525.5</w:t>
+            </w:r>
+          </w:p>
+        </w:tc>
+        <w:tc>
+          <w:tcPr>
+            <w:tcW w:type="dxa" w:w="1163"/>
+            <w:tcBorders>
+              <w:bottom w:val="single" w:sz="8" w:space="0" w:color="000000"/>
+            </w:tcBorders>
+          </w:tcPr>
+          <w:p>
+            <w:pPr>
+              <w:pStyle w:val="MDPI42tablebody"/>
+              <w:bidi w:val="0"/>
+            </w:pPr>
+            <w:r>
+              <w:rPr>
+                <w:highlight w:val="yellow"/>
+              </w:rPr>
+            </w:r>
+            <w:r>
+              <w:rPr>
+                <w:sz w:val="20"/>
+                <w:highlight w:val="yellow"/>
+              </w:rPr>
+              <w:t>3,783.3</w:t>
+            </w:r>
+          </w:p>
+        </w:tc>
+        <w:tc>
+          <w:tcPr>
+            <w:tcW w:type="dxa" w:w="1163"/>
+            <w:tcBorders>
+              <w:bottom w:val="single" w:sz="8" w:space="0" w:color="000000"/>
+            </w:tcBorders>
+          </w:tcPr>
+          <w:p>
+            <w:pPr>
+              <w:pStyle w:val="MDPI42tablebody"/>
+              <w:bidi w:val="0"/>
+            </w:pPr>
+            <w:r>
+              <w:rPr>
+                <w:highlight w:val="yellow"/>
+              </w:rPr>
+            </w:r>
+            <w:r>
+              <w:rPr>
+                <w:sz w:val="20"/>
+                <w:highlight w:val="yellow"/>
+              </w:rPr>
+              <w:t>2,880.4</w:t>
+            </w:r>
+          </w:p>
+        </w:tc>
+        <w:tc>
+          <w:tcPr>
+            <w:tcW w:type="dxa" w:w="1163"/>
+            <w:tcBorders>
+              <w:bottom w:val="single" w:sz="8" w:space="0" w:color="000000"/>
+            </w:tcBorders>
+          </w:tcPr>
+          <w:p>
+            <w:pPr>
+              <w:pStyle w:val="MDPI42tablebody"/>
+              <w:bidi w:val="0"/>
+            </w:pPr>
+            <w:r>
+              <w:rPr>
+                <w:highlight w:val="yellow"/>
+              </w:rPr>
+            </w:r>
+            <w:r>
+              <w:rPr>
+                <w:sz w:val="20"/>
+                <w:highlight w:val="yellow"/>
+              </w:rPr>
+              <w:t>7,302.7</w:t>
+            </w:r>
+          </w:p>
+        </w:tc>
+      </w:tr>
+    </w:tbl>
+    <w:p>
+      <w:pPr>
+        <w:pStyle w:val="MDPI31text"/>
+        <w:rPr/>
+      </w:pPr>
+      <w:r>
+        <w:rPr>
+          <w:highlight w:val="yellow"/>
+        </w:rPr>
+        <w:t xml:space="preserve">The result is a mixed one, not a clean win for either arm: the dynamic controller has a lower mean TTFT (1,507.6 ms versus 1,525.5 ms), lower mean total latency (2,654.0 ms versus 2,880.4 ms), and a lower p95 total latency (6,870.6 ms versus 7,302.7 ms) than matched_fixed, but a substantially worse tail on time-to-first-token, with p95 TTFT 31% higher than matched_fixed (4,958.2 ms versus 3,783.3 ms). matched_fixed also completed more total requests over the same run duration (6,299 versus 5,637), consistent with its slightly higher mean occupancy (0.516 versus 0.414) reflecting a policy that, on average, retains a comparable amount of context with less adaptive overhead. Because --skip-quality was used, we have no answer-quality data at all for either condition in this run, so this comparison cannot establish whether the controller's adaptive behavior helps, hurts, or is neutral for answer quality relative to a fixed policy; it establishes only that, on serving latency alone, adapting the ratio is not a clear win over a well-chosen fixed ratio under this memory-pressure regime. This closes the comparison Section 4.7 left open, with a measured negative-to-mixed result rather than an unresolved gap, while leaving the answer-quality question for future work.</w:t>
+      </w:r>
+    </w:p>
+    <w:p>
+      <w:pPr>
         <w:pStyle w:val="MDPI21heading1"/>
         <w:rPr/>
       </w:pPr>
@@ -8255,6 +11315,18 @@
       </w:pPr>
       <w:r>
         <w:rPr>
+          <w:highlight w:val="yellow"/>
+        </w:rPr>
+        <w:t xml:space="preserve">Separately, Section 4.11's true end-to-end benchmark closes this result's generation-only scope directly: once the cross-encoder's own scoring cost is measured inside the live request path rather than excluded from it, LSPM shows a substantial, concurrency-dependent throughput and completion-rate penalty relative to raw serving on the same RTX 4090 hardware. The zero-measurable-penalty finding above should therefore be read narrowly, as a statement about generation cost alone at low KV-cache occupancy, not as a statement about total serving cost once the pruning step's own cost is included in the request path under concurrent load.</w:t>
+      </w:r>
+    </w:p>
+    <w:p>
+      <w:pPr>
+        <w:pStyle w:val="MDPI31text"/>
+        <w:rPr/>
+      </w:pPr>
+      <w:r>
+        <w:rPr>
           <w:b/>
           <w:highlight w:val="yellow"/>
         </w:rPr>
@@ -8265,6 +11337,18 @@
           <w:highlight w:val="yellow"/>
         </w:rPr>
         <w:t xml:space="preserve">The controller ablation has been rerun (Section 4.7) under a redesigned protocol using real ARCD contexts and a deliberately constrained cache pool, specifically to reach the load regime the original ablation could not. Under that redesign, the controller's ratio ranged across its full configured span (0.20 to 0.80) and KV-cache occupancy reached 99.2%, so the adaptive mechanism is now shown to engage under real cache pressure rather than only in plumbing and stability, as the earlier, non-adaptive run had shown. What remains open has changed in kind rather than disappeared: the dynamic condition retained more context than the fixed r = 0.5 baseline throughout most of the redesigned run (per-step mean ratio 0.58-0.80, Table 5) and was, if anything, slower on TTFT and total latency overall, so this ablation does not establish that adapting the ratio improves throughput, tail latency, or answer quality relative to a fixed ratio; the two conditions remain unmatched on average retained context, and a fixed-r = 0.8 comparison, matching the dynamic condition's typical operating point, is the natural next experiment. Occupancy also did not track the intended concurrency ramp cleanly in the redesigned run (Section 4.7), a data-quality caveat disclosed there and carried forward here rather than smoothed over. Adaptive, input-dependent compression rates remain an active research direction, as ACC-RAG's complexity-conditioned rate selection illustrates; evaluating LSPM's controller against that kind of adaptive baseline is a further extension beyond the fixed-ratio comparison above.</w:t>
+      </w:r>
+    </w:p>
+    <w:p>
+      <w:pPr>
+        <w:pStyle w:val="MDPI31text"/>
+        <w:rPr/>
+      </w:pPr>
+      <w:r>
+        <w:rPr>
+          <w:highlight w:val="yellow"/>
+        </w:rPr>
+        <w:t xml:space="preserve">The matched fixed-ratio comparison this ablation called for has since been run (Section 4.12): under the same constrained cache pool, a fixed ratio set to the dynamic controller's own realized mean produces a mixed result on serving latency relative to the dynamic controller (lower mean TTFT and total latency for dynamic, lower p95 TTFT and more completed requests for matched_fixed), with no answer-quality data collected for either arm. Adapting the ratio is therefore not shown to outperform a well-chosen fixed ratio on the evidence now available, though it is not shown to be worse either; the comparison is closed on serving latency and remains open on answer quality.</w:t>
       </w:r>
     </w:p>
     <w:p>
@@ -8383,7 +11467,17 @@
       </w:r>
       <w:r>
         <w:rPr/>
-        <w:t xml:space="preserve">rather than by a demonstrated memory-efficiency win at a realistic operating point; the context-selection result in Section 4.3 remains the part of this paper's contribution that is best supported. The GPU benchmark (Section 4.6) is now a real, repeated, randomized measurement that we do rely on, but for a deliberately narrow purpose: it establishes the absence of a throughput or TTFT penalty, and it does not establish a memory benefit, because the workload never approached cache saturation. One qualification applies to the paper's strongest result and is stated here rather than buried in Methods. The n = 140 sample size was originally justified by a power calculation performed on the effect size observed in an earlier 40-question run, and those 40 questions are not a separate pilot but exactly the first 40 of the 140 (Section 3.4). That makes the justification circular, and observed power computed from one's own data is not a valid basis for asserting adequate power in the first place [70], so we no longer offer it: n = 140 is reported as a pragmatic sample size. The interpretive consequence is that the decision to extend the sample was taken after inspecting a subset of the same data, which is a data-dependent stopping rule and can inflate the Type I error rate of the resulting test to an extent this design does not let us quantify. We therefore do not present the original n = 140 result, taken alone, as an independently confirmed finding: it is a real, Holm-corrected, adequately intervalled result on 140 real questions with 980 real generations, and it is the best-supported claim in this paper, but on its own it remains a data-dependent continuation of the pilot that set its sample size. What removes that qualification is a separate, independent replication on a fresh, disjoint sample of 140 ARCD questions sharing no question identifiers with the original set or its pilot (Section 4.10): the same r = 0.3 advantage over naive truncation, and the same equivalence of LSPM to the unpruned answer, both reproduce there with equal or greater statistical strength, on data that could not have influenced the original sample-size decision. Taken together, the original result and this replication constitute independent confirmation of the central r = 0.3 finding, even though the original n = 140 test alone does not.</w:t>
+        <w:t xml:space="preserve">rather than by a demonstrated memory-efficiency win at a realistic operating point; the context-selection result in Section 4.3 remains the part of this paper's contribution that is best supported. The GPU benchmark (Section 4.6) is now a real, repeated, randomized measurement that we do rely on, but for a deliberately narrow purpose: it establishes the absence of a throughput or TTFT penalty, and it does not establish a memory benefit, because the workload never approached cache saturation. </w:t>
+      </w:r>
+      <w:r>
+        <w:rPr>
+          <w:highlight w:val="yellow"/>
+        </w:rPr>
+        <w:t xml:space="preserve">A true end-to-end benchmark that includes the pruning step's own cost inside the live request path (Section 4.11) shows this generation-only result does not extend to concurrent-load online serving, where LSPM's throughput and completion rate degrade substantially as concurrency rises; and a matched controller-versus-fixed-ratio comparison under memory pressure (Section 4.12) finds a mixed serving-latency result with no answer-quality data, so neither open item is resolved in LSPM's favor. </w:t>
+      </w:r>
+      <w:r>
+        <w:rPr/>
+        <w:t xml:space="preserve">One qualification applies to the paper's strongest result and is stated here rather than buried in Methods. The n = 140 sample size was originally justified by a power calculation performed on the effect size observed in an earlier 40-question run, and those 40 questions are not a separate pilot but exactly the first 40 of the 140 (Section 3.4). That makes the justification circular, and observed power computed from one's own data is not a valid basis for asserting adequate power in the first place [70], so we no longer offer it: n = 140 is reported as a pragmatic sample size. The interpretive consequence is that the decision to extend the sample was taken after inspecting a subset of the same data, which is a data-dependent stopping rule and can inflate the Type I error rate of the resulting test to an extent this design does not let us quantify. We therefore do not present the original n = 140 result, taken alone, as an independently confirmed finding: it is a real, Holm-corrected, adequately intervalled result on 140 real questions with 980 real generations, and it is the best-supported claim in this paper, but on its own it remains a data-dependent continuation of the pilot that set its sample size. What removes that qualification is a separate, independent replication on a fresh, disjoint sample of 140 ARCD questions sharing no question identifiers with the original set or its pilot (Section 4.10): the same r = 0.3 advantage over naive truncation, and the same equivalence of LSPM to the unpruned answer, both reproduce there with equal or greater statistical strength, on data that could not have influenced the original sample-size decision. Taken together, the original result and this replication constitute independent confirmation of the central r = 0.3 finding, even though the original n = 140 test alone does not.</w:t>
       </w:r>
     </w:p>
     <w:p>
@@ -8413,7 +11507,17 @@
       </w:r>
       <w:r>
         <w:rPr/>
-        <w:t xml:space="preserve">LSPM's throughput is within 3% of unpruned serving at every concurrency level tested and slightly ahead at 100 concurrent clients (55.7 vs. 54.1 req/s, with lower median and p95 TTFT), which removes the apparent throughput deficit that the earlier confounded run had reported. We deliberately stop short of a memory-efficiency claim from that sweep alone: KV-cache occupancy never exceeded 8.8% of capacity in it, so the regime in which the analytical saving would matter was not entered there. A redesigned controller ablation, using real contexts and a deliberately constrained cache pool, subsequently did reach that regime, driving occupancy up to 99.2% and the controller's ratio across its full configured range (0.20-0.80); the adaptive mechanism is accordingly now shown to engage under genuine cache pressure, though the dynamic condition retained more context than a fixed r = 0.5 comparison throughout most of that run and was not faster on TTFT or latency, so whether adapting the ratio helps, rather than merely occurring, remains open. We also closed the two most important remaining gaps: a token-budget-matched rerun, in which naive truncation receives the same per-question token budget LSPM actually spent, reproduces the r = 0.3 advantage (+0.140 F1, Holm-adjusted p = 0.0003), and a head-to-head comparison against LLMLingua-2, a modern learned compressor, finds LSPM significantly ahead on token-F1 at all three ratios tested, most convincingly at r = 0.3 and 0.5 (largest gap +0.211 at r = 0.3). The central r = 0.3 result also generalizes to a second generator, Qwen2.5-7B-Instruct, with the same or greater statistical strength than on the original generator. We release the implementation, evaluation code, and the datasets and outputs described in this paper (Data Availability Statement) to support independent reproduction and extension, including the significant, null, inconclusive, and not-yet-validated results alike. Finally, because the original n = 140 sample size was derived from an internal pilot that is a subset of the same 140 questions, we additionally ran an independent replication on 140 freshly sampled ARCD questions sharing no question identifiers with the original set (Section 4.10): the r = 0.3 advantage over naive truncation and the equivalence of LSPM to the unpruned answer both reproduce there with equal or greater statistical strength, so the central finding is now independently confirmed rather than resting on the original sample alone.</w:t>
+        <w:t xml:space="preserve">LSPM's throughput is within 3% of unpruned serving at every concurrency level tested and slightly ahead at 100 concurrent clients (55.7 vs. 54.1 req/s, with lower median and p95 TTFT), which removes the apparent throughput deficit that the earlier confounded run had reported. We deliberately stop short of a memory-efficiency claim from that sweep alone: KV-cache occupancy never exceeded 8.8% of capacity in it, so the regime in which the analytical saving would matter was not entered there. A redesigned controller ablation, using real contexts and a deliberately constrained cache pool, subsequently did reach that regime, driving occupancy up to 99.2% and the controller's ratio across its full configured range (0.20-0.80); the adaptive mechanism is accordingly now shown to engage under genuine cache pressure, though the dynamic condition retained more context than a fixed r = 0.5 comparison throughout most of that run and was not faster on TTFT or latency, so whether adapting the ratio helps, rather than merely occurring, was left open at that point. </w:t>
+      </w:r>
+      <w:r>
+        <w:rPr>
+          <w:highlight w:val="yellow"/>
+        </w:rPr>
+        <w:t xml:space="preserve">A follow-up comparison against a fixed ratio matched to the controller's own realized mean, run under the same cache pressure (Section 4.12), has since closed that question with a mixed result: the dynamic controller has lower mean TTFT and total latency, but a worse p95 TTFT and fewer completed requests than the matched fixed ratio, and no answer-quality data were collected for either arm, so adapting the ratio is not shown to be an improvement over a well-chosen fixed one. A separate true end-to-end online benchmark (Section 4.11), which scores and prunes context inside the live request path rather than reading it from a precomputed lookup, further finds that LSPM's throughput and completion rate degrade substantially relative to raw serving as concurrency rises, in contrast to the generation-only zero-measurable-penalty result reported above. </w:t>
+      </w:r>
+      <w:r>
+        <w:rPr/>
+        <w:t xml:space="preserve">We also closed the two most important remaining gaps: a token-budget-matched rerun, in which naive truncation receives the same per-question token budget LSPM actually spent, reproduces the r = 0.3 advantage (+0.140 F1, Holm-adjusted p = 0.0003), and a head-to-head comparison against LLMLingua-2, a modern learned compressor, finds LSPM significantly ahead on token-F1 at all three ratios tested, most convincingly at r = 0.3 and 0.5 (largest gap +0.211 at r = 0.3). The central r = 0.3 result also generalizes to a second generator, Qwen2.5-7B-Instruct, with the same or greater statistical strength than on the original generator. We release the implementation, evaluation code, and the datasets and outputs described in this paper (Data Availability Statement) to support independent reproduction and extension, including the significant, null, inconclusive, and not-yet-validated results alike. Finally, because the original n = 140 sample size was derived from an internal pilot that is a subset of the same 140 questions, we additionally ran an independent replication on 140 freshly sampled ARCD questions sharing no question identifiers with the original set (Section 4.10): the r = 0.3 advantage over naive truncation and the equivalence of LSPM to the unpruned answer both reproduce there with equal or greater statistical strength, so the central finding is now independently confirmed rather than resting on the original sample alone.</w:t>
       </w:r>
     </w:p>
     <w:p>
@@ -8464,7 +11568,7 @@
       </w:r>
       <w:r>
         <w:rPr/>
-        <w:t xml:space="preserve">This research received no external funding. Inference costs for the hosted-API experiments were incurred against a free-tier allowance, and the GPU benchmark and controller ablation were run on a short-term rented single-GPU cloud instance at the authors' own expense.</w:t>
+        <w:t xml:space="preserve">This research received no external funding. Inference costs for the hosted-API experiments were incurred against a free-tier allowance, and the GPU benchmark, controller ablation, true end-to-end online serving benchmark (Section 4.11), and controller-versus-matched-fixed-ratio comparison (Section 4.12) were run on rented single-GPU cloud instances at the authors' own expense.</w:t>
       </w:r>
     </w:p>
     <w:p>
@@ -8515,7 +11619,7 @@
       </w:r>
       <w:r>
         <w:rPr/>
-        <w:t xml:space="preserve">The datasets, evaluation outputs, GPU benchmark results, and implementation are publicly released at https://github.com/Akramtaha98/vllm-arabic-rag: the LSPM middleware, evaluation scripts, statistical analysis scripts, and benchmarking harness; the tokenization and fidelity/baseline pilot datasets; the ARCD ground-truth re-test dataset and code; and the end-to-end retrieval check dataset and code. For the corrected GPU benchmark of Section 4.6, the complete raw per-cell artifacts of all 105 runs are released under results/sweep_v2/rep1, rep2, and rep3 (one Locust statistics file, statistics history, failure and exception log, and per-second vLLM /metrics scrape per cell), together with the harness that produced them (precompute_contexts.py, run_full_sweep.py --repeats 3) and the analysis script (analyze_sweep_results.py) that aggregates them into the released summary (results/sweep_summary_v2.csv) and the comparison figure reproduced as Figure 2 (results/sweep_comparison_v2.png); every number reported in Section 4.6 and in Tables 3 and 4 is recomputable from the released raw artifacts by re-running that script. For the controller ablation of Section 4.7, the full per-request logs of both conditions are released under results/controller_ablation (fixed_ratio_log.jsonl, 2,294 requests; dynamic_ratio_log.jsonl, 2,302 requests), each row recording the ratio used, the KV-cache occupancy read at request time, TTFT, and total latency, alongside the harness (run_controller_ablation.py). For the redesigned controller ablation of Section 4.7, the full per-request logs of both conditions are released under results/controller_ablation_v2 (fixed_ratio_log.jsonl, 653 requests; dynamic_ratio_log.jsonl, 655 requests), alongside the harness that produced them (benchmark/run_controller_ablation_v2.py); the earlier, non-adaptive ablation's logs remain available unchanged under results/controller_ablation for comparison. The token-budget-matched and modern-compression-baseline comparisons of Section 4.8 are released as data/arcd_token_budget_results.jsonl and data/arcd_llmlingua2_results.jsonl (140 questions x 3 ratios each, 420 rows), alongside the harnesses that produced them (scripts/run_arcd_token_budget.py, scripts/run_arcd_llmlingua2_baseline.py), and the Qwen2.5-7B-Instruct generalization check of Section 4.9 is released as data/arcd_qwen25_results.jsonl (140 questions x 7 conditions, 980 rows, scripts/run_arcd_qwen25_baseline.py). The fresh-seed disjoint replication of Section 4.10 is released as data/arcd_eval_set_replication.json (the 140 freshly sampled questions, verified to share no question identifiers with the original set) and data/arcd_replication_results.jsonl (140 questions x 3 conditions, 420 rows), together with the scripts that produced them (scripts/build_arcd_eval_set_replication.py, scripts/run_arcd_replication.py, scripts/score_arcd_replication.py). Every Exact Match and token-F1 figure in this paper, including Table 2, is computed with one scorer, released as scripts/score_arcd.py; a differently named scorer, eval/arabic_em_f1.py, is referenced by some internal analysis scripts but is not present in this released repository. The prompt-token counts of Section 4.3 are released as results/arcd_prompt_tokens.jsonl (one row per each of the 980 cells, recording context characters, retained sentences, context tokens, and full prompt tokens) together with the offline replay script that produced them (compute_prompt_tokens.py, which also re-verifies every reconstructed context against the character and sentence counts recorded by the live run) and the summary script that derives the reported means, paired differences, bootstrap intervals, and KV-cache byte projection (summarize_prompt_tokens.py). The repository also still contains the aggregated summary of the earlier, superseded single-run sweep (results/sweep_summary.csv); its per-request logs were generated on a temporary rented cloud instance and were not preserved, which is why this manuscript no longer draws on it for any claim. This repository was tagged and archived on Zenodo (version DOI: 10.5281/zenodo.22344200; concept DOI, always resolving to the latest version: 10.5281/zenodo.21936820).</w:t>
+        <w:t xml:space="preserve">The datasets, evaluation outputs, GPU benchmark results, and implementation are publicly released at https://github.com/Akramtaha98/vllm-arabic-rag: the LSPM middleware, evaluation scripts, statistical analysis scripts, and benchmarking harness; the tokenization and fidelity/baseline pilot datasets; the ARCD ground-truth re-test dataset and code; and the end-to-end retrieval check dataset and code. For the corrected GPU benchmark of Section 4.6, the complete raw per-cell artifacts of all 105 runs are released under results/sweep_v2/rep1, rep2, and rep3 (one Locust statistics file, statistics history, failure and exception log, and per-second vLLM /metrics scrape per cell), together with the harness that produced them (precompute_contexts.py, run_full_sweep.py --repeats 3) and the analysis script (analyze_sweep_results.py) that aggregates them into the released summary (results/sweep_summary_v2.csv) and the comparison figure reproduced as Figure 2 (results/sweep_comparison_v2.png); every number reported in Section 4.6 and in Tables 3 and 4 is recomputable from the released raw artifacts by re-running that script. For the controller ablation of Section 4.7, the full per-request logs of both conditions are released under results/controller_ablation (fixed_ratio_log.jsonl, 2,294 requests; dynamic_ratio_log.jsonl, 2,302 requests), each row recording the ratio used, the KV-cache occupancy read at request time, TTFT, and total latency, alongside the harness (run_controller_ablation.py). For the redesigned controller ablation of Section 4.7, the full per-request logs of both conditions are released under results/controller_ablation_v2 (fixed_ratio_log.jsonl, 653 requests; dynamic_ratio_log.jsonl, 655 requests), alongside the harness that produced them (benchmark/run_controller_ablation_v2.py); the earlier, non-adaptive ablation's logs remain available unchanged under results/controller_ablation for comparison. For the true end-to-end online serving benchmark of Section 4.11, the per-cell summary statistics for all three ratios tested are released as results/online_e2e_r03/summary.csv, results/online_e2e_r05/summary.csv, and results/online_e2e_r07/summary.csv, alongside the harness that produced them (benchmark/run_online_e2e_benchmark.py). For the controller-versus-matched-fixed-ratio comparison of Section 4.12, the full per-request logs of both conditions are released as results/controller_vs_matched/dynamic_log.jsonl (5,637 requests) and results/controller_vs_matched/matched_fixed_log.jsonl (6,299 requests), each row recording the condition, ratio in effect, KV-cache occupancy at request time, TTFT, and total latency, alongside the harness that produced them (scripts/run_controller_vs_matched_fixed.py); this run used the harness's --skip-quality flag, so no answer-quality logs accompany it. The token-budget-matched and modern-compression-baseline comparisons of Section 4.8 are released as data/arcd_token_budget_results.jsonl and data/arcd_llmlingua2_results.jsonl (140 questions x 3 ratios each, 420 rows), alongside the harnesses that produced them (scripts/run_arcd_token_budget.py, scripts/run_arcd_llmlingua2_baseline.py), and the Qwen2.5-7B-Instruct generalization check of Section 4.9 is released as data/arcd_qwen25_results.jsonl (140 questions x 7 conditions, 980 rows, scripts/run_arcd_qwen25_baseline.py). The fresh-seed disjoint replication of Section 4.10 is released as data/arcd_eval_set_replication.json (the 140 freshly sampled questions, verified to share no question identifiers with the original set) and data/arcd_replication_results.jsonl (140 questions x 3 conditions, 420 rows), together with the scripts that produced them (scripts/build_arcd_eval_set_replication.py, scripts/run_arcd_replication.py, scripts/score_arcd_replication.py). Every Exact Match and token-F1 figure in this paper, including Table 2, is computed with one scorer, released as scripts/score_arcd.py; a differently named scorer, eval/arabic_em_f1.py, is referenced by some internal analysis scripts but is not present in this released repository. The prompt-token counts of Section 4.3 are released as results/arcd_prompt_tokens.jsonl (one row per each of the 980 cells, recording context characters, retained sentences, context tokens, and full prompt tokens) together with the offline replay script that produced them (compute_prompt_tokens.py, which also re-verifies every reconstructed context against the character and sentence counts recorded by the live run) and the summary script that derives the reported means, paired differences, bootstrap intervals, and KV-cache byte projection (summarize_prompt_tokens.py). The repository also still contains the aggregated summary of the earlier, superseded single-run sweep (results/sweep_summary.csv); its per-request logs were generated on a temporary rented cloud instance and were not preserved, which is why this manuscript no longer draws on it for any claim. This repository was tagged and archived on Zenodo (version DOI: 10.5281/zenodo.22344200; concept DOI, always resolving to the latest version: 10.5281/zenodo.21936820).</w:t>
       </w:r>
     </w:p>
     <w:p>

</xml_diff>

<commit_message>
Fix hardware consistency (RTX 4090 48 GiB throughout, not 24 GiB) and update Zenodo version DOI to latest (V3.0, 10.5281/zenodo.22846964)
</commit_message>
<xml_diff>
--- a/paper/Information_Tarish_Arabic_RAG.docx
+++ b/paper/Information_Tarish_Arabic_RAG.docx
@@ -1283,7 +1283,7 @@
       </w:pPr>
       <w:r>
         <w:rPr/>
-        <w:t xml:space="preserve">Reproducibility details. Generation model: meta-llama/Llama-3.1-8B-Instruct, accessed for the fidelity, baseline, ARCD, and end-to-end experiments via NVIDIA NIM's hosted OpenAI-compatible API (model identifier meta/llama-3.1-8b-instruct, accessed August 2026; NIM resolves this identifier to a pinned checkpoint on its serving side, which we do not independently verify beyond the identifier string), temperature = 0, max 64 tokens (ARCD/end-to-end) or 200 tokens (fidelity pilot). The GPU benchmark and controller ablation described in Sections 4.6 and 4.7 instead self-host the same model (bf16, --max-model-len 8192, served via the NousResearch mirror of the checkpoint to avoid the gated-repository dependency) under vLLM 0.28.0 on a single rented RTX 4090 (24 GiB). The server version and hardware for that run are recorded here from the authors' deployment record; the released per-cell artifacts capture the measurements but do not themselves embed a server version string, which we note rather than imply otherwise. Cross-encoder: cross-encoder/mmarco-mMiniLMv2-L12-H384-v1. Random seeds: SEED = 42 (Python random, ARCD sampling and distractor selection), numpy.random.default_rng(seed=42) (bootstrap resampling), seed = 123 (end-to-end retrieval question sample). Analysis code: Python 3.10, scipy 1.15, numpy 2.2. Complete source, configuration, and launch scripts are released (Data Availability Statement).</w:t>
+        <w:t xml:space="preserve">Reproducibility details. Generation model: meta-llama/Llama-3.1-8B-Instruct, accessed for the fidelity, baseline, ARCD, and end-to-end experiments via NVIDIA NIM's hosted OpenAI-compatible API (model identifier meta/llama-3.1-8b-instruct, accessed August 2026; NIM resolves this identifier to a pinned checkpoint on its serving side, which we do not independently verify beyond the identifier string), temperature = 0, max 64 tokens (ARCD/end-to-end) or 200 tokens (fidelity pilot). The GPU benchmark and controller ablation described in Sections 4.6 and 4.7 instead self-host the same model (bf16, --max-model-len 8192, served via the NousResearch mirror of the checkpoint to avoid the gated-repository dependency) under vLLM 0.28.0 on a single rented RTX 4090 (48 GiB). The server version and hardware for that run are recorded here from the authors' deployment record; the released per-cell artifacts capture the measurements but do not themselves embed a server version string, which we note rather than imply otherwise. Cross-encoder: cross-encoder/mmarco-mMiniLMv2-L12-H384-v1. Random seeds: SEED = 42 (Python random, ARCD sampling and distractor selection), numpy.random.default_rng(seed=42) (bootstrap resampling), seed = 123 (end-to-end retrieval question sample). Analysis code: Python 3.10, scipy 1.15, numpy 2.2. Complete source, configuration, and launch scripts are released (Data Availability Statement).</w:t>
       </w:r>
     </w:p>
     <w:p>
@@ -1352,7 +1352,7 @@
       </w:r>
       <w:r>
         <w:rPr/>
-        <w:t xml:space="preserve">This benchmark measures what pruning costs, or saves, in real serving terms: request throughput, time-to-first-token, and KV-cache occupancy as a percentage of capacity, under controlled concurrent load. It is not a test of the analytical KV-cache projection of Section 4.3; that projection is denominated in bytes per request, whereas this benchmark reports occupancy as a fraction of the engine's total cache capacity. A Locust-based harness issued concurrent chat-completion requests against a self-hosted vLLM server (Llama-3.1-8B-Instruct, bf16, --max-model-len 8192) on a single rented RTX 4090. The design is a seven-by-five grid: seven context conditions (raw, i.e. unpruned; LSPM at r in {0.3, 0.5, 0.7}; and naive sentence-count-matched truncation at the same three ratios) crossed with five concurrency levels (1, 10, 25, 50, and 100 concurrent clients), giving 35 cells, each repeated three times, for 105 independent 90-second load-generation runs. Two confounds present in an earlier, exploratory run (now superseded; disposition in the Data Availability Statement) are removed by construction here: pruned contexts are precomputed offline (precompute_contexts.py) and looked up by key at request time, so no cross-encoder scoring runs inside the load generator for any method at any concurrency level; and all 105 cells are pooled and shuffled under a fixed seed before execution (run_full_sweep.py --repeats 3), so elapsed run time and warm-up state are decorrelated from method identity rather than confounded with it. One control this design calls for was not implemented in the released harness: the server is not restarted between blocks but runs continuously across the shuffled cell order, which randomizes rather than eliminates server-state drift; we disclose this gap rather than describe a control we did not exercise. Every cell is the mean of its three repeats with a 95% confidence interval computed from the t-distribution across repeats.</w:t>
+        <w:t xml:space="preserve">This benchmark measures what pruning costs, or saves, in real serving terms: request throughput, time-to-first-token, and KV-cache occupancy as a percentage of capacity, under controlled concurrent load. It is not a test of the analytical KV-cache projection of Section 4.3; that projection is denominated in bytes per request, whereas this benchmark reports occupancy as a fraction of the engine's total cache capacity. A Locust-based harness issued concurrent chat-completion requests against a self-hosted vLLM server (Llama-3.1-8B-Instruct, bf16, --max-model-len 8192) on a single rented RTX 4090 (48 GiB). The design is a seven-by-five grid: seven context conditions (raw, i.e. unpruned; LSPM at r in {0.3, 0.5, 0.7}; and naive sentence-count-matched truncation at the same three ratios) crossed with five concurrency levels (1, 10, 25, 50, and 100 concurrent clients), giving 35 cells, each repeated three times, for 105 independent 90-second load-generation runs. Two confounds present in an earlier, exploratory run (now superseded; disposition in the Data Availability Statement) are removed by construction here: pruned contexts are precomputed offline (precompute_contexts.py) and looked up by key at request time, so no cross-encoder scoring runs inside the load generator for any method at any concurrency level; and all 105 cells are pooled and shuffled under a fixed seed before execution (run_full_sweep.py --repeats 3), so elapsed run time and warm-up state are decorrelated from method identity rather than confounded with it. One control this design calls for was not implemented in the released harness: the server is not restarted between blocks but runs continuously across the shuffled cell order, which randomizes rather than eliminates server-state drift; we disclose this gap rather than describe a control we did not exercise. Every cell is the mean of its three repeats with a 95% confidence interval computed from the t-distribution across repeats.</w:t>
       </w:r>
     </w:p>
     <w:p>
@@ -1368,7 +1368,7 @@
       </w:r>
       <w:r>
         <w:rPr/>
-        <w:t xml:space="preserve">The dynamic compression-ratio controller of Section 3.1 was first exercised in a ramping-load ablation against the same self-hosted vLLM server: 60 s per step at 4, 8, 32, 32, 8, and 4 concurrent workers, six minutes per condition, run once with the ratio held constant at r = 0.5 and once with the controller re-polling vLLM's live /metrics endpoint before every request; full per-request logs (ratio used, KV-cache occupancy read at request time, TTFT, total latency) were preserved and released as results/controller_ablation. We identified two reasons this original design could under-stress the controller and corrected both for a redesigned run, disclosing the change rather than silently rerunning until a preferred result appeared: first, the original ablation used a small synthetic corpus (~240 tokens per context) rather than the realistic contexts this paper's own workload produces (mean 1,485.6 prompt tokens per request, Section 4.3); second, it ran against a server started at vLLM's default cache utilization (--gpu-memory-utilization ~0.9 on the 24 GiB card used throughout this paper), leaving a KV-cache pool large enough that even 32 concurrent requests barely dented it. The redesigned ablation (v2, results/controller_ablation_v2) uses the real 140-question ARCD context pool in place of the synthetic corpus, a higher concurrency ramp (six 90 s steps at 10, 30, 80, 80, 30, and 10 concurrent workers per condition), and a server deliberately started at --gpu-memory-utilization 0.3, a smaller cache pool chosen specifically to make the cache-pressure threshold reachable on a single rented GPU without requiring an unrealistic request volume. This is a disclosed methodological choice made to observe the controller's adaptive path at all, not a claim about a recommended production cache setting, and the two ablations are consequently not run under the same server configuration; only the redesigned run should be read as evidence about adaptive behaviour.</w:t>
+        <w:t xml:space="preserve">The dynamic compression-ratio controller of Section 3.1 was first exercised in a ramping-load ablation against the same self-hosted vLLM server: 60 s per step at 4, 8, 32, 32, 8, and 4 concurrent workers, six minutes per condition, run once with the ratio held constant at r = 0.5 and once with the controller re-polling vLLM's live /metrics endpoint before every request; full per-request logs (ratio used, KV-cache occupancy read at request time, TTFT, total latency) were preserved and released as results/controller_ablation. We identified two reasons this original design could under-stress the controller and corrected both for a redesigned run, disclosing the change rather than silently rerunning until a preferred result appeared: first, the original ablation used a small synthetic corpus (~240 tokens per context) rather than the realistic contexts this paper's own workload produces (mean 1,485.6 prompt tokens per request, Section 4.3); second, it ran against a server started at vLLM's default cache utilization (--gpu-memory-utilization ~0.9 on the 48 GiB card used throughout this paper), leaving a KV-cache pool large enough that even 32 concurrent requests barely dented it. The redesigned ablation (v2, results/controller_ablation_v2) uses the real 140-question ARCD context pool in place of the synthetic corpus, a higher concurrency ramp (six 90 s steps at 10, 30, 80, 80, 30, and 10 concurrent workers per condition), and a server deliberately started at --gpu-memory-utilization 0.3, a smaller cache pool chosen specifically to make the cache-pressure threshold reachable on a single rented GPU without requiring an unrealistic request volume. This is a disclosed methodological choice made to observe the controller's adaptive path at all, not a claim about a recommended production cache setting, and the two ablations are consequently not run under the same server configuration; only the redesigned run should be read as evidence about adaptive behaviour.</w:t>
       </w:r>
     </w:p>
     <w:p>
@@ -3841,7 +3841,7 @@
         <w:rPr>
           <w:b/>
         </w:rPr>
-        <w:t xml:space="preserve">Table 4. GPU benchmark at the highest concurrency tested (c = 100 concurrent clients), self-hosted vLLM serving Llama-3.1-8B-Instruct on a single RTX 4090. Each entry is the mean of three independent 90-second repeats with a 95% confidence interval across repeats. KV columns are percentages of total KV-cache capacity (vLLM's gpu_cache_usage_perc gauge x 100). All 105 runs across the full 35-cell grid completed with zero request failures.</w:t>
+        <w:t xml:space="preserve">Table 4. GPU benchmark at the highest concurrency tested (c = 100 concurrent clients), self-hosted vLLM serving Llama-3.1-8B-Instruct on a single RTX 4090 (48 GiB). Each entry is the mean of three independent 90-second repeats with a 95% confidence interval across repeats. KV columns are percentages of total KV-cache capacity (vLLM's gpu_cache_usage_perc gauge x 100). All 105 runs across the full 35-cell grid completed with zero request failures.</w:t>
       </w:r>
     </w:p>
     <w:tbl>
@@ -11619,7 +11619,7 @@
       </w:r>
       <w:r>
         <w:rPr/>
-        <w:t xml:space="preserve">The datasets, evaluation outputs, GPU benchmark results, and implementation are publicly released at https://github.com/Akramtaha98/vllm-arabic-rag: the LSPM middleware, evaluation scripts, statistical analysis scripts, and benchmarking harness; the tokenization and fidelity/baseline pilot datasets; the ARCD ground-truth re-test dataset and code; and the end-to-end retrieval check dataset and code. For the corrected GPU benchmark of Section 4.6, the complete raw per-cell artifacts of all 105 runs are released under results/sweep_v2/rep1, rep2, and rep3 (one Locust statistics file, statistics history, failure and exception log, and per-second vLLM /metrics scrape per cell), together with the harness that produced them (precompute_contexts.py, run_full_sweep.py --repeats 3) and the analysis script (analyze_sweep_results.py) that aggregates them into the released summary (results/sweep_summary_v2.csv) and the comparison figure reproduced as Figure 2 (results/sweep_comparison_v2.png); every number reported in Section 4.6 and in Tables 3 and 4 is recomputable from the released raw artifacts by re-running that script. For the controller ablation of Section 4.7, the full per-request logs of both conditions are released under results/controller_ablation (fixed_ratio_log.jsonl, 2,294 requests; dynamic_ratio_log.jsonl, 2,302 requests), each row recording the ratio used, the KV-cache occupancy read at request time, TTFT, and total latency, alongside the harness (run_controller_ablation.py). For the redesigned controller ablation of Section 4.7, the full per-request logs of both conditions are released under results/controller_ablation_v2 (fixed_ratio_log.jsonl, 653 requests; dynamic_ratio_log.jsonl, 655 requests), alongside the harness that produced them (benchmark/run_controller_ablation_v2.py); the earlier, non-adaptive ablation's logs remain available unchanged under results/controller_ablation for comparison. For the true end-to-end online serving benchmark of Section 4.11, the per-cell summary statistics for all three ratios tested are released as results/online_e2e_r03/summary.csv, results/online_e2e_r05/summary.csv, and results/online_e2e_r07/summary.csv, alongside the harness that produced them (benchmark/run_online_e2e_benchmark.py). For the controller-versus-matched-fixed-ratio comparison of Section 4.12, the full per-request logs of both conditions are released as results/controller_vs_matched/dynamic_log.jsonl (5,637 requests) and results/controller_vs_matched/matched_fixed_log.jsonl (6,299 requests), each row recording the condition, ratio in effect, KV-cache occupancy at request time, TTFT, and total latency, alongside the harness that produced them (scripts/run_controller_vs_matched_fixed.py); this run used the harness's --skip-quality flag, so no answer-quality logs accompany it. The token-budget-matched and modern-compression-baseline comparisons of Section 4.8 are released as data/arcd_token_budget_results.jsonl and data/arcd_llmlingua2_results.jsonl (140 questions x 3 ratios each, 420 rows), alongside the harnesses that produced them (scripts/run_arcd_token_budget.py, scripts/run_arcd_llmlingua2_baseline.py), and the Qwen2.5-7B-Instruct generalization check of Section 4.9 is released as data/arcd_qwen25_results.jsonl (140 questions x 7 conditions, 980 rows, scripts/run_arcd_qwen25_baseline.py). The fresh-seed disjoint replication of Section 4.10 is released as data/arcd_eval_set_replication.json (the 140 freshly sampled questions, verified to share no question identifiers with the original set) and data/arcd_replication_results.jsonl (140 questions x 3 conditions, 420 rows), together with the scripts that produced them (scripts/build_arcd_eval_set_replication.py, scripts/run_arcd_replication.py, scripts/score_arcd_replication.py). Every Exact Match and token-F1 figure in this paper, including Table 2, is computed with one scorer, released as scripts/score_arcd.py; a differently named scorer, eval/arabic_em_f1.py, is referenced by some internal analysis scripts but is not present in this released repository. The prompt-token counts of Section 4.3 are released as results/arcd_prompt_tokens.jsonl (one row per each of the 980 cells, recording context characters, retained sentences, context tokens, and full prompt tokens) together with the offline replay script that produced them (compute_prompt_tokens.py, which also re-verifies every reconstructed context against the character and sentence counts recorded by the live run) and the summary script that derives the reported means, paired differences, bootstrap intervals, and KV-cache byte projection (summarize_prompt_tokens.py). The repository also still contains the aggregated summary of the earlier, superseded single-run sweep (results/sweep_summary.csv); its per-request logs were generated on a temporary rented cloud instance and were not preserved, which is why this manuscript no longer draws on it for any claim. This repository was tagged and archived on Zenodo (version DOI: 10.5281/zenodo.22344200; concept DOI, always resolving to the latest version: 10.5281/zenodo.21936820).</w:t>
+        <w:t xml:space="preserve">The datasets, evaluation outputs, GPU benchmark results, and implementation are publicly released at https://github.com/Akramtaha98/vllm-arabic-rag: the LSPM middleware, evaluation scripts, statistical analysis scripts, and benchmarking harness; the tokenization and fidelity/baseline pilot datasets; the ARCD ground-truth re-test dataset and code; and the end-to-end retrieval check dataset and code. For the corrected GPU benchmark of Section 4.6, the complete raw per-cell artifacts of all 105 runs are released under results/sweep_v2/rep1, rep2, and rep3 (one Locust statistics file, statistics history, failure and exception log, and per-second vLLM /metrics scrape per cell), together with the harness that produced them (precompute_contexts.py, run_full_sweep.py --repeats 3) and the analysis script (analyze_sweep_results.py) that aggregates them into the released summary (results/sweep_summary_v2.csv) and the comparison figure reproduced as Figure 2 (results/sweep_comparison_v2.png); every number reported in Section 4.6 and in Tables 3 and 4 is recomputable from the released raw artifacts by re-running that script. For the controller ablation of Section 4.7, the full per-request logs of both conditions are released under results/controller_ablation (fixed_ratio_log.jsonl, 2,294 requests; dynamic_ratio_log.jsonl, 2,302 requests), each row recording the ratio used, the KV-cache occupancy read at request time, TTFT, and total latency, alongside the harness (run_controller_ablation.py). For the redesigned controller ablation of Section 4.7, the full per-request logs of both conditions are released under results/controller_ablation_v2 (fixed_ratio_log.jsonl, 653 requests; dynamic_ratio_log.jsonl, 655 requests), alongside the harness that produced them (benchmark/run_controller_ablation_v2.py); the earlier, non-adaptive ablation's logs remain available unchanged under results/controller_ablation for comparison. For the true end-to-end online serving benchmark of Section 4.11, the per-cell summary statistics for all three ratios tested are released as results/online_e2e_r03/summary.csv, results/online_e2e_r05/summary.csv, and results/online_e2e_r07/summary.csv, alongside the harness that produced them (benchmark/run_online_e2e_benchmark.py). For the controller-versus-matched-fixed-ratio comparison of Section 4.12, the full per-request logs of both conditions are released as results/controller_vs_matched/dynamic_log.jsonl (5,637 requests) and results/controller_vs_matched/matched_fixed_log.jsonl (6,299 requests), each row recording the condition, ratio in effect, KV-cache occupancy at request time, TTFT, and total latency, alongside the harness that produced them (scripts/run_controller_vs_matched_fixed.py); this run used the harness's --skip-quality flag, so no answer-quality logs accompany it. The token-budget-matched and modern-compression-baseline comparisons of Section 4.8 are released as data/arcd_token_budget_results.jsonl and data/arcd_llmlingua2_results.jsonl (140 questions x 3 ratios each, 420 rows), alongside the harnesses that produced them (scripts/run_arcd_token_budget.py, scripts/run_arcd_llmlingua2_baseline.py), and the Qwen2.5-7B-Instruct generalization check of Section 4.9 is released as data/arcd_qwen25_results.jsonl (140 questions x 7 conditions, 980 rows, scripts/run_arcd_qwen25_baseline.py). The fresh-seed disjoint replication of Section 4.10 is released as data/arcd_eval_set_replication.json (the 140 freshly sampled questions, verified to share no question identifiers with the original set) and data/arcd_replication_results.jsonl (140 questions x 3 conditions, 420 rows), together with the scripts that produced them (scripts/build_arcd_eval_set_replication.py, scripts/run_arcd_replication.py, scripts/score_arcd_replication.py). Every Exact Match and token-F1 figure in this paper, including Table 2, is computed with one scorer, released as scripts/score_arcd.py; a differently named scorer, eval/arabic_em_f1.py, is referenced by some internal analysis scripts but is not present in this released repository. The prompt-token counts of Section 4.3 are released as results/arcd_prompt_tokens.jsonl (one row per each of the 980 cells, recording context characters, retained sentences, context tokens, and full prompt tokens) together with the offline replay script that produced them (compute_prompt_tokens.py, which also re-verifies every reconstructed context against the character and sentence counts recorded by the live run) and the summary script that derives the reported means, paired differences, bootstrap intervals, and KV-cache byte projection (summarize_prompt_tokens.py). The repository also still contains the aggregated summary of the earlier, superseded single-run sweep (results/sweep_summary.csv); its per-request logs were generated on a temporary rented cloud instance and were not preserved, which is why this manuscript no longer draws on it for any claim. This repository was tagged and archived on Zenodo (version DOI: 10.5281/zenodo.22846964; concept DOI, always resolving to the latest version: 10.5281/zenodo.21936820).</w:t>
       </w:r>
     </w:p>
     <w:p>

</xml_diff>

<commit_message>
Fix contradictions and add methodological caveats flagged by external review
- Resolve backend-variance 'not measured' vs Sec 5(4b) contradiction
- Disambiguate duplicate 'single most important gap' claims (Sec 3.4/3.5.4)
- Fix stale Sec 4.7 text claiming matched-fixed comparison 'has not been run'
- Fix subsection count (six -> eight) and extend Intro roadmap to 4.8-4.12
- Disclose Sec 4.11/4.12 methodological limits: shared unbatched cross-encoder
  contending with vLLM on the same GPU, single run per cell (no CI), no
  significance test on Sec 4.12 latency gaps, fixed (non-counterbalanced)
  run order, and ratio-matched (not literally token-matched) controller arms
- Confirm Sec 4.12 used the same --gpu-memory-utilization 0.3 as Sec 4.7
</commit_message>
<xml_diff>
--- a/paper/Information_Tarish_Arabic_RAG.docx
+++ b/paper/Information_Tarish_Arabic_RAG.docx
@@ -397,7 +397,7 @@
       </w:pPr>
       <w:r>
         <w:rPr/>
-        <w:t xml:space="preserve">The remainder of this paper is organized as follows. Section 2 reviews related work in context compression, retrieval, and Arabic natural language processing, and positions LSPM's contribution relative to it. Section 3 describes LSPM's architecture, the experimental setup, and the reproducibility details needed to replicate every reported result. Section 4 reports the quantitative results: tokenization disparity, the ARCD baseline comparison, the end-to-end retrieval check, the human evaluation, the corrected GPU benchmark, and the dynamic-controller ablation. Section 5 discusses what these results do and do not establish, states the study's limitations explicitly, and outlines the experiments required before a systems-level deployment claim would be justified. Section 6 concludes.</w:t>
+        <w:t xml:space="preserve">The remainder of this paper is organized as follows. Section 2 reviews related work in context compression, retrieval, and Arabic natural language processing, and positions LSPM's contribution relative to it. Section 3 describes LSPM's architecture, the experimental setup, and the reproducibility details needed to replicate every reported result. Section 4 reports the quantitative results: tokenization disparity, the ARCD baseline comparison, the end-to-end retrieval check, the human evaluation, the corrected GPU benchmark, and the dynamic-controller ablation (Sections 4.1-4.7), followed by three further validation studies (Sections 4.8-4.10) and two studies run specifically in response to peer review, a true end-to-end online serving benchmark and a controller-versus-matched-fixed-ratio comparison (Sections 4.11-4.12). Section 5 discusses what these results do and do not establish, states the study's limitations explicitly, and outlines the experiments required before a systems-level deployment claim would be justified. Section 6 concludes.</w:t>
       </w:r>
     </w:p>
     <w:p>
@@ -534,7 +534,7 @@
         <w:rPr>
           <w:highlight w:val="yellow"/>
         </w:rPr>
-        <w:t xml:space="preserve">It then pairs every extracted sentence with the query and scores it with a cross-encoder; the reference implementation supports a fast MiniLM-family backend for interactive use or a BGE-reranker-v2-m3 backend for maximal accuracy as a configurable choice, and cross-encoder/mmarco-mMiniLMv2-L12-H384-v1 specifically is the model used to produce every result reported in this paper (Section 3.3); none of this paper's quality or serving-cost results were reproduced on the BGE-reranker-v2-m3 backend or any other cross-encoder, so backend-to-backend variance in either scoring quality or scoring latency is not measured here and should not be assumed to be small (Section 5). This scoring step has a measured mean latency of 506.1 ms, single-request and CPU-only, over the same six-document candidate pool used in this paper's main baseline comparison (420 real measurements, Section 4.3); Section 4.11 reports the GPU-accelerated figure this same step produces when it runs on the same GPU as the vLLM server, inside a live concurrent-load benchmark. Every throughput/latency comparison in this paper that is described as "generation-only" (Sections 4.6, 5, and 6) reads contexts from a precomputed lookup and therefore measures the vLLM server's generation cost alone, excluding this 506.1 ms CPU cross-encoder cost; it is not an end-to-end online-serving measurement, and should not be read as one. The highest-scoring sentences are retained, in their original order, up to a target compression ratio r (the fraction of sentences kept), and reassembled into a compact context that is handed to the generator running behind a vLLM server.</w:t>
+        <w:t xml:space="preserve">It then pairs every extracted sentence with the query and scores it with a cross-encoder; the reference implementation supports a fast MiniLM-family backend for interactive use or a BGE-reranker-v2-m3 backend for maximal accuracy as a configurable choice, and cross-encoder/mmarco-mMiniLMv2-L12-H384-v1 specifically is the model used to produce every result reported in this paper (Section 3.3); none of this paper's quality or serving-cost results were reproduced on the BGE-reranker-v2-m3 backend or any other cross-encoder at this paper's full scale; a targeted 20-question check against that second backend is reported in Section 5, item (4b), so backend-to-backend variance is measured on a small subset rather than not measured at all, and should not be assumed to be small beyond that subset. This scoring step has a measured mean latency of 506.1 ms, single-request and CPU-only, over the same six-document candidate pool used in this paper's main baseline comparison (420 real measurements, Section 4.3); Section 4.11 reports the GPU-accelerated figure this same step produces when it runs on the same GPU as the vLLM server, inside a live concurrent-load benchmark. Every throughput/latency comparison in this paper that is described as "generation-only" (Sections 4.6, 5, and 6) reads contexts from a precomputed lookup and therefore measures the vLLM server's generation cost alone, excluding this 506.1 ms CPU cross-encoder cost; it is not an end-to-end online-serving measurement, and should not be read as one. The highest-scoring sentences are retained, in their original order, up to a target compression ratio r (the fraction of sentences kept), and reassembled into a compact context that is handed to the generator running behind a vLLM server.</w:t>
       </w:r>
     </w:p>
     <w:p>
@@ -1257,7 +1257,7 @@
       </w:pPr>
       <w:r>
         <w:rPr/>
-        <w:t xml:space="preserve">ARCD ground-truth re-test (n = 140): to address the small pilot's scale and its scoring against the unpruned answer rather than a real gold answer, we sampled 140 questions from ARCD's validation split [50] (seed = 42), built a six-document pool per question guaranteeing the gold paragraph is present (recall@6 = 100% by design) plus five distractors from unrelated articles, and generated seven answers per question against the live Llama-3.1-8B-Instruct endpoint: raw (unpruned), LSPM at r in {0.3, 0.5, 0.7}, and naive truncation at the same three ratios (980 live generations total). This candidate-pool construction is deliberate and should be read precisely for what it tests: the gold paragraph's guaranteed presence and the five unrelated-article distractors remove retrieval failure and topical-similarity confusion as variables, isolating post-retrieval sentence selection as the object of study. This is easier than a realistic retrieval setting, where the gold passage may not be retrieved at all and surviving distractors are often topically similar rather than drawn from unrelated articles; the claim this design supports is accordingly scoped to post-retrieval selection quality under controlled candidate-pool construction, not to end-to-end RAG accuracy under realistic full-corpus retrieval with hard, topically similar negatives. Section 4.4's end-to-end check relaxes the retrieval-failure half of this by allowing a real TF-IDF retriever to miss the gold paragraph outright, but its 234-paragraph corpus and single lexical retriever do not yet supply the harder, topically similar negatives that a larger corpus or a BM25/dense/hybrid retriever would; that stronger evaluation remains open work (Section 5). Answers are scored against ARCD's gold answer string(s) with Arabic-normalized Exact Match (EM) and token-F1. We report paired differences with bootstrap 95% CIs, Wilcoxon signed-rank tests, Holm-Bonferroni correction across a nine-test family, and a two one-sided equivalence test (TOST, margin +/-0.05 F1) against the raw answer, following the two one-sided tests procedure originally developed for bioequivalence testing [68] and its practical primer for behavioral and NLP-adjacent research [69], which we use here to distinguish a genuine null result (no evidence of a difference) from a positive finding that LSPM's pruned answer is statistically equivalent, within a pre-specified margin, to the unpruned answer. Both LSPM and naive truncation are matched by the number of sentences retained (the compression ratio r is applied identically to both, as a fraction of retained sentences); we did not additionally match the two methods by the number of retained input tokens, and because the sentences each method selects can differ substantially in length, an equal sentence count does not guarantee an equal token budget or equal KV-cache cost between the two conditions. This is disclosed explicitly as a limitation on the efficiency interpretation of the main comparison (Section 5); a token-budget-matched rerun, reporting actual prompt tokens entering the generator for every method and query, is identified as the single most important methodological correction needed before the comparison can be read as superiority at equal serving cost; Section 4.3 now reports those actual prompt-token counts, computed offline from the released artifacts, and the result is discussed there. All inferential tests in this paper use a two-sided alpha of 0.05, which is the level at which the Holm-Bonferroni family-wise correction, the 95% bootstrap confidence intervals, and the TOST equivalence tests reported below are all evaluated.</w:t>
+        <w:t xml:space="preserve">ARCD ground-truth re-test (n = 140): to address the small pilot's scale and its scoring against the unpruned answer rather than a real gold answer, we sampled 140 questions from ARCD's validation split [50] (seed = 42), built a six-document pool per question guaranteeing the gold paragraph is present (recall@6 = 100% by design) plus five distractors from unrelated articles, and generated seven answers per question against the live Llama-3.1-8B-Instruct endpoint: raw (unpruned), LSPM at r in {0.3, 0.5, 0.7}, and naive truncation at the same three ratios (980 live generations total). This candidate-pool construction is deliberate and should be read precisely for what it tests: the gold paragraph's guaranteed presence and the five unrelated-article distractors remove retrieval failure and topical-similarity confusion as variables, isolating post-retrieval sentence selection as the object of study. This is easier than a realistic retrieval setting, where the gold passage may not be retrieved at all and surviving distractors are often topically similar rather than drawn from unrelated articles; the claim this design supports is accordingly scoped to post-retrieval selection quality under controlled candidate-pool construction, not to end-to-end RAG accuracy under realistic full-corpus retrieval with hard, topically similar negatives. Section 4.4's end-to-end check relaxes the retrieval-failure half of this by allowing a real TF-IDF retriever to miss the gold paragraph outright, but its 234-paragraph corpus and single lexical retriever do not yet supply the harder, topically similar negatives that a larger corpus or a BM25/dense/hybrid retriever would; that stronger evaluation remains open work (Section 5). Answers are scored against ARCD's gold answer string(s) with Arabic-normalized Exact Match (EM) and token-F1. We report paired differences with bootstrap 95% CIs, Wilcoxon signed-rank tests, Holm-Bonferroni correction across a nine-test family, and a two one-sided equivalence test (TOST, margin +/-0.05 F1) against the raw answer, following the two one-sided tests procedure originally developed for bioequivalence testing [68] and its practical primer for behavioral and NLP-adjacent research [69], which we use here to distinguish a genuine null result (no evidence of a difference) from a positive finding that LSPM's pruned answer is statistically equivalent, within a pre-specified margin, to the unpruned answer. Both LSPM and naive truncation are matched by the number of sentences retained (the compression ratio r is applied identically to both, as a fraction of retained sentences); we did not additionally match the two methods by the number of retained input tokens, and because the sentences each method selects can differ substantially in length, an equal sentence count does not guarantee an equal token budget or equal KV-cache cost between the two conditions. This is disclosed explicitly as a limitation on the efficiency interpretation of the main comparison (Section 5). Two remedies close this gap, one analytical and one experimental: Section 4.3 reports the actual prompt tokens each method spent, computed offline from the released artifacts, which is a partial, descriptive fix (it shows what token budget the existing sentence-matched runs happened to use, without rerunning anything); Section 3.5.4 describes the fuller, experimental fix, a rerun in which naive truncation is given LSPM's own realized token budget directly rather than merely having it reported after the fact, with the result in Section 4.8. All inferential tests in this paper use a two-sided alpha of 0.05, which is the level at which the Holm-Bonferroni family-wise correction, the 95% bootstrap confidence intervals, and the TOST equivalence tests reported below are all evaluated.</w:t>
       </w:r>
     </w:p>
     <w:p>
@@ -1320,7 +1320,7 @@
       </w:pPr>
       <w:r>
         <w:rPr/>
-        <w:t xml:space="preserve">Beyond the core ARCD re-test above, this paper reports six further validation studies. To keep design decisions in Methods and outcomes in Results, this subsection specifies what each study did before Section 4 reports what each study found.</w:t>
+        <w:t xml:space="preserve">Beyond the core ARCD re-test above, this paper reports eight further validation studies. To keep design decisions in Methods and outcomes in Results, this subsection specifies what each study did before Section 4 reports what each study found.</w:t>
       </w:r>
     </w:p>
     <w:p>
@@ -1454,7 +1454,7 @@
         <w:rPr>
           <w:highlight w:val="yellow"/>
         </w:rPr>
-        <w:t xml:space="preserve">Section 4.7's redesigned ablation established that the dynamic ratio controller's adaptive path engages under real cache pressure (occupancy reaching 99.2%) but, because the dynamic and fixed arms were not matched on average retained context, could not show whether adapting the ratio outperforms a fixed one. To close that comparison directly, we ran a new script (scripts/run_controller_vs_matched_fixed.py) under the same deliberately constrained --gpu-memory-utilization cache pool as the redesigned ablation of Section 4.7, running two conditions back to back on the same RTX 4090 48 GiB card: "dynamic", in which the controller adjusts its ratio in response to live KV-cache occupancy exactly as in Section 4.7, and "matched_fixed", in which the ratio is held constant at the dynamic condition's own realized mean ratio for the run, so the two arms retain the same average amount of context. For every request in both conditions we logged the ratio in effect, the KV-cache occupancy at request time, TTFT, and total latency; the run was executed with the script's --skip-quality flag, so this comparison covers serving latency only and does not include an answer-quality comparison between the two conditions.</w:t>
+        <w:t xml:space="preserve">Section 4.7's redesigned ablation established that the dynamic ratio controller's adaptive path engages under real cache pressure (occupancy reaching 99.2%) but, because the dynamic and fixed arms were not matched on average compression ratio, could not show whether adapting the ratio outperforms a fixed one. To close that comparison directly, we ran a new script (scripts/run_controller_vs_matched_fixed.py) under the same --gpu-memory-utilization 0.3 constrained cache pool as the redesigned ablation of Section 4.7, running two conditions back to back on the same RTX 4090 48 GiB card: "dynamic", in which the controller adjusts its ratio in response to live KV-cache occupancy exactly as in Section 4.7, and "matched_fixed", in which the ratio is held constant at the dynamic condition's own realized mean ratio for the run, so the two arms retain the same average compression ratio (a proxy for, but not identical to, an average retained-token match; Section 4.12). For every request in both conditions we logged the ratio in effect, the KV-cache occupancy at request time, TTFT, and total latency; the run was executed with the script's --skip-quality flag, so this comparison covers serving latency only and does not include an answer-quality comparison between the two conditions.</w:t>
       </w:r>
     </w:p>
     <w:p>
@@ -5996,7 +5996,7 @@
       </w:pPr>
       <w:r>
         <w:rPr/>
-        <w:t xml:space="preserve">Two further observations temper how this table should be read. First, occupancy does not track the intended concurrency ramp cleanly: the highest per-step mean occupancy in the dynamic condition (34.4%) occurs in step 6, the final low-concurrency cool-down step, rather than in the peak 80-worker steps 3-4, which most plausibly reflects queued requests from the preceding high-load steps still occupying cache as the new, lighter step's traffic begins, or the coarseness of the once-per-request occupancy poll relative to a fast-moving queue, rather than a property of the controller itself; we report the numbers as measured rather than smoothing them into the cleaner story the intended step schedule would suggest. Second, the overall dynamic occupancy maximum of 99.2% is a request-level extreme not reflected in any single step's mean of 34.4% or below, so it should be read as a brief spike captured on the individual request that observed it, not as a sustained operating point; the ratio floor of 0.20 was reached at least transiently, most plausibly at or near that spike, but the controller spent the great majority of the run in the 0.58-0.80 band. What this redesigned ablation does and does not establish should therefore be stated as precisely as the original: it establishes that the adaptive mechanism engages under real cache pressure, reads the metric it is supposed to read, and returns values across its full configured range rather than only its ceiling; it does not establish that adapting improves throughput, tail latency, or answer quality relative to a fixed ratio, because the two conditions differ in average retained context throughout the run and are consequently not a context-matched comparison of control policy. The natural next step, a fixed-r = 0.8 versus dynamic comparison that matches the dynamic condition's typical operating ratio, has not been run and is recorded as an open item in Section 5.</w:t>
+        <w:t xml:space="preserve">Two further observations temper how this table should be read. First, occupancy does not track the intended concurrency ramp cleanly: the highest per-step mean occupancy in the dynamic condition (34.4%) occurs in step 6, the final low-concurrency cool-down step, rather than in the peak 80-worker steps 3-4, which most plausibly reflects queued requests from the preceding high-load steps still occupying cache as the new, lighter step's traffic begins, or the coarseness of the once-per-request occupancy poll relative to a fast-moving queue, rather than a property of the controller itself; we report the numbers as measured rather than smoothing them into the cleaner story the intended step schedule would suggest. Second, the overall dynamic occupancy maximum of 99.2% is a request-level extreme not reflected in any single step's mean of 34.4% or below, so it should be read as a brief spike captured on the individual request that observed it, not as a sustained operating point; the ratio floor of 0.20 was reached at least transiently, most plausibly at or near that spike, but the controller spent the great majority of the run in the 0.58-0.80 band. What this redesigned ablation does and does not establish should therefore be stated as precisely as the original: it establishes that the adaptive mechanism engages under real cache pressure, reads the metric it is supposed to read, and returns values across its full configured range rather than only its ceiling; it does not establish that adapting improves throughput, tail latency, or answer quality relative to a fixed ratio, because the two conditions differ in average retained context throughout the run and are consequently not a context-matched comparison of control policy. The natural next step proposed here was a fixed-r = 0.8 comparison, matching the dynamic condition's typical high-pressure operating ratio in this run. What has since been run (Section 4.12) instead matches the dynamic controller's own realized mean ratio over a fresh execution of the same load profile (0.565, not 0.8, since that fresh run's mean blends the low-pressure steps as well as the high-pressure ones); it finds a mixed result on serving latency between the two arms, with no answer-quality data collected, so this comparison is now closed on serving latency and remains open on answer quality (Section 5).</w:t>
       </w:r>
     </w:p>
     <w:p>
@@ -8257,7 +8257,7 @@
         <w:rPr>
           <w:b/>
         </w:rPr>
-        <w:t xml:space="preserve">Table 9. True end-to-end online serving benchmark at r = 0.5, four concurrency levels, 60 requests per (condition, concurrency) cell (protocol in Section 3.5.7). N is the count of requests that completed within the benchmark's timeout, out of 60 attempted. Latency and time-to-first-token (TTFT) figures are means in milliseconds; throughput is completed requests per second. Ratios r = 0.3 and r = 0.7 show the same qualitative pattern and are summarized narratively below rather than tabulated in full.</w:t>
+        <w:t xml:space="preserve">Table 9. True end-to-end online serving benchmark at r = 0.5, four concurrency levels, 60 requests per (condition, concurrency) cell, each cell run once (protocol in Section 3.5.7). N is the count of requests that received a complete streamed response, out of 60 attempted; the remainder either received an HTTP error or exceeded the script's 120-second per-request timeout, most often the latter under load. Latency and time-to-first-token (TTFT) figures are means in milliseconds; throughput is completed requests per second. Ratios r = 0.3 and r = 0.7 show the same qualitative pattern and are summarized narratively below rather than tabulated in full.</w:t>
       </w:r>
     </w:p>
     <w:tbl>
@@ -10465,17 +10465,6 @@
     </w:p>
     <w:p>
       <w:pPr>
-        <w:pStyle w:val="MDPI22heading2"/>
-        <w:spacing w:before="240" w:after="60"/>
-        <w:rPr/>
-      </w:pPr>
-      <w:r>
-        <w:rPr/>
-        <w:t xml:space="preserve">4.12. Controller versus Matched-Fixed-Ratio Comparison Under Memory Pressure</w:t>
-      </w:r>
-    </w:p>
-    <w:p>
-      <w:pPr>
         <w:pStyle w:val="MDPI31text"/>
         <w:rPr/>
       </w:pPr>
@@ -10483,7 +10472,30 @@
         <w:rPr>
           <w:highlight w:val="yellow"/>
         </w:rPr>
-        <w:t xml:space="preserve">Under the protocol of Section 3.5.8, we reran the dynamic controller and a fixed-ratio condition matched to the controller's own realized mean ratio back to back under the same constrained cache pool as Section 4.7's redesigned ablation, on the same RTX 4090 48 GiB card, logging every request's ratio, KV-cache occupancy, TTFT, and total latency. The run used the script's --skip-quality flag, so this comparison covers serving latency only.</w:t>
+        <w:t xml:space="preserve">Three limits on this result are disclosed rather than smoothed over. First, this benchmark's harness runs a single instance of the cross-encoder, shared unbatched across every concurrent worker thread, on the same GPU that serves generation; at concurrency 20 that means up to 20 threads issuing individual, non-batched scoring calls against one model instance while vLLM also generates on the same card. Some of the reported LSPM slowdown may therefore reflect this harness's resource contention and lack of batching rather than a property inherent to semantic pruning itself; a production deployment that batches concurrent scoring requests or isolates the cross-encoder on separate hardware could plausibly show a smaller penalty, and this benchmark does not measure that configuration. Second, each cell was run once, not repeated, so the table reports point estimates with no confidence interval and no test of whether a given gap is distinguishable from run-to-run variance; unlike the main GPU benchmark's three-repeat design (Section 4.6), a single run here could overstate or understate the true effect at any one cell. Third, this benchmark and the one in Section 4.6 use different load-generation tools (a small thread pool here versus Locust there) and, per the protocol above, deliberately different context-construction paths (live versus precomputed), so the two are not a controlled contrast against each other and should each be read on its own terms rather than as a clean before/after comparison.</w:t>
+      </w:r>
+    </w:p>
+    <w:p>
+      <w:pPr>
+        <w:pStyle w:val="MDPI22heading2"/>
+        <w:spacing w:before="240" w:after="60"/>
+        <w:rPr/>
+      </w:pPr>
+      <w:r>
+        <w:rPr/>
+        <w:t xml:space="preserve">4.12. Controller versus Matched-Fixed-Ratio Comparison Under Memory Pressure</w:t>
+      </w:r>
+    </w:p>
+    <w:p>
+      <w:pPr>
+        <w:pStyle w:val="MDPI31text"/>
+        <w:rPr/>
+      </w:pPr>
+      <w:r>
+        <w:rPr>
+          <w:highlight w:val="yellow"/>
+        </w:rPr>
+        <w:t xml:space="preserve">Under the protocol of Section 3.5.8, we reran the dynamic controller and a fixed-ratio condition matched to the controller's own realized mean ratio back to back under the same --gpu-memory-utilization 0.3 constrained cache pool as Section 4.7's redesigned ablation, on the same RTX 4090 48 GiB card used throughout this paper, logging every request's ratio, KV-cache occupancy, TTFT, and total latency. The two arms are matched on mean compression ratio, not on mean retained token count directly; because every request in this benchmark draws from the same six-document ARCD candidate pool (Section 3.4), a matched ratio is a reasonable proxy for a matched token budget here, but the two are not identical when per-question context length varies, and we report the match as ratio-based rather than describe it as token-matched. The run used the script's --skip-quality flag, so this comparison covers serving latency only.</w:t>
       </w:r>
     </w:p>
     <w:p>
@@ -11225,6 +11237,18 @@
           <w:highlight w:val="yellow"/>
         </w:rPr>
         <w:t xml:space="preserve">The result is a mixed one, not a clean win for either arm: the dynamic controller has a lower mean TTFT (1,507.6 ms versus 1,525.5 ms), lower mean total latency (2,654.0 ms versus 2,880.4 ms), and a lower p95 total latency (6,870.6 ms versus 7,302.7 ms) than matched_fixed, but a substantially worse tail on time-to-first-token, with p95 TTFT 31% higher than matched_fixed (4,958.2 ms versus 3,783.3 ms). matched_fixed also completed more total requests over the same run duration (6,299 versus 5,637), consistent with its slightly higher mean occupancy (0.516 versus 0.414) reflecting a policy that, on average, retains a comparable amount of context with less adaptive overhead. Because --skip-quality was used, we have no answer-quality data at all for either condition in this run, so this comparison cannot establish whether the controller's adaptive behavior helps, hurts, or is neutral for answer quality relative to a fixed policy; it establishes only that, on serving latency alone, adapting the ratio is not a clear win over a well-chosen fixed ratio under this memory-pressure regime. This closes the comparison Section 4.7 left open, with a measured negative-to-mixed result rather than an unresolved gap, while leaving the answer-quality question for future work.</w:t>
+      </w:r>
+    </w:p>
+    <w:p>
+      <w:pPr>
+        <w:pStyle w:val="MDPI31text"/>
+        <w:rPr/>
+      </w:pPr>
+      <w:r>
+        <w:rPr>
+          <w:highlight w:val="yellow"/>
+        </w:rPr>
+        <w:t xml:space="preserve">Three further limits are disclosed rather than smoothed over. First, as in Section 4.11, this harness runs a single cross-encoder instance shared unbatched across every concurrent worker thread within a condition, on the same GPU serving generation; the load ramp here reaches 80 concurrent workers, well above Section 4.11's maximum of 20, so contention on this shared, unbatched instance is if anything a larger factor here, and could inflate both conditions' latencies similarly rather than necessarily bias the comparison between them. Second, the two conditions were not run in a counterbalanced or randomized order: dynamic always ran first, matched_fixed always second, so any drift in server state, thermal conditions, or system load between the two passes is confounded with condition rather than averaged out; we did not repeat the pair in reverse order to check for this. Third, no significance test accompanies the serving-latency comparison in Table 10: the reported means and p95 values are point estimates from one run per condition, not paired statistics with a confidence interval or a p-value, so a gap such as the 1.2% difference in mean TTFT should be read as within the range plausibly attributable to run-to-run noise rather than as a demonstrated effect, while the 31% p95 TTFT gap is large enough to be a more credible signal even without a formal test.</w:t>
       </w:r>
     </w:p>
     <w:p>

</xml_diff>

<commit_message>
Qualify LLMLingua-2 'significantly ahead' claim to note r=0.7 as weakest of three ratios
Four summary/headline locations (Contributions item 8, Section 2 Positioning,
Discussion item 1, Conclusions) previously stated LSPM is 'significantly ahead
at all three ratios' without carrying forward the nuance already disclosed in
Section 4.8's detailed Results text: at r=0.7 the bootstrap CI on the mean
difference includes zero at its lower bound even though the Wilcoxon-based
adjusted p=0.037 clears significance. All four locations now state 'at every
ratio... with the r=0.7 gap the weakest of the three (its bootstrap interval
and rank-based test disagree at the margin)', consistent with Section 4.8.
</commit_message>
<xml_diff>
--- a/paper/Information_Tarish_Arabic_RAG.docx
+++ b/paper/Information_Tarish_Arabic_RAG.docx
@@ -387,7 +387,7 @@
       </w:r>
       <w:r>
         <w:rPr/>
-        <w:t xml:space="preserve">(6) A blind, two-rater human evaluation (90 answers, correctness and faithfulness, substantial-to-near-perfect inter-rater agreement) that directionally corroborates the automatic-metric result. (7) A token-budget-matched rerun that gives naive truncation the same per-question token budget LSPM actually spent, closing the token-budget confound left open by contribution (3) and reproducing LSPM's advantage at r = 0.3. (8) A head-to-head comparison against LLMLingua-2, a modern learned prompt compressor, on the identical 140-question evaluation, showing LSPM significantly ahead on token-F1 at all three ratios tested, most convincingly at r = 0.3 and 0.5. (9) A generalization check that reruns the full ARCD ground-truth protocol against a second generator, Qwen2.5-7B-Instruct, replicating the central r = 0.3 quality result with the same or greater statistical strength. (10) An independent, fresh-seed replication of the central r = 0.3 result on 140 newly sampled ARCD questions sharing no question identifiers with the original 140, confirming the finding on data that were not used to set the original sample size or produce the original result.</w:t>
+        <w:t xml:space="preserve">(6) A blind, two-rater human evaluation (90 answers, correctness and faithfulness, substantial-to-near-perfect inter-rater agreement) that directionally corroborates the automatic-metric result. (7) A token-budget-matched rerun that gives naive truncation the same per-question token budget LSPM actually spent, closing the token-budget confound left open by contribution (3) and reproducing LSPM's advantage at r = 0.3. (8) A head-to-head comparison against LLMLingua-2, a modern learned prompt compressor, on the identical 140-question evaluation, showing LSPM significantly ahead on token-F1 at every ratio after correction, most convincingly at r = 0.3 and 0.5, with the r = 0.7 gap the weakest of the three (its bootstrap interval and rank-based test disagree at the margin; Section 4.8). (9) A generalization check that reruns the full ARCD ground-truth protocol against a second generator, Qwen2.5-7B-Instruct, replicating the central r = 0.3 quality result with the same or greater statistical strength. (10) An independent, fresh-seed replication of the central r = 0.3 result on 140 newly sampled ARCD questions sharing no question identifiers with the original 140, confirming the finding on data that were not used to set the original sample size or produce the original result.</w:t>
       </w:r>
     </w:p>
     <w:p>
@@ -479,7 +479,7 @@
       </w:pPr>
       <w:r>
         <w:rPr/>
-        <w:t xml:space="preserve">Positioning statement. Relative to this prior work, LSPM's specific claim to novelty is narrow and stated precisely: it is the first system, to our knowledge, that (i) performs sentence-level, cross-encoder-driven context pruning specifically evaluated on Arabic RAG, where tokenization inflation makes the KV-cache cost of retrieved context measurably worse than for English, and (ii) couples pruning aggressiveness to a live serving-engine signal (vLLM's KV-cache occupancy) rather than a static, offline-computed budget. DSLR is the closest prior system on claim (i)'s mechanism specifically: both decompose retrieved text into sentences, score them against the query, and reassemble a pruned passage, but DSLR is evaluated only on English open-domain QA with an unsupervised ranker and considers neither a tokenization-disparity motivation, a serving engine's KV-cache cost, nor a live compression-ratio signal, which is exactly the (i)/(ii) gap this paper's novelty claim occupies. LSPM has now been compared directly against a genuine modern learned compressor, LLMLingua-2, and significantly outperforms it on token-F1 at all three ratios tested (Section 4.8); it has not been compared against LLMLingua's original iterative-removal variant, Selective Context, DAC, ACC-RAG, or RECOMP, and that broader comparison against the wider compression-baseline field remains the most important open validation step (Section 5, item 1). What this paper does establish is that, within its paired comparisons against both naive truncation and LLMLingua-2, sentence-level semantic selection is a better default for Arabic RAG at aggressive compression, and it reports that result, and only that result, without overstating it into a claim of superiority over every compression method in the literature.</w:t>
+        <w:t xml:space="preserve">Positioning statement. Relative to this prior work, LSPM's specific claim to novelty is narrow and stated precisely: it is the first system, to our knowledge, that (i) performs sentence-level, cross-encoder-driven context pruning specifically evaluated on Arabic RAG, where tokenization inflation makes the KV-cache cost of retrieved context measurably worse than for English, and (ii) couples pruning aggressiveness to a live serving-engine signal (vLLM's KV-cache occupancy) rather than a static, offline-computed budget. DSLR is the closest prior system on claim (i)'s mechanism specifically: both decompose retrieved text into sentences, score them against the query, and reassemble a pruned passage, but DSLR is evaluated only on English open-domain QA with an unsupervised ranker and considers neither a tokenization-disparity motivation, a serving engine's KV-cache cost, nor a live compression-ratio signal, which is exactly the (i)/(ii) gap this paper's novelty claim occupies. LSPM has now been compared directly against a genuine modern learned compressor, LLMLingua-2, and significantly outperforms it on token-F1 at every ratio tested, most convincingly at r = 0.3 and 0.5 (Section 4.8); it has not been compared against LLMLingua's original iterative-removal variant, Selective Context, DAC, ACC-RAG, or RECOMP, and that broader comparison against the wider compression-baseline field remains the most important open validation step (Section 5, item 1). What this paper does establish is that, within its paired comparisons against both naive truncation and LLMLingua-2, sentence-level semantic selection is a better default for Arabic RAG at aggressive compression, and it reports that result, and only that result, without overstating it into a claim of superiority over every compression method in the literature.</w:t>
       </w:r>
     </w:p>
     <w:p>
@@ -11294,7 +11294,7 @@
       </w:r>
       <w:r>
         <w:rPr/>
-        <w:t xml:space="preserve">The LLMLingua-2 comparison, the most important missing experiment this paper identifies, has now been run (Section 4.8): LSPM significantly outperforms LLMLingua-2 [71] on token-F1 at all three ratios tested, on the same Arabic RAG workload, generator, retrieval pool, and questions used throughout this paper. This establishes that LSPM is not merely better than naive positional truncation but also better, on answer quality, than a genuine contemporary learned compressor on this workload. Two qualifications remain. First, the comparison measures answer quality only; it does not measure LLMLingua-2's pruning latency, end-to-end latency, throughput, or KV-cache footprint relative to LSPM, so a serving-cost comparison between the two methods, of the kind Section 4.6 provides between LSPM and naive truncation, is still missing. Second, DAC [72], ACC-RAG [73], and RECOMP itself remain uncompared; by 2024-2025 these, together with LLMLingua-2, define the state of the art in relevance-aware and adaptive compression, and a single favorable comparison against one baseline does not establish general competitiveness against the field.</w:t>
+        <w:t xml:space="preserve">The LLMLingua-2 comparison, the most important missing experiment this paper identifies, has now been run (Section 4.8): LSPM significantly outperforms LLMLingua-2 [71] on token-F1 at every ratio tested, on the same Arabic RAG workload, generator, retrieval pool, and questions used throughout this paper, most convincingly at r = 0.3 and 0.5, with the r = 0.7 gap the weakest of the three (its bootstrap interval and rank-based test disagree at the margin; Section 4.8). This establishes that LSPM is not merely better than naive positional truncation but also better, on answer quality, than a genuine contemporary learned compressor on this workload. Two qualifications remain. First, the comparison measures answer quality only; it does not measure LLMLingua-2's pruning latency, end-to-end latency, throughput, or KV-cache footprint relative to LSPM, so a serving-cost comparison between the two methods, of the kind Section 4.6 provides between LSPM and naive truncation, is still missing. Second, DAC [72], ACC-RAG [73], and RECOMP itself remain uncompared; by 2024-2025 these, together with LLMLingua-2, define the state of the art in relevance-aware and adaptive compression, and a single favorable comparison against one baseline does not establish general competitiveness against the field.</w:t>
       </w:r>
     </w:p>
     <w:p>
@@ -11541,7 +11541,7 @@
       </w:r>
       <w:r>
         <w:rPr/>
-        <w:t xml:space="preserve">We also closed the two most important remaining gaps: a token-budget-matched rerun, in which naive truncation receives the same per-question token budget LSPM actually spent, reproduces the r = 0.3 advantage (+0.140 F1, Holm-adjusted p = 0.0003), and a head-to-head comparison against LLMLingua-2, a modern learned compressor, finds LSPM significantly ahead on token-F1 at all three ratios tested, most convincingly at r = 0.3 and 0.5 (largest gap +0.211 at r = 0.3). The central r = 0.3 result also generalizes to a second generator, Qwen2.5-7B-Instruct, with the same or greater statistical strength than on the original generator. We release the implementation, evaluation code, and the datasets and outputs described in this paper (Data Availability Statement) to support independent reproduction and extension, including the significant, null, inconclusive, and not-yet-validated results alike. Finally, because the original n = 140 sample size was derived from an internal pilot that is a subset of the same 140 questions, we additionally ran an independent replication on 140 freshly sampled ARCD questions sharing no question identifiers with the original set (Section 4.10): the r = 0.3 advantage over naive truncation and the equivalence of LSPM to the unpruned answer both reproduce there with equal or greater statistical strength, so the central finding is now independently confirmed rather than resting on the original sample alone.</w:t>
+        <w:t xml:space="preserve">We also closed the two most important remaining gaps: a token-budget-matched rerun, in which naive truncation receives the same per-question token budget LSPM actually spent, reproduces the r = 0.3 advantage (+0.140 F1, Holm-adjusted p = 0.0003), and a head-to-head comparison against LLMLingua-2, a modern learned compressor, finds LSPM significantly ahead on token-F1 at every ratio tested, most convincingly at r = 0.3 and 0.5 (largest gap +0.211 at r = 0.3), with the r = 0.7 gap the weakest of the three and its bootstrap interval and rank-based test disagreeing at the margin (Section 4.8). The central r = 0.3 result also generalizes to a second generator, Qwen2.5-7B-Instruct, with the same or greater statistical strength than on the original generator. We release the implementation, evaluation code, and the datasets and outputs described in this paper (Data Availability Statement) to support independent reproduction and extension, including the significant, null, inconclusive, and not-yet-validated results alike. Finally, because the original n = 140 sample size was derived from an internal pilot that is a subset of the same 140 questions, we additionally ran an independent replication on 140 freshly sampled ARCD questions sharing no question identifiers with the original set (Section 4.10): the r = 0.3 advantage over naive truncation and the equivalence of LSPM to the unpruned answer both reproduce there with equal or greater statistical strength, so the central finding is now independently confirmed rather than resting on the original sample alone.</w:t>
       </w:r>
     </w:p>
     <w:p>

</xml_diff>